<commit_message>
docs: conventions + lint so the placeholder bug cannot recur
docs/DOC-CONVENTIONS.md — the rules for writing docs in this repo, each
one traced to something that actually broke. Rule 1 is the bare
<placeholder> trap: converters read it as an HTML tag and silently delete
it, which cost GUIDEBOOK 7.9 a sentence in the first Word build.

tools/check-docs.sh — enforces the rules mechanically: bare placeholders
outside backticks, unbalanced fences, inline triple backticks, unescaped
pipes in table cells. Code spans that wrap across lines are handled
correctly (verified against pandoc, which keeps them). Exits nonzero so
it can gate a commit.

Ran it across all ten docs and fixed the four genuine hits it found:
HANDBOOK (wt/<w> in a table cell) and both playbooks (<thing>,
<project> twice). GUIDEBOOK Appendix A and the README now point at the
conventions and the two tools; GUIDEBOOK.docx regenerated.

Co-Authored-By: Claude Fable 5 <noreply@anthropic.com>
</commit_message>
<xml_diff>
--- a/docs/GUIDEBOOK.docx
+++ b/docs/GUIDEBOOK.docx
@@ -13487,6 +13487,84 @@
       </w:r>
       <w:r>
         <w:t xml:space="preserve">render that block as a plain indented list instead.</w:t>
+      </w:r>
+    </w:p>
+    <w:p>
+      <w:pPr>
+        <w:pStyle w:val="BodyText"/>
+      </w:pPr>
+      <w:r>
+        <w:rPr>
+          <w:b/>
+          <w:bCs/>
+        </w:rPr>
+        <w:t xml:space="preserve">If you edit this book or write another one</w:t>
+      </w:r>
+      <w:r>
+        <w:t xml:space="preserve">, read</w:t>
+      </w:r>
+      <w:r>
+        <w:t xml:space="preserve"> </w:t>
+      </w:r>
+      <w:r>
+        <w:rPr>
+          <w:rStyle w:val="VerbatimChar"/>
+        </w:rPr>
+        <w:t xml:space="preserve">docs/DOC-CONVENTIONS.md</w:t>
+      </w:r>
+      <w:r>
+        <w:t xml:space="preserve"> </w:t>
+      </w:r>
+      <w:r>
+        <w:t xml:space="preserve">first and run</w:t>
+      </w:r>
+      <w:r>
+        <w:t xml:space="preserve"> </w:t>
+      </w:r>
+      <w:r>
+        <w:rPr>
+          <w:rStyle w:val="VerbatimChar"/>
+        </w:rPr>
+        <w:t xml:space="preserve">./tools/check-docs.sh</w:t>
+      </w:r>
+      <w:r>
+        <w:t xml:space="preserve"> </w:t>
+      </w:r>
+      <w:r>
+        <w:t xml:space="preserve">before</w:t>
+      </w:r>
+      <w:r>
+        <w:t xml:space="preserve"> </w:t>
+      </w:r>
+      <w:r>
+        <w:t xml:space="preserve">converting. The rule that matters most: never leave a bare</w:t>
+      </w:r>
+      <w:r>
+        <w:t xml:space="preserve"> </w:t>
+      </w:r>
+      <w:r>
+        <w:rPr>
+          <w:rStyle w:val="VerbatimChar"/>
+        </w:rPr>
+        <w:t xml:space="preserve">&lt;placeholder&gt;</w:t>
+      </w:r>
+      <w:r>
+        <w:t xml:space="preserve"> </w:t>
+      </w:r>
+      <w:r>
+        <w:t xml:space="preserve">outside backticks — every converter reads it as an HTML</w:t>
+      </w:r>
+      <w:r>
+        <w:t xml:space="preserve"> </w:t>
+      </w:r>
+      <w:r>
+        <w:t xml:space="preserve">tag and silently deletes it, which already cost this book a sentence</w:t>
+      </w:r>
+      <w:r>
+        <w:t xml:space="preserve"> </w:t>
+      </w:r>
+      <w:r>
+        <w:t xml:space="preserve">once.</w:t>
       </w:r>
     </w:p>
     <w:p>

</xml_diff>

<commit_message>
polish: document the id-validation guards, clean shellcheck
Consistency sweep across every command surface (dispatcher, help, guide,
protocol, completion) came back aligned — every command is documented
everywhere. Two gaps closed and a static-analysis pass added:

- GUIDEBOOK + HANDBOOK troubleshooting now cover the two guards added in
  the hardening pass (path-separator/.. in a worker or task id; init on a
  repo with no commits) — a beginner who hits either now finds it
  explained. docx regenerated.
- shellcheck (installed to ~/.local/bin) run over the embedded agentteam
  binary and tools/: fixed one real dead variable ('stale' in doctor),
  annotated three intentional patterns (glob scope matching, time-sorted
  ls -lt for reports), rewrote check-docs file discovery to drop an
  ls|grep. shellcheck -S warning is now clean (0) across all scripts.

selftest 33, both audits clean, doc lint + its selftest clean.

Co-Authored-By: Claude Fable 5 <noreply@anthropic.com>
</commit_message>
<xml_diff>
--- a/docs/GUIDEBOOK.docx
+++ b/docs/GUIDEBOOK.docx
@@ -9237,6 +9237,144 @@
             </w:r>
             <w:r>
               <w:t xml:space="preserve">. Add the line or ignore the seat.</w:t>
+            </w:r>
+          </w:p>
+        </w:tc>
+      </w:tr>
+      <w:tr>
+        <w:tc>
+          <w:tcPr/>
+          <w:p>
+            <w:pPr>
+              <w:pStyle w:val="Compact"/>
+            </w:pPr>
+            <w:r>
+              <w:t xml:space="preserve">init:</w:t>
+            </w:r>
+            <w:r>
+              <w:t xml:space="preserve"> </w:t>
+            </w:r>
+            <w:r>
+              <w:t xml:space="preserve">“this repo has no commits yet”</w:t>
+            </w:r>
+          </w:p>
+        </w:tc>
+        <w:tc>
+          <w:tcPr/>
+          <w:p>
+            <w:pPr>
+              <w:pStyle w:val="Compact"/>
+            </w:pPr>
+            <w:r>
+              <w:t xml:space="preserve">A worktree branches from a commit, so an empty repo cannot be scaffolded. Make one commit first (</w:t>
+            </w:r>
+            <w:r>
+              <w:rPr>
+                <w:rStyle w:val="VerbatimChar"/>
+              </w:rPr>
+              <w:t xml:space="preserve">git commit --allow-empty -m "initial commit"</w:t>
+            </w:r>
+            <w:r>
+              <w:t xml:space="preserve">), then init.</w:t>
+            </w:r>
+          </w:p>
+        </w:tc>
+      </w:tr>
+      <w:tr>
+        <w:tc>
+          <w:tcPr/>
+          <w:p>
+            <w:pPr>
+              <w:pStyle w:val="Compact"/>
+            </w:pPr>
+            <w:r>
+              <w:t xml:space="preserve">“worker/task name must not contain a path separator /</w:t>
+            </w:r>
+            <w:r>
+              <w:t xml:space="preserve"> </w:t>
+            </w:r>
+            <w:r>
+              <w:rPr>
+                <w:rStyle w:val="VerbatimChar"/>
+              </w:rPr>
+              <w:t xml:space="preserve">..</w:t>
+            </w:r>
+            <w:r>
+              <w:t xml:space="preserve"> </w:t>
+            </w:r>
+            <w:r>
+              <w:t xml:space="preserve">/ start with</w:t>
+            </w:r>
+            <w:r>
+              <w:t xml:space="preserve"> </w:t>
+            </w:r>
+            <w:r>
+              <w:rPr>
+                <w:rStyle w:val="VerbatimChar"/>
+              </w:rPr>
+              <w:t xml:space="preserve">-</w:t>
+            </w:r>
+            <w:r>
+              <w:t xml:space="preserve">”</w:t>
+            </w:r>
+          </w:p>
+        </w:tc>
+        <w:tc>
+          <w:tcPr/>
+          <w:p>
+            <w:pPr>
+              <w:pStyle w:val="Compact"/>
+            </w:pPr>
+            <w:r>
+              <w:t xml:space="preserve">A safety guard: these names build paths under</w:t>
+            </w:r>
+            <w:r>
+              <w:t xml:space="preserve"> </w:t>
+            </w:r>
+            <w:r>
+              <w:rPr>
+                <w:rStyle w:val="VerbatimChar"/>
+              </w:rPr>
+              <w:t xml:space="preserve">wt/</w:t>
+            </w:r>
+            <w:r>
+              <w:t xml:space="preserve"> </w:t>
+            </w:r>
+            <w:r>
+              <w:t xml:space="preserve">and</w:t>
+            </w:r>
+            <w:r>
+              <w:t xml:space="preserve"> </w:t>
+            </w:r>
+            <w:r>
+              <w:rPr>
+                <w:rStyle w:val="VerbatimChar"/>
+              </w:rPr>
+              <w:t xml:space="preserve">coord/tasks/</w:t>
+            </w:r>
+            <w:r>
+              <w:t xml:space="preserve">, so they must be plain names. You typed a slash, a</w:t>
+            </w:r>
+            <w:r>
+              <w:t xml:space="preserve"> </w:t>
+            </w:r>
+            <w:r>
+              <w:rPr>
+                <w:rStyle w:val="VerbatimChar"/>
+              </w:rPr>
+              <w:t xml:space="preserve">..</w:t>
+            </w:r>
+            <w:r>
+              <w:t xml:space="preserve">, or a leading dash — use the bare id (</w:t>
+            </w:r>
+            <w:r>
+              <w:rPr>
+                <w:rStyle w:val="VerbatimChar"/>
+              </w:rPr>
+              <w:t xml:space="preserve">T7-codex</w:t>
+            </w:r>
+            <w:r>
+              <w:t xml:space="preserve">, not a path).</w:t>
             </w:r>
           </w:p>
         </w:tc>

</xml_diff>

<commit_message>
docs: handoff guide for agentteam itself
Written in the house style of _refs/ai-*.md: what the product actually is
(the installer, not the installed copy), the six-gate change loop, the
mock-agent and adversarial testing model, the classes of defect the
saboteur rounds found, the fleet/quota rules, and a fill-in handoff prompt.

Co-Authored-By: Claude Opus 5 <noreply@anthropic.com>
</commit_message>
<xml_diff>
--- a/docs/GUIDEBOOK.docx
+++ b/docs/GUIDEBOOK.docx
@@ -14339,6 +14339,33 @@
             </w:pPr>
             <w:r>
               <w:t xml:space="preserve">This book — the complete beginner-to-daily-use manual.</w:t>
+            </w:r>
+          </w:p>
+        </w:tc>
+      </w:tr>
+      <w:tr>
+        <w:tc>
+          <w:tcPr/>
+          <w:p>
+            <w:pPr>
+              <w:pStyle w:val="Compact"/>
+            </w:pPr>
+            <w:r>
+              <w:rPr>
+                <w:rStyle w:val="VerbatimChar"/>
+              </w:rPr>
+              <w:t xml:space="preserve">docs/HANDOFF.md</w:t>
+            </w:r>
+          </w:p>
+        </w:tc>
+        <w:tc>
+          <w:tcPr/>
+          <w:p>
+            <w:pPr>
+              <w:pStyle w:val="Compact"/>
+            </w:pPr>
+            <w:r>
+              <w:t xml:space="preserve">For whoever takes the project over: what to edit, the change loop, the classes of bug found so far, accounts and quota.</w:t>
             </w:r>
           </w:p>
         </w:tc>

</xml_diff>

<commit_message>
FF-BRAND: rename product to Frugal Flock with compatible CLI aliases
</commit_message>
<xml_diff>
--- a/docs/GUIDEBOOK.docx
+++ b/docs/GUIDEBOOK.docx
@@ -28,13 +28,13 @@
         </w:p>
       </w:sdtContent>
     </w:sdt>
-    <w:bookmarkStart w:id="79" w:name="agentteam-the-complete-guidebook"/>
+    <w:bookmarkStart w:id="79" w:name="frugal-flock-the-complete-guidebook"/>
     <w:p>
       <w:pPr>
         <w:pStyle w:val="Heading1"/>
       </w:pPr>
       <w:r>
-        <w:t xml:space="preserve">agentteam — The Complete Guidebook</w:t>
+        <w:t xml:space="preserve">Frugal Flock — The Complete Guidebook</w:t>
       </w:r>
     </w:p>
     <w:p>
@@ -127,7 +127,7 @@
           <w:b/>
           <w:bCs/>
         </w:rPr>
-        <w:t xml:space="preserve">Covers agentteam v0.3.1 · written 2026-07-19 · for the complete beginner</w:t>
+        <w:t xml:space="preserve">Covers Frugal Flock v0.3.1 · written 2026-07-19 · for the complete beginner</w:t>
       </w:r>
     </w:p>
     <w:p>
@@ -135,7 +135,7 @@
         <w:pStyle w:val="BodyText"/>
       </w:pPr>
       <w:r>
-        <w:t xml:space="preserve">This is the one book that explains everything: what agentteam is, how to</w:t>
+        <w:t xml:space="preserve">This is the one book that explains everything: what Frugal Flock is, how to</w:t>
       </w:r>
       <w:r>
         <w:t xml:space="preserve"> </w:t>
@@ -197,7 +197,7 @@
           <w:b/>
           <w:bCs/>
         </w:rPr>
-        <w:t xml:space="preserve">Never used agentteam before?</w:t>
+        <w:t xml:space="preserve">Never used Frugal Flock before?</w:t>
       </w:r>
       <w:r>
         <w:t xml:space="preserve"> </w:t>
@@ -321,7 +321,7 @@
         <w:rPr>
           <w:rStyle w:val="VerbatimChar"/>
         </w:rPr>
-        <w:t xml:space="preserve">$ agentteam status</w:t>
+        <w:t xml:space="preserve">$ frugal-flock status</w:t>
       </w:r>
     </w:p>
     <w:p>
@@ -364,13 +364,13 @@
       </w:r>
     </w:p>
     <w:bookmarkEnd w:id="9"/>
-    <w:bookmarkStart w:id="15" w:name="what-agentteam-is-and-what-it-is-not"/>
+    <w:bookmarkStart w:id="15" w:name="what-frugal-flock-is-and-what-it-is-not"/>
     <w:p>
       <w:pPr>
         <w:pStyle w:val="Heading2"/>
       </w:pPr>
       <w:r>
-        <w:t xml:space="preserve">2. What agentteam is — and what it is not</w:t>
+        <w:t xml:space="preserve">2. What Frugal Flock is — and what it is not</w:t>
       </w:r>
     </w:p>
     <w:bookmarkStart w:id="10" w:name="the-idea-in-one-paragraph"/>
@@ -387,7 +387,7 @@
         <w:pStyle w:val="FirstParagraph"/>
       </w:pPr>
       <w:r>
-        <w:t xml:space="preserve">agentteam turns five separate AI coding subscriptions — Claude, Codex</w:t>
+        <w:t xml:space="preserve">Frugal Flock turns five separate AI coding subscriptions — Claude, Codex</w:t>
       </w:r>
       <w:r>
         <w:t xml:space="preserve"> </w:t>
@@ -465,7 +465,7 @@
         <w:t xml:space="preserve"> </w:t>
       </w:r>
       <w:r>
-        <w:t xml:space="preserve">who can accept work into the real codebase. agentteam itself is the</w:t>
+        <w:t xml:space="preserve">who can accept work into the real codebase. Frugal Flock itself is the</w:t>
       </w:r>
       <w:r>
         <w:t xml:space="preserve"> </w:t>
@@ -483,7 +483,7 @@
         <w:t xml:space="preserve"> </w:t>
       </w:r>
       <w:r>
-        <w:t xml:space="preserve">The intelligence is rented from your subscriptions; agentteam only</w:t>
+        <w:t xml:space="preserve">The intelligence is rented from your subscriptions; Frugal Flock only</w:t>
       </w:r>
       <w:r>
         <w:t xml:space="preserve"> </w:t>
@@ -649,7 +649,7 @@
         <w:t xml:space="preserve"> </w:t>
       </w:r>
       <w:r>
-        <w:t xml:space="preserve">flat monthly subscription. agentteam is built entirely on logins.</w:t>
+        <w:t xml:space="preserve">flat monthly subscription. Frugal Flock is built entirely on logins.</w:t>
       </w:r>
     </w:p>
     <w:p>
@@ -801,7 +801,7 @@
         <w:rPr>
           <w:rStyle w:val="VerbatimChar"/>
         </w:rPr>
-        <w:t xml:space="preserve">agentteam verify</w:t>
+        <w:t xml:space="preserve">frugal-flock verify</w:t>
       </w:r>
       <w:r>
         <w:t xml:space="preserve">) reads the receipts for you first.</w:t>
@@ -1243,7 +1243,7 @@
         <w:rPr>
           <w:rStyle w:val="VerbatimChar"/>
         </w:rPr>
-        <w:t xml:space="preserve"> FOREMAN: machine-checks first (agentteam verify), reads the diffs, recommends</w:t>
+        <w:t xml:space="preserve"> FOREMAN: machine-checks first (frugal-flock verify), reads the diffs, recommends</w:t>
       </w:r>
       <w:r>
         <w:br/>
@@ -1313,7 +1313,7 @@
         <w:rPr>
           <w:rStyle w:val="VerbatimChar"/>
         </w:rPr>
-        <w:t xml:space="preserve">agentteam init</w:t>
+        <w:t xml:space="preserve">frugal-flock init</w:t>
       </w:r>
       <w:r>
         <w:t xml:space="preserve"> </w:t>
@@ -1328,7 +1328,7 @@
         <w:rPr>
           <w:rStyle w:val="VerbatimChar"/>
         </w:rPr>
-        <w:t xml:space="preserve">agentteam new</w:t>
+        <w:t xml:space="preserve">frugal-flock new</w:t>
       </w:r>
       <w:r>
         <w:t xml:space="preserve">) builds this next to any repository</w:t>
@@ -1828,7 +1828,7 @@
               <w:rPr>
                 <w:rStyle w:val="VerbatimChar"/>
               </w:rPr>
-              <w:t xml:space="preserve">agentteam score</w:t>
+              <w:t xml:space="preserve">frugal-flock score</w:t>
             </w:r>
             <w:r>
               <w:t xml:space="preserve"> </w:t>
@@ -1904,7 +1904,7 @@
         <w:rPr>
           <w:rStyle w:val="VerbatimChar"/>
         </w:rPr>
-        <w:t xml:space="preserve">agentteam init</w:t>
+        <w:t xml:space="preserve">frugal-flock init</w:t>
       </w:r>
       <w:r>
         <w:t xml:space="preserve"> </w:t>
@@ -2056,7 +2056,7 @@
         <w:pStyle w:val="FirstParagraph"/>
       </w:pPr>
       <w:r>
-        <w:t xml:space="preserve">If your repository already has its own hooks, agentteam leaves them</w:t>
+        <w:t xml:space="preserve">If your repository already has its own hooks, Frugal Flock leaves them</w:t>
       </w:r>
       <w:r>
         <w:t xml:space="preserve"> </w:t>
@@ -2150,13 +2150,13 @@
       </w:r>
     </w:p>
     <w:bookmarkEnd w:id="20"/>
-    <w:bookmarkStart w:id="21" w:name="install-agentteam-itself"/>
+    <w:bookmarkStart w:id="21" w:name="install-frugal-flock-itself"/>
     <w:p>
       <w:pPr>
         <w:pStyle w:val="Heading3"/>
       </w:pPr>
       <w:r>
-        <w:t xml:space="preserve">4.2 Install agentteam itself</w:t>
+        <w:t xml:space="preserve">4.2 Install Frugal Flock itself</w:t>
       </w:r>
     </w:p>
     <w:p>
@@ -2190,25 +2190,43 @@
         <w:rPr>
           <w:rStyle w:val="VerbatimChar"/>
         </w:rPr>
-        <w:t xml:space="preserve">$ bash agentteam-install.sh</w:t>
-      </w:r>
-      <w:r>
-        <w:br/>
-      </w:r>
-      <w:r>
-        <w:rPr>
-          <w:rStyle w:val="VerbatimChar"/>
-        </w:rPr>
-        <w:t xml:space="preserve">$ agentteam version</w:t>
-      </w:r>
-      <w:r>
-        <w:br/>
-      </w:r>
-      <w:r>
-        <w:rPr>
-          <w:rStyle w:val="VerbatimChar"/>
-        </w:rPr>
-        <w:t xml:space="preserve">agentteam 0.3.1 (/home/you/.local/bin/agentteam)</w:t>
+        <w:t xml:space="preserve">$ bash frugal-flock-install.sh</w:t>
+      </w:r>
+      <w:r>
+        <w:br/>
+      </w:r>
+      <w:r>
+        <w:rPr>
+          <w:rStyle w:val="VerbatimChar"/>
+        </w:rPr>
+        <w:t xml:space="preserve">$ frugal-flock version</w:t>
+      </w:r>
+      <w:r>
+        <w:br/>
+      </w:r>
+      <w:r>
+        <w:rPr>
+          <w:rStyle w:val="VerbatimChar"/>
+        </w:rPr>
+        <w:t xml:space="preserve">Frugal Flock 0.3.1 (/home/you/.local/bin/frugal-flock)</w:t>
+      </w:r>
+      <w:r>
+        <w:br/>
+      </w:r>
+      <w:r>
+        <w:rPr>
+          <w:rStyle w:val="VerbatimChar"/>
+        </w:rPr>
+        <w:t xml:space="preserve">Small plans. Big ideas.</w:t>
+      </w:r>
+      <w:r>
+        <w:br/>
+      </w:r>
+      <w:r>
+        <w:rPr>
+          <w:rStyle w:val="VerbatimChar"/>
+        </w:rPr>
+        <w:t xml:space="preserve">config: /home/you/.config/agentteam/agents.conf</w:t>
       </w:r>
     </w:p>
     <w:p>
@@ -2328,7 +2346,7 @@
               <w:pStyle w:val="Compact"/>
             </w:pPr>
             <w:r>
-              <w:t xml:space="preserve">The command itself</w:t>
+              <w:t xml:space="preserve">Shared implementation and legacy command</w:t>
             </w:r>
           </w:p>
         </w:tc>
@@ -2344,6 +2362,45 @@
               <w:rPr>
                 <w:rStyle w:val="VerbatimChar"/>
               </w:rPr>
+              <w:t xml:space="preserve">~/.local/bin/frugal-flock</w:t>
+            </w:r>
+            <w:r>
+              <w:t xml:space="preserve">,</w:t>
+            </w:r>
+            <w:r>
+              <w:t xml:space="preserve"> </w:t>
+            </w:r>
+            <w:r>
+              <w:rPr>
+                <w:rStyle w:val="VerbatimChar"/>
+              </w:rPr>
+              <w:t xml:space="preserve">~/.local/bin/frgl-flc</w:t>
+            </w:r>
+          </w:p>
+        </w:tc>
+        <w:tc>
+          <w:tcPr/>
+          <w:p>
+            <w:pPr>
+              <w:pStyle w:val="Compact"/>
+            </w:pPr>
+            <w:r>
+              <w:t xml:space="preserve">Canonical and short commands; links to the shared implementation</w:t>
+            </w:r>
+          </w:p>
+        </w:tc>
+      </w:tr>
+      <w:tr>
+        <w:tc>
+          <w:tcPr/>
+          <w:p>
+            <w:pPr>
+              <w:pStyle w:val="Compact"/>
+            </w:pPr>
+            <w:r>
+              <w:rPr>
+                <w:rStyle w:val="VerbatimChar"/>
+              </w:rPr>
               <w:t xml:space="preserve">~/.config/agentteam/agents.conf</w:t>
             </w:r>
           </w:p>
@@ -2449,7 +2506,7 @@
               <w:rPr>
                 <w:rStyle w:val="VerbatimChar"/>
               </w:rPr>
-              <w:t xml:space="preserve">agentteam new</w:t>
+              <w:t xml:space="preserve">frugal-flock new</w:t>
             </w:r>
             <w:r>
               <w:t xml:space="preserve"> </w:t>
@@ -2482,7 +2539,37 @@
               <w:pStyle w:val="Compact"/>
             </w:pPr>
             <w:r>
-              <w:t xml:space="preserve">Tab-completion (open a new terminal to activate)</w:t>
+              <w:t xml:space="preserve">Shared tab-completion, with links for</w:t>
+            </w:r>
+            <w:r>
+              <w:t xml:space="preserve"> </w:t>
+            </w:r>
+            <w:r>
+              <w:rPr>
+                <w:rStyle w:val="VerbatimChar"/>
+              </w:rPr>
+              <w:t xml:space="preserve">frugal-flock</w:t>
+            </w:r>
+            <w:r>
+              <w:t xml:space="preserve"> </w:t>
+            </w:r>
+            <w:r>
+              <w:t xml:space="preserve">and</w:t>
+            </w:r>
+            <w:r>
+              <w:t xml:space="preserve"> </w:t>
+            </w:r>
+            <w:r>
+              <w:rPr>
+                <w:rStyle w:val="VerbatimChar"/>
+              </w:rPr>
+              <w:t xml:space="preserve">frgl-flc</w:t>
+            </w:r>
+            <w:r>
+              <w:t xml:space="preserve"> </w:t>
+            </w:r>
+            <w:r>
+              <w:t xml:space="preserve">(open a new terminal to activate)</w:t>
             </w:r>
           </w:p>
         </w:tc>
@@ -2502,7 +2589,7 @@
         <w:rPr>
           <w:rStyle w:val="VerbatimChar"/>
         </w:rPr>
-        <w:t xml:space="preserve">agentteam ru&lt;TAB&gt;</w:t>
+        <w:t xml:space="preserve">frugal-flock ru&lt;TAB&gt;</w:t>
       </w:r>
       <w:r>
         <w:t xml:space="preserve"> </w:t>
@@ -2523,7 +2610,7 @@
         <w:rPr>
           <w:rStyle w:val="VerbatimChar"/>
         </w:rPr>
-        <w:t xml:space="preserve">agentteam run &lt;TAB&gt;</w:t>
+        <w:t xml:space="preserve">frugal-flock run &lt;TAB&gt;</w:t>
       </w:r>
       <w:r>
         <w:t xml:space="preserve"> </w:t>
@@ -3127,7 +3214,7 @@
         <w:t xml:space="preserve"> </w:t>
       </w:r>
       <w:r>
-        <w:t xml:space="preserve">is filled in by agentteam at run time.</w:t>
+        <w:t xml:space="preserve">is filled in by Frugal Flock at run time.</w:t>
       </w:r>
       <w:r>
         <w:t xml:space="preserve"> </w:t>
@@ -3229,7 +3316,7 @@
         <w:rPr>
           <w:rStyle w:val="VerbatimChar"/>
         </w:rPr>
-        <w:t xml:space="preserve">agentteam off</w:t>
+        <w:t xml:space="preserve">frugal-flock off</w:t>
       </w:r>
       <w:r>
         <w:t xml:space="preserve"> </w:t>
@@ -3256,16 +3343,16 @@
         <w:rPr>
           <w:rStyle w:val="VerbatimChar"/>
         </w:rPr>
-        <w:t xml:space="preserve">$ agentteam selftest</w:t>
-      </w:r>
-      <w:r>
-        <w:br/>
-      </w:r>
-      <w:r>
-        <w:rPr>
-          <w:rStyle w:val="VerbatimChar"/>
-        </w:rPr>
-        <w:t xml:space="preserve">== agentteam selftest — sandbox: /tmp/tmp.XXXX ==</w:t>
+        <w:t xml:space="preserve">$ frugal-flock selftest</w:t>
+      </w:r>
+      <w:r>
+        <w:br/>
+      </w:r>
+      <w:r>
+        <w:rPr>
+          <w:rStyle w:val="VerbatimChar"/>
+        </w:rPr>
+        <w:t xml:space="preserve">== frugal-flock selftest — sandbox: /tmp/tmp.XXXX ==</w:t>
       </w:r>
       <w:r>
         <w:br/>
@@ -3358,13 +3445,13 @@
         <w:t xml:space="preserve"> </w:t>
       </w:r>
       <w:r>
-        <w:t xml:space="preserve">it after every agentteam update. If it is green, the machinery works and</w:t>
-      </w:r>
-      <w:r>
-        <w:t xml:space="preserve"> </w:t>
-      </w:r>
-      <w:r>
-        <w:t xml:space="preserve">any problem you hit later is an agent problem, not an agentteam problem —</w:t>
+        <w:t xml:space="preserve">it after every Frugal Flock update. If it is green, the machinery works and</w:t>
+      </w:r>
+      <w:r>
+        <w:t xml:space="preserve"> </w:t>
+      </w:r>
+      <w:r>
+        <w:t xml:space="preserve">any problem you hit later is an agent problem, not a Frugal Flock problem —</w:t>
       </w:r>
       <w:r>
         <w:t xml:space="preserve"> </w:t>
@@ -3389,16 +3476,16 @@
         <w:rPr>
           <w:rStyle w:val="VerbatimChar"/>
         </w:rPr>
-        <w:t xml:space="preserve">$ agentteam agents      # is each binary installed? benched or on?</w:t>
-      </w:r>
-      <w:r>
-        <w:br/>
-      </w:r>
-      <w:r>
-        <w:rPr>
-          <w:rStyle w:val="VerbatimChar"/>
-        </w:rPr>
-        <w:t xml:space="preserve">$ agentteam smoke       # one tiny LIVE call per agent: OK / WARN / FAIL</w:t>
+        <w:t xml:space="preserve">$ frugal-flock agents      # is each binary installed? benched or on?</w:t>
+      </w:r>
+      <w:r>
+        <w:br/>
+      </w:r>
+      <w:r>
+        <w:rPr>
+          <w:rStyle w:val="VerbatimChar"/>
+        </w:rPr>
+        <w:t xml:space="preserve">$ frugal-flock smoke       # one tiny LIVE call per agent: OK / WARN / FAIL</w:t>
       </w:r>
     </w:p>
     <w:p>
@@ -3415,7 +3502,7 @@
         <w:rPr>
           <w:rStyle w:val="VerbatimChar"/>
         </w:rPr>
-        <w:t xml:space="preserve">agentteam doctor</w:t>
+        <w:t xml:space="preserve">frugal-flock doctor</w:t>
       </w:r>
       <w:r>
         <w:t xml:space="preserve"> </w:t>
@@ -3631,7 +3718,7 @@
         <w:rPr>
           <w:rStyle w:val="VerbatimChar"/>
         </w:rPr>
-        <w:t xml:space="preserve">$ agentteam new https://github.com/you/yourproject.git myproj</w:t>
+        <w:t xml:space="preserve">$ frugal-flock new https://github.com/you/yourproject.git myproj</w:t>
       </w:r>
     </w:p>
     <w:p>
@@ -3690,7 +3777,7 @@
         <w:rPr>
           <w:rStyle w:val="VerbatimChar"/>
         </w:rPr>
-        <w:t xml:space="preserve">agentteam init</w:t>
+        <w:t xml:space="preserve">frugal-flock init</w:t>
       </w:r>
       <w:r>
         <w:t xml:space="preserve"> </w:t>
@@ -3755,7 +3842,7 @@
         <w:rPr>
           <w:rStyle w:val="VerbatimChar"/>
         </w:rPr>
-        <w:t xml:space="preserve">start       : cd myproj/repo &amp;&amp; agentteam agents</w:t>
+        <w:t xml:space="preserve">start       : cd myproj/repo &amp;&amp; frugal-flock agents</w:t>
       </w:r>
     </w:p>
     <w:p>
@@ -3772,7 +3859,7 @@
         <w:rPr>
           <w:rStyle w:val="VerbatimChar"/>
         </w:rPr>
-        <w:t xml:space="preserve">agentteam new &lt;url&gt; myproj codex grok</w:t>
+        <w:t xml:space="preserve">frugal-flock new &lt;url&gt; myproj codex grok</w:t>
       </w:r>
       <w:r>
         <w:t xml:space="preserve">.</w:t>
@@ -3823,7 +3910,7 @@
         <w:rPr>
           <w:rStyle w:val="VerbatimChar"/>
         </w:rPr>
-        <w:t xml:space="preserve">$ agentteam init codex antigravity opencode grok</w:t>
+        <w:t xml:space="preserve">$ frugal-flock init codex antigravity opencode grok</w:t>
       </w:r>
     </w:p>
     <w:p>
@@ -3849,7 +3936,7 @@
         <w:rPr>
           <w:rStyle w:val="VerbatimChar"/>
         </w:rPr>
-        <w:t xml:space="preserve">agentteam init claude</w:t>
+        <w:t xml:space="preserve">frugal-flock init claude</w:t>
       </w:r>
       <w:r>
         <w:t xml:space="preserve"> </w:t>
@@ -3951,7 +4038,7 @@
         <w:rPr>
           <w:rStyle w:val="VerbatimChar"/>
         </w:rPr>
-        <w:t xml:space="preserve">agentteam: possible secrets tracked in git (above) — untrack/gitignore</w:t>
+        <w:t xml:space="preserve">frugal-flock: possible secrets tracked in git (above) — untrack/gitignore</w:t>
       </w:r>
       <w:r>
         <w:br/>
@@ -4006,7 +4093,7 @@
         <w:rPr>
           <w:rStyle w:val="VerbatimChar"/>
         </w:rPr>
-        <w:t xml:space="preserve">$ agentteam init ...</w:t>
+        <w:t xml:space="preserve">$ frugal-flock init ...</w:t>
       </w:r>
     </w:p>
     <w:p>
@@ -4716,7 +4803,7 @@
         <w:rPr>
           <w:rStyle w:val="VerbatimChar"/>
         </w:rPr>
-        <w:t xml:space="preserve">agentteam verify</w:t>
+        <w:t xml:space="preserve">frugal-flock verify</w:t>
       </w:r>
       <w:r>
         <w:t xml:space="preserve"> </w:t>
@@ -4870,7 +4957,7 @@
         <w:rPr>
           <w:rStyle w:val="VerbatimChar"/>
         </w:rPr>
-        <w:t xml:space="preserve">agentteam verify</w:t>
+        <w:t xml:space="preserve">frugal-flock verify</w:t>
       </w:r>
       <w:r>
         <w:t xml:space="preserve"> </w:t>
@@ -5326,7 +5413,7 @@
         <w:rPr>
           <w:rStyle w:val="VerbatimChar"/>
         </w:rPr>
-        <w:t xml:space="preserve">$ agentteam run codex T7-codex</w:t>
+        <w:t xml:space="preserve">$ frugal-flock run codex T7-codex</w:t>
       </w:r>
       <w:r>
         <w:br/>
@@ -5353,7 +5440,7 @@
         <w:rPr>
           <w:rStyle w:val="VerbatimChar"/>
         </w:rPr>
-        <w:t xml:space="preserve">next: agentteam verify codex T7-codex   then: agentteam diff codex</w:t>
+        <w:t xml:space="preserve">next: frugal-flock verify codex T7-codex   then: frugal-flock diff codex</w:t>
       </w:r>
     </w:p>
     <w:p>
@@ -5361,7 +5448,7 @@
         <w:pStyle w:val="FirstParagraph"/>
       </w:pPr>
       <w:r>
-        <w:t xml:space="preserve">What happened: agentteam checked the STOP switch, the agent’s bench</w:t>
+        <w:t xml:space="preserve">What happened: Frugal Flock checked the STOP switch, the agent’s bench</w:t>
       </w:r>
       <w:r>
         <w:t xml:space="preserve"> </w:t>
@@ -5501,16 +5588,16 @@
         <w:rPr>
           <w:rStyle w:val="VerbatimChar"/>
         </w:rPr>
-        <w:t xml:space="preserve">$ agentteam run -b antigravity T8-antigravity</w:t>
-      </w:r>
-      <w:r>
-        <w:br/>
-      </w:r>
-      <w:r>
-        <w:rPr>
-          <w:rStyle w:val="VerbatimChar"/>
-        </w:rPr>
-        <w:t xml:space="preserve">started in background — poll: agentteam status   live: agentteam tail T8-antigravity   abort: agentteam kill T8-antigravity</w:t>
+        <w:t xml:space="preserve">$ frugal-flock run -b antigravity T8-antigravity</w:t>
+      </w:r>
+      <w:r>
+        <w:br/>
+      </w:r>
+      <w:r>
+        <w:rPr>
+          <w:rStyle w:val="VerbatimChar"/>
+        </w:rPr>
+        <w:t xml:space="preserve">started in background — poll: frugal-flock status   live: frugal-flock tail T8-antigravity   abort: frugal-flock kill T8-antigravity</w:t>
       </w:r>
     </w:p>
     <w:p>
@@ -5525,7 +5612,7 @@
         <w:rPr>
           <w:rStyle w:val="VerbatimChar"/>
         </w:rPr>
-        <w:t xml:space="preserve">agentteam status</w:t>
+        <w:t xml:space="preserve">frugal-flock status</w:t>
       </w:r>
       <w:r>
         <w:t xml:space="preserve"> </w:t>
@@ -5589,7 +5676,7 @@
         <w:rPr>
           <w:rStyle w:val="VerbatimChar"/>
         </w:rPr>
-        <w:t xml:space="preserve">agentteam tail T8-antigravity</w:t>
+        <w:t xml:space="preserve">frugal-flock tail T8-antigravity</w:t>
       </w:r>
       <w:r>
         <w:t xml:space="preserve"> </w:t>
@@ -5625,7 +5712,7 @@
         <w:rPr>
           <w:rStyle w:val="VerbatimChar"/>
         </w:rPr>
-        <w:t xml:space="preserve">agentteam tail</w:t>
+        <w:t xml:space="preserve">frugal-flock tail</w:t>
       </w:r>
       <w:r>
         <w:t xml:space="preserve"> </w:t>
@@ -5652,7 +5739,7 @@
         <w:rPr>
           <w:rStyle w:val="VerbatimChar"/>
         </w:rPr>
-        <w:t xml:space="preserve">agentteam kill T8-antigravity</w:t>
+        <w:t xml:space="preserve">frugal-flock kill T8-antigravity</w:t>
       </w:r>
       <w:r>
         <w:t xml:space="preserve"> </w:t>
@@ -5924,16 +6011,16 @@
         <w:rPr>
           <w:rStyle w:val="VerbatimChar"/>
         </w:rPr>
-        <w:t xml:space="preserve">$ agentteam report T7-codex          # last 60 lines</w:t>
-      </w:r>
-      <w:r>
-        <w:br/>
-      </w:r>
-      <w:r>
-        <w:rPr>
-          <w:rStyle w:val="VerbatimChar"/>
-        </w:rPr>
-        <w:t xml:space="preserve">$ agentteam report T7-codex 200      # more history</w:t>
+        <w:t xml:space="preserve">$ frugal-flock report T7-codex          # last 60 lines</w:t>
+      </w:r>
+      <w:r>
+        <w:br/>
+      </w:r>
+      <w:r>
+        <w:rPr>
+          <w:rStyle w:val="VerbatimChar"/>
+        </w:rPr>
+        <w:t xml:space="preserve">$ frugal-flock report T7-codex 200      # more history</w:t>
       </w:r>
     </w:p>
     <w:bookmarkEnd w:id="39"/>
@@ -5969,7 +6056,7 @@
         <w:rPr>
           <w:rStyle w:val="VerbatimChar"/>
         </w:rPr>
-        <w:t xml:space="preserve">$ agentteam verify codex T7-codex</w:t>
+        <w:t xml:space="preserve">$ frugal-flock verify codex T7-codex</w:t>
       </w:r>
       <w:r>
         <w:br/>
@@ -6361,16 +6448,16 @@
         <w:rPr>
           <w:rStyle w:val="VerbatimChar"/>
         </w:rPr>
-        <w:t xml:space="preserve">$ agentteam diff codex --stat     # just the file list: your scope check</w:t>
-      </w:r>
-      <w:r>
-        <w:br/>
-      </w:r>
-      <w:r>
-        <w:rPr>
-          <w:rStyle w:val="VerbatimChar"/>
-        </w:rPr>
-        <w:t xml:space="preserve">$ agentteam diff codex            # every changed line: your real review</w:t>
+        <w:t xml:space="preserve">$ frugal-flock diff codex --stat     # just the file list: your scope check</w:t>
+      </w:r>
+      <w:r>
+        <w:br/>
+      </w:r>
+      <w:r>
+        <w:rPr>
+          <w:rStyle w:val="VerbatimChar"/>
+        </w:rPr>
+        <w:t xml:space="preserve">$ frugal-flock diff codex            # every changed line: your real review</w:t>
       </w:r>
     </w:p>
     <w:p>
@@ -6426,7 +6513,7 @@
         <w:rPr>
           <w:rStyle w:val="VerbatimChar"/>
         </w:rPr>
-        <w:t xml:space="preserve">$ agentteam review codex T7-codex</w:t>
+        <w:t xml:space="preserve">$ frugal-flock review codex T7-codex</w:t>
       </w:r>
     </w:p>
     <w:p>
@@ -6483,7 +6570,7 @@
         <w:t xml:space="preserve">VERDICT: REQUEST-CHANGES</w:t>
       </w:r>
       <w:r>
-        <w:t xml:space="preserve">. agentteam picks the</w:t>
+        <w:t xml:space="preserve">. Frugal Flock picks the</w:t>
       </w:r>
       <w:r>
         <w:t xml:space="preserve"> </w:t>
@@ -6622,7 +6709,7 @@
         <w:rPr>
           <w:rStyle w:val="VerbatimChar"/>
         </w:rPr>
-        <w:t xml:space="preserve">$ agentteam sync</w:t>
+        <w:t xml:space="preserve">$ frugal-flock sync</w:t>
       </w:r>
       <w:r>
         <w:br/>
@@ -7048,25 +7135,25 @@
         <w:rPr>
           <w:rStyle w:val="VerbatimChar"/>
         </w:rPr>
-        <w:t xml:space="preserve">$ agentteam status          # where did I leave off? benched agents? queue?</w:t>
-      </w:r>
-      <w:r>
-        <w:br/>
-      </w:r>
-      <w:r>
-        <w:rPr>
-          <w:rStyle w:val="VerbatimChar"/>
-        </w:rPr>
-        <w:t xml:space="preserve">$ agentteam doctor          # anything that would waste a run? (base, agents, stale)</w:t>
-      </w:r>
-      <w:r>
-        <w:br/>
-      </w:r>
-      <w:r>
-        <w:rPr>
-          <w:rStyle w:val="VerbatimChar"/>
-        </w:rPr>
-        <w:t xml:space="preserve">$ agentteam smoke           # after CLI updates or days away</w:t>
+        <w:t xml:space="preserve">$ frugal-flock status          # where did I leave off? benched agents? queue?</w:t>
+      </w:r>
+      <w:r>
+        <w:br/>
+      </w:r>
+      <w:r>
+        <w:rPr>
+          <w:rStyle w:val="VerbatimChar"/>
+        </w:rPr>
+        <w:t xml:space="preserve">$ frugal-flock doctor          # anything that would waste a run? (base, agents, stale)</w:t>
+      </w:r>
+      <w:r>
+        <w:br/>
+      </w:r>
+      <w:r>
+        <w:rPr>
+          <w:rStyle w:val="VerbatimChar"/>
+        </w:rPr>
+        <w:t xml:space="preserve">$ frugal-flock smoke           # after CLI updates or days away</w:t>
       </w:r>
       <w:r>
         <w:br/>
@@ -7326,16 +7413,16 @@
         <w:rPr>
           <w:rStyle w:val="VerbatimChar"/>
         </w:rPr>
-        <w:t xml:space="preserve">$ agentteam status      # 1. "running: (none)" — never leave -b runs going</w:t>
-      </w:r>
-      <w:r>
-        <w:br/>
-      </w:r>
-      <w:r>
-        <w:rPr>
-          <w:rStyle w:val="VerbatimChar"/>
-        </w:rPr>
-        <w:t xml:space="preserve">                        #    (stragglers: agentteam kill &lt;task&gt;)</w:t>
+        <w:t xml:space="preserve">$ frugal-flock status      # 1. "running: (none)" — never leave -b runs going</w:t>
+      </w:r>
+      <w:r>
+        <w:br/>
+      </w:r>
+      <w:r>
+        <w:rPr>
+          <w:rStyle w:val="VerbatimChar"/>
+        </w:rPr>
+        <w:t xml:space="preserve">                        #    (stragglers: frugal-flock kill &lt;task&gt;)</w:t>
       </w:r>
     </w:p>
     <w:p>
@@ -7373,7 +7460,7 @@
         <w:rPr>
           <w:rStyle w:val="VerbatimChar"/>
         </w:rPr>
-        <w:t xml:space="preserve">agentteam score</w:t>
+        <w:t xml:space="preserve">frugal-flock score</w:t>
       </w:r>
       <w:r>
         <w:t xml:space="preserve"> </w:t>
@@ -7685,7 +7772,7 @@
         <w:pStyle w:val="FirstParagraph"/>
       </w:pPr>
       <w:r>
-        <w:t xml:space="preserve">Subscriptions have 5-hour windows and weekly caps. agentteam treats that</w:t>
+        <w:t xml:space="preserve">Subscriptions have 5-hour windows and weekly caps. Frugal Flock treats that</w:t>
       </w:r>
       <w:r>
         <w:t xml:space="preserve"> </w:t>
@@ -7702,43 +7789,43 @@
         <w:rPr>
           <w:rStyle w:val="VerbatimChar"/>
         </w:rPr>
-        <w:t xml:space="preserve">$ agentteam off codex 5h     # window burned: benched, auto-returns in 5h</w:t>
-      </w:r>
-      <w:r>
-        <w:br/>
-      </w:r>
-      <w:r>
-        <w:rPr>
-          <w:rStyle w:val="VerbatimChar"/>
-        </w:rPr>
-        <w:t xml:space="preserve">$ agentteam off grok 7d      # weekly cap: benched for a week</w:t>
-      </w:r>
-      <w:r>
-        <w:br/>
-      </w:r>
-      <w:r>
-        <w:rPr>
-          <w:rStyle w:val="VerbatimChar"/>
-        </w:rPr>
-        <w:t xml:space="preserve">$ agentteam off opencode     # benched until you say otherwise</w:t>
-      </w:r>
-      <w:r>
-        <w:br/>
-      </w:r>
-      <w:r>
-        <w:rPr>
-          <w:rStyle w:val="VerbatimChar"/>
-        </w:rPr>
-        <w:t xml:space="preserve">$ agentteam on codex         # manual return anytime</w:t>
-      </w:r>
-      <w:r>
-        <w:br/>
-      </w:r>
-      <w:r>
-        <w:rPr>
-          <w:rStyle w:val="VerbatimChar"/>
-        </w:rPr>
-        <w:t xml:space="preserve">$ agentteam agents           # shows on/OFF with the auto-return countdown</w:t>
+        <w:t xml:space="preserve">$ frugal-flock off codex 5h     # window burned: benched, auto-returns in 5h</w:t>
+      </w:r>
+      <w:r>
+        <w:br/>
+      </w:r>
+      <w:r>
+        <w:rPr>
+          <w:rStyle w:val="VerbatimChar"/>
+        </w:rPr>
+        <w:t xml:space="preserve">$ frugal-flock off grok 7d      # weekly cap: benched for a week</w:t>
+      </w:r>
+      <w:r>
+        <w:br/>
+      </w:r>
+      <w:r>
+        <w:rPr>
+          <w:rStyle w:val="VerbatimChar"/>
+        </w:rPr>
+        <w:t xml:space="preserve">$ frugal-flock off opencode     # benched until you say otherwise</w:t>
+      </w:r>
+      <w:r>
+        <w:br/>
+      </w:r>
+      <w:r>
+        <w:rPr>
+          <w:rStyle w:val="VerbatimChar"/>
+        </w:rPr>
+        <w:t xml:space="preserve">$ frugal-flock on codex         # manual return anytime</w:t>
+      </w:r>
+      <w:r>
+        <w:br/>
+      </w:r>
+      <w:r>
+        <w:rPr>
+          <w:rStyle w:val="VerbatimChar"/>
+        </w:rPr>
+        <w:t xml:space="preserve">$ frugal-flock agents           # shows on/OFF with the auto-return countdown</w:t>
       </w:r>
     </w:p>
     <w:p>
@@ -7892,7 +7979,7 @@
         <w:t xml:space="preserve">“resets at”</w:t>
       </w:r>
       <w:r>
-        <w:t xml:space="preserve">…), agentteam prints</w:t>
+        <w:t xml:space="preserve">…), Frugal Flock prints</w:t>
       </w:r>
       <w:r>
         <w:t xml:space="preserve"> </w:t>
@@ -7985,7 +8072,7 @@
         <w:t xml:space="preserve">11. Fleet intelligence — who earns their seat</w:t>
       </w:r>
     </w:p>
-    <w:bookmarkStart w:id="54" w:name="agentteam-score"/>
+    <w:bookmarkStart w:id="54" w:name="frugal-flock-score"/>
     <w:p>
       <w:pPr>
         <w:pStyle w:val="Heading3"/>
@@ -8000,7 +8087,7 @@
         <w:rPr>
           <w:rStyle w:val="VerbatimChar"/>
         </w:rPr>
-        <w:t xml:space="preserve">agentteam score</w:t>
+        <w:t xml:space="preserve">frugal-flock score</w:t>
       </w:r>
     </w:p>
     <w:p>
@@ -8011,7 +8098,7 @@
         <w:rPr>
           <w:rStyle w:val="VerbatimChar"/>
         </w:rPr>
-        <w:t xml:space="preserve">$ agentteam score</w:t>
+        <w:t xml:space="preserve">$ frugal-flock score</w:t>
       </w:r>
       <w:r>
         <w:br/>
@@ -8415,7 +8502,7 @@
         <w:rPr>
           <w:rStyle w:val="VerbatimChar"/>
         </w:rPr>
-        <w:t xml:space="preserve">$ agentteam race T9 codex grok</w:t>
+        <w:t xml:space="preserve">$ frugal-flock race T9 codex grok</w:t>
       </w:r>
     </w:p>
     <w:p>
@@ -8423,7 +8510,7 @@
         <w:pStyle w:val="FirstParagraph"/>
       </w:pPr>
       <w:r>
-        <w:t xml:space="preserve">agentteam copies</w:t>
+        <w:t xml:space="preserve">Frugal Flock copies</w:t>
       </w:r>
       <w:r>
         <w:t xml:space="preserve"> </w:t>
@@ -8479,16 +8566,16 @@
         <w:rPr>
           <w:rStyle w:val="VerbatimChar"/>
         </w:rPr>
-        <w:t xml:space="preserve">$ agentteam verify codex T9-codex     $ agentteam verify grok T9-grok</w:t>
-      </w:r>
-      <w:r>
-        <w:br/>
-      </w:r>
-      <w:r>
-        <w:rPr>
-          <w:rStyle w:val="VerbatimChar"/>
-        </w:rPr>
-        <w:t xml:space="preserve">$ agentteam diff codex                $ agentteam diff grok</w:t>
+        <w:t xml:space="preserve">$ frugal-flock verify codex T9-codex     $ frugal-flock verify grok T9-grok</w:t>
+      </w:r>
+      <w:r>
+        <w:br/>
+      </w:r>
+      <w:r>
+        <w:rPr>
+          <w:rStyle w:val="VerbatimChar"/>
+        </w:rPr>
+        <w:t xml:space="preserve">$ frugal-flock diff codex                $ frugal-flock diff grok</w:t>
       </w:r>
     </w:p>
     <w:p>
@@ -8595,7 +8682,7 @@
         <w:rPr>
           <w:rStyle w:val="VerbatimChar"/>
         </w:rPr>
-        <w:t xml:space="preserve">$ agentteam sabotage opencode</w:t>
+        <w:t xml:space="preserve">$ frugal-flock sabotage opencode</w:t>
       </w:r>
     </w:p>
     <w:p>
@@ -8699,7 +8786,7 @@
         <w:rPr>
           <w:rStyle w:val="VerbatimChar"/>
         </w:rPr>
-        <w:t xml:space="preserve">agentteam init codex-2</w:t>
+        <w:t xml:space="preserve">frugal-flock init codex-2</w:t>
       </w:r>
       <w:r>
         <w:t xml:space="preserve"> </w:t>
@@ -8746,7 +8833,7 @@
         <w:pStyle w:val="FirstParagraph"/>
       </w:pPr>
       <w:r>
-        <w:t xml:space="preserve">agentteam bundles no AI — it calls whatever binaries are on your PATH, so</w:t>
+        <w:t xml:space="preserve">Frugal Flock bundles no AI — it calls whatever binaries are on your PATH, so</w:t>
       </w:r>
       <w:r>
         <w:t xml:space="preserve"> </w:t>
@@ -8834,7 +8921,7 @@
         <w:rPr>
           <w:rStyle w:val="VerbatimChar"/>
         </w:rPr>
-        <w:t xml:space="preserve">$ agentteam smoke</w:t>
+        <w:t xml:space="preserve">$ frugal-flock smoke</w:t>
       </w:r>
     </w:p>
     <w:p>
@@ -8876,13 +8963,13 @@
       </w:r>
     </w:p>
     <w:bookmarkEnd w:id="61"/>
-    <w:bookmarkStart w:id="62" w:name="updating-agentteam-itself"/>
+    <w:bookmarkStart w:id="62" w:name="updating-frugal-flock-itself"/>
     <w:p>
       <w:pPr>
         <w:pStyle w:val="Heading3"/>
       </w:pPr>
       <w:r>
-        <w:t xml:space="preserve">13.2 Updating agentteam itself</w:t>
+        <w:t xml:space="preserve">13.2 Updating Frugal Flock itself</w:t>
       </w:r>
     </w:p>
     <w:p>
@@ -8902,25 +8989,25 @@
         <w:rPr>
           <w:rStyle w:val="VerbatimChar"/>
         </w:rPr>
-        <w:t xml:space="preserve">$ bash agentteam-install.sh     # never touches your agents.conf</w:t>
-      </w:r>
-      <w:r>
-        <w:br/>
-      </w:r>
-      <w:r>
-        <w:rPr>
-          <w:rStyle w:val="VerbatimChar"/>
-        </w:rPr>
-        <w:t xml:space="preserve">$ agentteam selftest            # 27 checks, zero quota</w:t>
-      </w:r>
-      <w:r>
-        <w:br/>
-      </w:r>
-      <w:r>
-        <w:rPr>
-          <w:rStyle w:val="VerbatimChar"/>
-        </w:rPr>
-        <w:t xml:space="preserve">$ agentteam version             # confirm what you now run</w:t>
+        <w:t xml:space="preserve">$ bash frugal-flock-install.sh     # never touches your agents.conf</w:t>
+      </w:r>
+      <w:r>
+        <w:br/>
+      </w:r>
+      <w:r>
+        <w:rPr>
+          <w:rStyle w:val="VerbatimChar"/>
+        </w:rPr>
+        <w:t xml:space="preserve">$ frugal-flock selftest            # 27 checks, zero quota</w:t>
+      </w:r>
+      <w:r>
+        <w:br/>
+      </w:r>
+      <w:r>
+        <w:rPr>
+          <w:rStyle w:val="VerbatimChar"/>
+        </w:rPr>
+        <w:t xml:space="preserve">$ frugal-flock version             # confirm what you now run</w:t>
       </w:r>
     </w:p>
     <w:p>
@@ -8937,7 +9024,7 @@
         <w:rPr>
           <w:rStyle w:val="VerbatimChar"/>
         </w:rPr>
-        <w:t xml:space="preserve">agentteam init &lt;worker&gt;</w:t>
+        <w:t xml:space="preserve">frugal-flock init &lt;worker&gt;</w:t>
       </w:r>
       <w:r>
         <w:t xml:space="preserve"> </w:t>
@@ -9071,7 +9158,7 @@
         <w:rPr>
           <w:rStyle w:val="VerbatimChar"/>
         </w:rPr>
-        <w:t xml:space="preserve">agentteam status</w:t>
+        <w:t xml:space="preserve">frugal-flock status</w:t>
       </w:r>
       <w:r>
         <w:t xml:space="preserve"> </w:t>
@@ -9092,7 +9179,7 @@
         <w:rPr>
           <w:rStyle w:val="VerbatimChar"/>
         </w:rPr>
-        <w:t xml:space="preserve">agentteam agents</w:t>
+        <w:t xml:space="preserve">frugal-flock agents</w:t>
       </w:r>
       <w:r>
         <w:t xml:space="preserve"> </w:t>
@@ -9119,7 +9206,7 @@
         <w:rPr>
           <w:rStyle w:val="VerbatimChar"/>
         </w:rPr>
-        <w:t xml:space="preserve">agentteam tail &lt;task&gt;</w:t>
+        <w:t xml:space="preserve">frugal-flock tail &lt;task&gt;</w:t>
       </w:r>
       <w:r>
         <w:t xml:space="preserve"> </w:t>
@@ -9164,7 +9251,7 @@
         <w:rPr>
           <w:rStyle w:val="VerbatimChar"/>
         </w:rPr>
-        <w:t xml:space="preserve">agentteam report &lt;task&gt;</w:t>
+        <w:t xml:space="preserve">frugal-flock report &lt;task&gt;</w:t>
       </w:r>
       <w:r>
         <w:t xml:space="preserve">. Empty diff?</w:t>
@@ -9192,7 +9279,7 @@
           <w:b/>
           <w:bCs/>
         </w:rPr>
-        <w:t xml:space="preserve">agentteam selftest</w:t>
+        <w:t xml:space="preserve">frugal-flock selftest</w:t>
       </w:r>
       <w:r>
         <w:rPr>
@@ -9288,7 +9375,7 @@
               <w:rPr>
                 <w:rStyle w:val="VerbatimChar"/>
               </w:rPr>
-              <w:t xml:space="preserve">agentteam: command not found</w:t>
+              <w:t xml:space="preserve">frugal-flock: command not found</w:t>
             </w:r>
           </w:p>
         </w:tc>
@@ -9333,7 +9420,7 @@
               <w:rPr>
                 <w:rStyle w:val="VerbatimChar"/>
               </w:rPr>
-              <w:t xml:space="preserve">not inside an agentteam project</w:t>
+              <w:t xml:space="preserve">not inside a Frugal Flock project</w:t>
             </w:r>
           </w:p>
         </w:tc>
@@ -9759,7 +9846,7 @@
               <w:rPr>
                 <w:rStyle w:val="VerbatimChar"/>
               </w:rPr>
-              <w:t xml:space="preserve">agentteam smoke</w:t>
+              <w:t xml:space="preserve">frugal-flock smoke</w:t>
             </w:r>
             <w:r>
               <w:t xml:space="preserve"> </w:t>
@@ -9843,7 +9930,7 @@
               <w:rPr>
                 <w:rStyle w:val="VerbatimChar"/>
               </w:rPr>
-              <w:t xml:space="preserve">agentteam kill &lt;task&gt;</w:t>
+              <w:t xml:space="preserve">frugal-flock kill &lt;task&gt;</w:t>
             </w:r>
             <w:r>
               <w:t xml:space="preserve">.</w:t>
@@ -9879,7 +9966,7 @@
               <w:rPr>
                 <w:rStyle w:val="VerbatimChar"/>
               </w:rPr>
-              <w:t xml:space="preserve">agentteam off &lt;agent&gt; 5h</w:t>
+              <w:t xml:space="preserve">frugal-flock off &lt;agent&gt; 5h</w:t>
             </w:r>
             <w:r>
               <w:t xml:space="preserve"> </w:t>
@@ -10048,7 +10135,7 @@
               <w:rPr>
                 <w:rStyle w:val="VerbatimChar"/>
               </w:rPr>
-              <w:t xml:space="preserve">agentteam status</w:t>
+              <w:t xml:space="preserve">frugal-flock status</w:t>
             </w:r>
             <w:r>
               <w:t xml:space="preserve"> </w:t>
@@ -10063,7 +10150,7 @@
               <w:rPr>
                 <w:rStyle w:val="VerbatimChar"/>
               </w:rPr>
-              <w:t xml:space="preserve">agentteam kill &lt;task&gt;</w:t>
+              <w:t xml:space="preserve">frugal-flock kill &lt;task&gt;</w:t>
             </w:r>
             <w:r>
               <w:t xml:space="preserve">.</w:t>
@@ -10102,7 +10189,7 @@
               <w:rPr>
                 <w:rStyle w:val="VerbatimChar"/>
               </w:rPr>
-              <w:t xml:space="preserve">agentteam resume</w:t>
+              <w:t xml:space="preserve">frugal-flock resume</w:t>
             </w:r>
             <w:r>
               <w:t xml:space="preserve"> </w:t>
@@ -10144,7 +10231,7 @@
               <w:rPr>
                 <w:rStyle w:val="VerbatimChar"/>
               </w:rPr>
-              <w:t xml:space="preserve">agentteam on x</w:t>
+              <w:t xml:space="preserve">frugal-flock on x</w:t>
             </w:r>
             <w:r>
               <w:t xml:space="preserve">.</w:t>
@@ -10264,7 +10351,7 @@
               <w:rPr>
                 <w:rStyle w:val="VerbatimChar"/>
               </w:rPr>
-              <w:t xml:space="preserve">agentteam run</w:t>
+              <w:t xml:space="preserve">frugal-flock run</w:t>
             </w:r>
             <w:r>
               <w:t xml:space="preserve"> </w:t>
@@ -10649,7 +10736,7 @@
         <w:rPr>
           <w:rStyle w:val="VerbatimChar"/>
         </w:rPr>
-        <w:t xml:space="preserve">agentteam stop</w:t>
+        <w:t xml:space="preserve">frugal-flock stop</w:t>
       </w:r>
       <w:r>
         <w:t xml:space="preserve"> </w:t>
@@ -10670,7 +10757,7 @@
         <w:rPr>
           <w:rStyle w:val="VerbatimChar"/>
         </w:rPr>
-        <w:t xml:space="preserve">agentteam status</w:t>
+        <w:t xml:space="preserve">frugal-flock status</w:t>
       </w:r>
       <w:r>
         <w:t xml:space="preserve"> </w:t>
@@ -10685,7 +10772,7 @@
         <w:rPr>
           <w:rStyle w:val="VerbatimChar"/>
         </w:rPr>
-        <w:t xml:space="preserve">agentteam resume</w:t>
+        <w:t xml:space="preserve">frugal-flock resume</w:t>
       </w:r>
       <w:r>
         <w:t xml:space="preserve"> </w:t>
@@ -10813,7 +10900,7 @@
               <w:rPr>
                 <w:rStyle w:val="VerbatimChar"/>
               </w:rPr>
-              <w:t xml:space="preserve">agentteam new &lt;repo-url&gt; [name] [workers...]</w:t>
+              <w:t xml:space="preserve">frugal-flock new &lt;repo-url&gt; [name] [workers...]</w:t>
             </w:r>
           </w:p>
         </w:tc>
@@ -10852,7 +10939,7 @@
               <w:rPr>
                 <w:rStyle w:val="VerbatimChar"/>
               </w:rPr>
-              <w:t xml:space="preserve">agentteam init [w1 w2 ...]</w:t>
+              <w:t xml:space="preserve">frugal-flock init [w1 w2 ...]</w:t>
             </w:r>
           </w:p>
         </w:tc>
@@ -10879,7 +10966,7 @@
               <w:rPr>
                 <w:rStyle w:val="VerbatimChar"/>
               </w:rPr>
-              <w:t xml:space="preserve">agentteam agents</w:t>
+              <w:t xml:space="preserve">frugal-flock agents</w:t>
             </w:r>
           </w:p>
         </w:tc>
@@ -10906,7 +10993,7 @@
               <w:rPr>
                 <w:rStyle w:val="VerbatimChar"/>
               </w:rPr>
-              <w:t xml:space="preserve">agentteam smoke</w:t>
+              <w:t xml:space="preserve">frugal-flock smoke</w:t>
             </w:r>
           </w:p>
         </w:tc>
@@ -10933,7 +11020,7 @@
               <w:rPr>
                 <w:rStyle w:val="VerbatimChar"/>
               </w:rPr>
-              <w:t xml:space="preserve">agentteam selftest</w:t>
+              <w:t xml:space="preserve">frugal-flock selftest</w:t>
             </w:r>
           </w:p>
         </w:tc>
@@ -10960,7 +11047,7 @@
               <w:rPr>
                 <w:rStyle w:val="VerbatimChar"/>
               </w:rPr>
-              <w:t xml:space="preserve">agentteam doctor</w:t>
+              <w:t xml:space="preserve">frugal-flock doctor</w:t>
             </w:r>
           </w:p>
         </w:tc>
@@ -10987,7 +11074,7 @@
               <w:rPr>
                 <w:rStyle w:val="VerbatimChar"/>
               </w:rPr>
-              <w:t xml:space="preserve">agentteam version</w:t>
+              <w:t xml:space="preserve">frugal-flock version</w:t>
             </w:r>
           </w:p>
         </w:tc>
@@ -11061,7 +11148,7 @@
               <w:rPr>
                 <w:rStyle w:val="VerbatimChar"/>
               </w:rPr>
-              <w:t xml:space="preserve">agentteam run &lt;w&gt; &lt;task&gt;</w:t>
+              <w:t xml:space="preserve">frugal-flock run &lt;w&gt; &lt;task&gt;</w:t>
             </w:r>
           </w:p>
         </w:tc>
@@ -11118,7 +11205,7 @@
               <w:rPr>
                 <w:rStyle w:val="VerbatimChar"/>
               </w:rPr>
-              <w:t xml:space="preserve">agentteam run -b &lt;w&gt; &lt;task&gt;</w:t>
+              <w:t xml:space="preserve">frugal-flock run -b &lt;w&gt; &lt;task&gt;</w:t>
             </w:r>
           </w:p>
         </w:tc>
@@ -11145,7 +11232,7 @@
               <w:rPr>
                 <w:rStyle w:val="VerbatimChar"/>
               </w:rPr>
-              <w:t xml:space="preserve">agentteam tail [task]</w:t>
+              <w:t xml:space="preserve">frugal-flock tail [task]</w:t>
             </w:r>
           </w:p>
         </w:tc>
@@ -11172,7 +11259,7 @@
               <w:rPr>
                 <w:rStyle w:val="VerbatimChar"/>
               </w:rPr>
-              <w:t xml:space="preserve">agentteam kill &lt;task&gt;</w:t>
+              <w:t xml:space="preserve">frugal-flock kill &lt;task&gt;</w:t>
             </w:r>
           </w:p>
         </w:tc>
@@ -11199,7 +11286,7 @@
               <w:rPr>
                 <w:rStyle w:val="VerbatimChar"/>
               </w:rPr>
-              <w:t xml:space="preserve">agentteam report &lt;task&gt; [lines]</w:t>
+              <w:t xml:space="preserve">frugal-flock report &lt;task&gt; [lines]</w:t>
             </w:r>
           </w:p>
         </w:tc>
@@ -11226,7 +11313,7 @@
               <w:rPr>
                 <w:rStyle w:val="VerbatimChar"/>
               </w:rPr>
-              <w:t xml:space="preserve">agentteam verify &lt;w&gt; &lt;task&gt;</w:t>
+              <w:t xml:space="preserve">frugal-flock verify &lt;w&gt; &lt;task&gt;</w:t>
             </w:r>
           </w:p>
         </w:tc>
@@ -11253,7 +11340,7 @@
               <w:rPr>
                 <w:rStyle w:val="VerbatimChar"/>
               </w:rPr>
-              <w:t xml:space="preserve">agentteam diff &lt;w&gt; [--stat]</w:t>
+              <w:t xml:space="preserve">frugal-flock diff &lt;w&gt; [--stat]</w:t>
             </w:r>
           </w:p>
         </w:tc>
@@ -11280,7 +11367,7 @@
               <w:rPr>
                 <w:rStyle w:val="VerbatimChar"/>
               </w:rPr>
-              <w:t xml:space="preserve">agentteam review &lt;w&gt; &lt;task&gt; [agent]</w:t>
+              <w:t xml:space="preserve">frugal-flock review &lt;w&gt; &lt;task&gt; [agent]</w:t>
             </w:r>
           </w:p>
         </w:tc>
@@ -11334,7 +11421,7 @@
               <w:rPr>
                 <w:rStyle w:val="VerbatimChar"/>
               </w:rPr>
-              <w:t xml:space="preserve">agentteam sync [w]</w:t>
+              <w:t xml:space="preserve">frugal-flock sync [w]</w:t>
             </w:r>
           </w:p>
         </w:tc>
@@ -11408,7 +11495,7 @@
               <w:rPr>
                 <w:rStyle w:val="VerbatimChar"/>
               </w:rPr>
-              <w:t xml:space="preserve">agentteam race &lt;task&gt; &lt;w1&gt; &lt;w2&gt; [...]</w:t>
+              <w:t xml:space="preserve">frugal-flock race &lt;task&gt; &lt;w1&gt; &lt;w2&gt; [...]</w:t>
             </w:r>
           </w:p>
         </w:tc>
@@ -11435,7 +11522,7 @@
               <w:rPr>
                 <w:rStyle w:val="VerbatimChar"/>
               </w:rPr>
-              <w:t xml:space="preserve">agentteam sabotage [worker]</w:t>
+              <w:t xml:space="preserve">frugal-flock sabotage [worker]</w:t>
             </w:r>
           </w:p>
         </w:tc>
@@ -11462,7 +11549,7 @@
               <w:rPr>
                 <w:rStyle w:val="VerbatimChar"/>
               </w:rPr>
-              <w:t xml:space="preserve">agentteam sabotage --all</w:t>
+              <w:t xml:space="preserve">frugal-flock sabotage --all</w:t>
             </w:r>
           </w:p>
         </w:tc>
@@ -11489,7 +11576,7 @@
               <w:rPr>
                 <w:rStyle w:val="VerbatimChar"/>
               </w:rPr>
-              <w:t xml:space="preserve">agentteam score [project-root]</w:t>
+              <w:t xml:space="preserve">frugal-flock score [project-root]</w:t>
             </w:r>
           </w:p>
         </w:tc>
@@ -11563,7 +11650,7 @@
               <w:rPr>
                 <w:rStyle w:val="VerbatimChar"/>
               </w:rPr>
-              <w:t xml:space="preserve">agentteam status</w:t>
+              <w:t xml:space="preserve">frugal-flock status</w:t>
             </w:r>
           </w:p>
         </w:tc>
@@ -11590,7 +11677,7 @@
               <w:rPr>
                 <w:rStyle w:val="VerbatimChar"/>
               </w:rPr>
-              <w:t xml:space="preserve">agentteam off &lt;agent&gt; [30m\|5h\|7d]</w:t>
+              <w:t xml:space="preserve">frugal-flock off &lt;agent&gt; [30m\|5h\|7d]</w:t>
             </w:r>
           </w:p>
         </w:tc>
@@ -11629,7 +11716,7 @@
               <w:rPr>
                 <w:rStyle w:val="VerbatimChar"/>
               </w:rPr>
-              <w:t xml:space="preserve">agentteam on &lt;agent&gt;</w:t>
+              <w:t xml:space="preserve">frugal-flock on &lt;agent&gt;</w:t>
             </w:r>
           </w:p>
         </w:tc>
@@ -11656,7 +11743,7 @@
               <w:rPr>
                 <w:rStyle w:val="VerbatimChar"/>
               </w:rPr>
-              <w:t xml:space="preserve">agentteam stop</w:t>
+              <w:t xml:space="preserve">frugal-flock stop</w:t>
             </w:r>
             <w:r>
               <w:t xml:space="preserve"> </w:t>
@@ -11671,7 +11758,7 @@
               <w:rPr>
                 <w:rStyle w:val="VerbatimChar"/>
               </w:rPr>
-              <w:t xml:space="preserve">agentteam resume</w:t>
+              <w:t xml:space="preserve">frugal-flock resume</w:t>
             </w:r>
           </w:p>
         </w:tc>
@@ -11698,7 +11785,7 @@
               <w:rPr>
                 <w:rStyle w:val="VerbatimChar"/>
               </w:rPr>
-              <w:t xml:space="preserve">agentteam help</w:t>
+              <w:t xml:space="preserve">frugal-flock help</w:t>
             </w:r>
           </w:p>
         </w:tc>
@@ -11883,7 +11970,7 @@
         <w:rPr>
           <w:rStyle w:val="VerbatimChar"/>
         </w:rPr>
-        <w:t xml:space="preserve">AGENTTEAM_TIMEOUT=7200 agentteam run …</w:t>
+        <w:t xml:space="preserve">AGENTTEAM_TIMEOUT=7200 frugal-flock run …</w:t>
       </w:r>
       <w:r>
         <w:t xml:space="preserve">)</w:t>
@@ -13126,7 +13213,7 @@
               <w:pStyle w:val="Compact"/>
             </w:pPr>
             <w:r>
-              <w:t xml:space="preserve">A small script git runs automatically around actions (commit, push, merge). agentteam installs three guards.</w:t>
+              <w:t xml:space="preserve">A small script git runs automatically around actions (commit, push, merge). Frugal Flock installs three guards.</w:t>
             </w:r>
           </w:p>
         </w:tc>
@@ -13616,88 +13703,88 @@
         <w:rPr>
           <w:rStyle w:val="VerbatimChar"/>
         </w:rPr>
-        <w:t xml:space="preserve">SETUP (once)          bash agentteam-install.sh ; agentteam selftest</w:t>
-      </w:r>
-      <w:r>
-        <w:br/>
-      </w:r>
-      <w:r>
-        <w:rPr>
-          <w:rStyle w:val="VerbatimChar"/>
-        </w:rPr>
-        <w:t xml:space="preserve">                      log in each CLI once ; agentteam agents ; agentteam smoke</w:t>
-      </w:r>
-      <w:r>
-        <w:br/>
-      </w:r>
-      <w:r>
-        <w:rPr>
-          <w:rStyle w:val="VerbatimChar"/>
-        </w:rPr>
-        <w:t xml:space="preserve">NEW PROJECT           cd ~/code &amp;&amp; agentteam new &lt;repo-url&gt; myproj</w:t>
-      </w:r>
-      <w:r>
-        <w:br/>
-      </w:r>
-      <w:r>
-        <w:rPr>
-          <w:rStyle w:val="VerbatimChar"/>
-        </w:rPr>
-        <w:t xml:space="preserve">SESSION START         agentteam status ; agentteam doctor ; claude</w:t>
-      </w:r>
-      <w:r>
-        <w:br/>
-      </w:r>
-      <w:r>
-        <w:rPr>
-          <w:rStyle w:val="VerbatimChar"/>
-        </w:rPr>
-        <w:t xml:space="preserve">HEALTH CHECK          agentteam doctor    (before dispatching: catches waste)</w:t>
-      </w:r>
-      <w:r>
-        <w:br/>
-      </w:r>
-      <w:r>
-        <w:rPr>
-          <w:rStyle w:val="VerbatimChar"/>
-        </w:rPr>
-        <w:t xml:space="preserve">DISPATCH              agentteam run -b &lt;worker&gt; &lt;task&gt;</w:t>
-      </w:r>
-      <w:r>
-        <w:br/>
-      </w:r>
-      <w:r>
-        <w:rPr>
-          <w:rStyle w:val="VerbatimChar"/>
-        </w:rPr>
-        <w:t xml:space="preserve">WATCH                 agentteam status | tail &lt;task&gt; | kill &lt;task&gt;</w:t>
-      </w:r>
-      <w:r>
-        <w:br/>
-      </w:r>
-      <w:r>
-        <w:rPr>
-          <w:rStyle w:val="VerbatimChar"/>
-        </w:rPr>
-        <w:t xml:space="preserve">JUDGE                 agentteam verify &lt;w&gt; &lt;task&gt; ; agentteam diff &lt;w&gt;</w:t>
-      </w:r>
-      <w:r>
-        <w:br/>
-      </w:r>
-      <w:r>
-        <w:rPr>
-          <w:rStyle w:val="VerbatimChar"/>
-        </w:rPr>
-        <w:t xml:space="preserve">                      second opinion: agentteam review &lt;w&gt; &lt;task&gt;</w:t>
-      </w:r>
-      <w:r>
-        <w:br/>
-      </w:r>
-      <w:r>
-        <w:rPr>
-          <w:rStyle w:val="VerbatimChar"/>
-        </w:rPr>
-        <w:t xml:space="preserve">ACCEPT                git merge --no-ff agent/&lt;w&gt; -m "merge T7: ..." ; agentteam sync</w:t>
+        <w:t xml:space="preserve">SETUP (once)          bash frugal-flock-install.sh ; frugal-flock selftest</w:t>
+      </w:r>
+      <w:r>
+        <w:br/>
+      </w:r>
+      <w:r>
+        <w:rPr>
+          <w:rStyle w:val="VerbatimChar"/>
+        </w:rPr>
+        <w:t xml:space="preserve">                      log in each CLI once ; frugal-flock agents ; frugal-flock smoke</w:t>
+      </w:r>
+      <w:r>
+        <w:br/>
+      </w:r>
+      <w:r>
+        <w:rPr>
+          <w:rStyle w:val="VerbatimChar"/>
+        </w:rPr>
+        <w:t xml:space="preserve">NEW PROJECT           cd ~/code &amp;&amp; frugal-flock new &lt;repo-url&gt; myproj</w:t>
+      </w:r>
+      <w:r>
+        <w:br/>
+      </w:r>
+      <w:r>
+        <w:rPr>
+          <w:rStyle w:val="VerbatimChar"/>
+        </w:rPr>
+        <w:t xml:space="preserve">SESSION START         frugal-flock status ; frugal-flock doctor ; claude</w:t>
+      </w:r>
+      <w:r>
+        <w:br/>
+      </w:r>
+      <w:r>
+        <w:rPr>
+          <w:rStyle w:val="VerbatimChar"/>
+        </w:rPr>
+        <w:t xml:space="preserve">HEALTH CHECK          frugal-flock doctor    (before dispatching: catches waste)</w:t>
+      </w:r>
+      <w:r>
+        <w:br/>
+      </w:r>
+      <w:r>
+        <w:rPr>
+          <w:rStyle w:val="VerbatimChar"/>
+        </w:rPr>
+        <w:t xml:space="preserve">DISPATCH              frugal-flock run -b &lt;worker&gt; &lt;task&gt;</w:t>
+      </w:r>
+      <w:r>
+        <w:br/>
+      </w:r>
+      <w:r>
+        <w:rPr>
+          <w:rStyle w:val="VerbatimChar"/>
+        </w:rPr>
+        <w:t xml:space="preserve">WATCH                 frugal-flock status | tail &lt;task&gt; | kill &lt;task&gt;</w:t>
+      </w:r>
+      <w:r>
+        <w:br/>
+      </w:r>
+      <w:r>
+        <w:rPr>
+          <w:rStyle w:val="VerbatimChar"/>
+        </w:rPr>
+        <w:t xml:space="preserve">JUDGE                 frugal-flock verify &lt;w&gt; &lt;task&gt; ; frugal-flock diff &lt;w&gt;</w:t>
+      </w:r>
+      <w:r>
+        <w:br/>
+      </w:r>
+      <w:r>
+        <w:rPr>
+          <w:rStyle w:val="VerbatimChar"/>
+        </w:rPr>
+        <w:t xml:space="preserve">                      second opinion: frugal-flock review &lt;w&gt; &lt;task&gt;</w:t>
+      </w:r>
+      <w:r>
+        <w:br/>
+      </w:r>
+      <w:r>
+        <w:rPr>
+          <w:rStyle w:val="VerbatimChar"/>
+        </w:rPr>
+        <w:t xml:space="preserve">ACCEPT                git merge --no-ff agent/&lt;w&gt; -m "merge T7: ..." ; frugal-flock sync</w:t>
       </w:r>
       <w:r>
         <w:br/>
@@ -13715,34 +13802,34 @@
         <w:rPr>
           <w:rStyle w:val="VerbatimChar"/>
         </w:rPr>
-        <w:t xml:space="preserve">QUOTA                 agentteam off &lt;agent&gt; 5h|7d ; agentteam on &lt;agent&gt;</w:t>
-      </w:r>
-      <w:r>
-        <w:br/>
-      </w:r>
-      <w:r>
-        <w:rPr>
-          <w:rStyle w:val="VerbatimChar"/>
-        </w:rPr>
-        <w:t xml:space="preserve">PANIC                 agentteam stop  ...  agentteam resume</w:t>
-      </w:r>
-      <w:r>
-        <w:br/>
-      </w:r>
-      <w:r>
-        <w:rPr>
-          <w:rStyle w:val="VerbatimChar"/>
-        </w:rPr>
-        <w:t xml:space="preserve">SCOREBOARD            agentteam score</w:t>
-      </w:r>
-      <w:r>
-        <w:br/>
-      </w:r>
-      <w:r>
-        <w:rPr>
-          <w:rStyle w:val="VerbatimChar"/>
-        </w:rPr>
-        <w:t xml:space="preserve">EXTRA PLAYS           agentteam race &lt;task&gt; w1 w2 ; agentteam sabotage &lt;w&gt;</w:t>
+        <w:t xml:space="preserve">QUOTA                 frugal-flock off &lt;agent&gt; 5h|7d ; frugal-flock on &lt;agent&gt;</w:t>
+      </w:r>
+      <w:r>
+        <w:br/>
+      </w:r>
+      <w:r>
+        <w:rPr>
+          <w:rStyle w:val="VerbatimChar"/>
+        </w:rPr>
+        <w:t xml:space="preserve">PANIC                 frugal-flock stop  ...  frugal-flock resume</w:t>
+      </w:r>
+      <w:r>
+        <w:br/>
+      </w:r>
+      <w:r>
+        <w:rPr>
+          <w:rStyle w:val="VerbatimChar"/>
+        </w:rPr>
+        <w:t xml:space="preserve">SCOREBOARD            frugal-flock score</w:t>
+      </w:r>
+      <w:r>
+        <w:br/>
+      </w:r>
+      <w:r>
+        <w:rPr>
+          <w:rStyle w:val="VerbatimChar"/>
+        </w:rPr>
+        <w:t xml:space="preserve">EXTRA PLAYS           frugal-flock race &lt;task&gt; w1 w2 ; frugal-flock sabotage &lt;w&gt;</w:t>
       </w:r>
       <w:r>
         <w:br/>
@@ -13760,7 +13847,7 @@
         <w:rPr>
           <w:rStyle w:val="VerbatimChar"/>
         </w:rPr>
-        <w:t xml:space="preserve">AFTER ANY UPDATE      agentteam smoke ; after agentteam updates: selftest + version</w:t>
+        <w:t xml:space="preserve">AFTER ANY UPDATE      frugal-flock smoke ; after frugal-flock updates: selftest + version</w:t>
       </w:r>
     </w:p>
     <w:p>
@@ -14564,7 +14651,7 @@
               <w:rPr>
                 <w:rStyle w:val="VerbatimChar"/>
               </w:rPr>
-              <w:t xml:space="preserve">agentteam-install.sh</w:t>
+              <w:t xml:space="preserve">frugal-flock-install.sh</w:t>
             </w:r>
           </w:p>
         </w:tc>

</xml_diff>

<commit_message>
docs: welcome new builders to Frugal Flock
</commit_message>
<xml_diff>
--- a/docs/GUIDEBOOK.docx
+++ b/docs/GUIDEBOOK.docx
@@ -28,7 +28,7 @@
         </w:p>
       </w:sdtContent>
     </w:sdt>
-    <w:bookmarkStart w:id="79" w:name="frugal-flock-the-complete-guidebook"/>
+    <w:bookmarkStart w:id="80" w:name="frugal-flock-the-complete-guidebook"/>
     <w:p>
       <w:pPr>
         <w:pStyle w:val="Heading1"/>
@@ -2074,7 +2074,7 @@
     </w:p>
     <w:bookmarkEnd w:id="18"/>
     <w:bookmarkEnd w:id="19"/>
-    <w:bookmarkStart w:id="26" w:name="installation-step-by-step"/>
+    <w:bookmarkStart w:id="27" w:name="installation-step-by-step"/>
     <w:p>
       <w:pPr>
         <w:pStyle w:val="Heading2"/>
@@ -2150,7 +2150,7 @@
       </w:r>
     </w:p>
     <w:bookmarkEnd w:id="20"/>
-    <w:bookmarkStart w:id="21" w:name="install-frugal-flock-itself"/>
+    <w:bookmarkStart w:id="22" w:name="install-frugal-flock-itself"/>
     <w:p>
       <w:pPr>
         <w:pStyle w:val="Heading3"/>
@@ -2164,7 +2164,24 @@
         <w:pStyle w:val="FirstParagraph"/>
       </w:pPr>
       <w:r>
-        <w:t xml:space="preserve">From your clone of the</w:t>
+        <w:t xml:space="preserve">From your clone of</w:t>
+      </w:r>
+      <w:r>
+        <w:t xml:space="preserve"> </w:t>
+      </w:r>
+      <w:hyperlink r:id="rId21">
+        <w:r>
+          <w:rPr>
+            <w:rStyle w:val="Hyperlink"/>
+          </w:rPr>
+          <w:t xml:space="preserve">Frugal Flock</w:t>
+        </w:r>
+      </w:hyperlink>
+      <w:r>
+        <w:t xml:space="preserve"> </w:t>
+      </w:r>
+      <w:r>
+        <w:t xml:space="preserve">(formerly</w:t>
       </w:r>
       <w:r>
         <w:t xml:space="preserve"> </w:t>
@@ -2176,10 +2193,7 @@
         <w:t xml:space="preserve">agentteam-docs</w:t>
       </w:r>
       <w:r>
-        <w:t xml:space="preserve"> </w:t>
-      </w:r>
-      <w:r>
-        <w:t xml:space="preserve">repository:</w:t>
+        <w:t xml:space="preserve">):</w:t>
       </w:r>
     </w:p>
     <w:p>
@@ -2634,8 +2648,8 @@
         <w:t xml:space="preserve">again lists your task ids.</w:t>
       </w:r>
     </w:p>
-    <w:bookmarkEnd w:id="21"/>
-    <w:bookmarkStart w:id="22" w:name="X9777de47ec8c4a3db718a889cef5d90d96160ab"/>
+    <w:bookmarkEnd w:id="22"/>
+    <w:bookmarkStart w:id="23" w:name="X9777de47ec8c4a3db718a889cef5d90d96160ab"/>
     <w:p>
       <w:pPr>
         <w:pStyle w:val="Heading3"/>
@@ -3076,8 +3090,8 @@
         <w:t xml:space="preserve">seat; everything else can join later.</w:t>
       </w:r>
     </w:p>
-    <w:bookmarkEnd w:id="22"/>
-    <w:bookmarkStart w:id="23" w:name="the-config-file-agents.conf-the-lego-box"/>
+    <w:bookmarkEnd w:id="23"/>
+    <w:bookmarkStart w:id="24" w:name="the-config-file-agents.conf-the-lego-box"/>
     <w:p>
       <w:pPr>
         <w:pStyle w:val="Heading3"/>
@@ -3325,8 +3339,8 @@
         <w:t xml:space="preserve">is for (chapter 10).</w:t>
       </w:r>
     </w:p>
-    <w:bookmarkEnd w:id="23"/>
-    <w:bookmarkStart w:id="24" w:name="X254123dabeedf94f1999ef65d2a5f37b41f6fe9"/>
+    <w:bookmarkEnd w:id="24"/>
+    <w:bookmarkStart w:id="25" w:name="X254123dabeedf94f1999ef65d2a5f37b41f6fe9"/>
     <w:p>
       <w:pPr>
         <w:pStyle w:val="Heading3"/>
@@ -3597,8 +3611,8 @@
         <w:t xml:space="preserve">any CLI update or after days away.</w:t>
       </w:r>
     </w:p>
-    <w:bookmarkEnd w:id="24"/>
-    <w:bookmarkStart w:id="25" w:name="practice-everything-with-zero-quota"/>
+    <w:bookmarkEnd w:id="25"/>
+    <w:bookmarkStart w:id="26" w:name="practice-everything-with-zero-quota"/>
     <w:p>
       <w:pPr>
         <w:pStyle w:val="Heading3"/>
@@ -3681,9 +3695,9 @@
         </w:pict>
       </w:r>
     </w:p>
-    <w:bookmarkEnd w:id="25"/>
     <w:bookmarkEnd w:id="26"/>
-    <w:bookmarkStart w:id="31" w:name="starting-a-project"/>
+    <w:bookmarkEnd w:id="27"/>
+    <w:bookmarkStart w:id="32" w:name="starting-a-project"/>
     <w:p>
       <w:pPr>
         <w:pStyle w:val="Heading2"/>
@@ -3692,7 +3706,7 @@
         <w:t xml:space="preserve">5. Starting a project</w:t>
       </w:r>
     </w:p>
-    <w:bookmarkStart w:id="27" w:name="the-one-command-way"/>
+    <w:bookmarkStart w:id="28" w:name="the-one-command-way"/>
     <w:p>
       <w:pPr>
         <w:pStyle w:val="Heading3"/>
@@ -3865,8 +3879,8 @@
         <w:t xml:space="preserve">.</w:t>
       </w:r>
     </w:p>
-    <w:bookmarkEnd w:id="27"/>
-    <w:bookmarkStart w:id="28" w:name="the-manual-way"/>
+    <w:bookmarkEnd w:id="28"/>
+    <w:bookmarkStart w:id="29" w:name="the-manual-way"/>
     <w:p>
       <w:pPr>
         <w:pStyle w:val="Heading3"/>
@@ -3945,8 +3959,8 @@
         <w:t xml:space="preserve">later adds one more workshop without touching the others.</w:t>
       </w:r>
     </w:p>
-    <w:bookmarkEnd w:id="28"/>
-    <w:bookmarkStart w:id="29" w:name="the-secrets-preflight"/>
+    <w:bookmarkEnd w:id="29"/>
+    <w:bookmarkStart w:id="30" w:name="the-secrets-preflight"/>
     <w:p>
       <w:pPr>
         <w:pStyle w:val="Heading3"/>
@@ -4110,8 +4124,8 @@
         <w:t xml:space="preserve">false alarm.</w:t>
       </w:r>
     </w:p>
-    <w:bookmarkEnd w:id="29"/>
-    <w:bookmarkStart w:id="30" w:name="Xf0646718b6f20caf81384342403f481b4d781dc"/>
+    <w:bookmarkEnd w:id="30"/>
+    <w:bookmarkStart w:id="31" w:name="Xf0646718b6f20caf81384342403f481b4d781dc"/>
     <w:p>
       <w:pPr>
         <w:pStyle w:val="Heading3"/>
@@ -4335,9 +4349,9 @@
         </w:pict>
       </w:r>
     </w:p>
-    <w:bookmarkEnd w:id="30"/>
     <w:bookmarkEnd w:id="31"/>
-    <w:bookmarkStart w:id="36" w:name="task-files-the-heart-of-the-system"/>
+    <w:bookmarkEnd w:id="32"/>
+    <w:bookmarkStart w:id="37" w:name="task-files-the-heart-of-the-system"/>
     <w:p>
       <w:pPr>
         <w:pStyle w:val="Heading2"/>
@@ -4414,7 +4428,7 @@
         <w:t xml:space="preserve">must be understandable by a total stranger.</w:t>
       </w:r>
     </w:p>
-    <w:bookmarkStart w:id="32" w:name="the-template-section-by-section"/>
+    <w:bookmarkStart w:id="33" w:name="the-template-section-by-section"/>
     <w:p>
       <w:pPr>
         <w:pStyle w:val="Heading3"/>
@@ -4724,8 +4738,8 @@
         <w:t xml:space="preserve">RISKS / NEEDS-REVIEW</w:t>
       </w:r>
     </w:p>
-    <w:bookmarkEnd w:id="32"/>
-    <w:bookmarkStart w:id="33" w:name="X8f706acfc66ddce99b85b68aa37cd7629e871ac"/>
+    <w:bookmarkEnd w:id="33"/>
+    <w:bookmarkStart w:id="34" w:name="X8f706acfc66ddce99b85b68aa37cd7629e871ac"/>
     <w:p>
       <w:pPr>
         <w:pStyle w:val="Heading3"/>
@@ -5001,8 +5015,8 @@
         <w:t xml:space="preserve">Write both precisely and the gate becomes largely mechanical.</w:t>
       </w:r>
     </w:p>
-    <w:bookmarkEnd w:id="33"/>
-    <w:bookmarkStart w:id="34" w:name="changelog-fragments"/>
+    <w:bookmarkEnd w:id="34"/>
+    <w:bookmarkStart w:id="35" w:name="changelog-fragments"/>
     <w:p>
       <w:pPr>
         <w:pStyle w:val="Heading3"/>
@@ -5082,8 +5096,8 @@
         <w:t xml:space="preserve">(that is allowed: the foreman may edit docs).</w:t>
       </w:r>
     </w:p>
-    <w:bookmarkEnd w:id="34"/>
-    <w:bookmarkStart w:id="35" w:name="what-good-and-bad-look-like"/>
+    <w:bookmarkEnd w:id="35"/>
+    <w:bookmarkStart w:id="36" w:name="what-good-and-bad-look-like"/>
     <w:p>
       <w:pPr>
         <w:pStyle w:val="Heading3"/>
@@ -5385,9 +5399,9 @@
         </w:pict>
       </w:r>
     </w:p>
-    <w:bookmarkEnd w:id="35"/>
     <w:bookmarkEnd w:id="36"/>
-    <w:bookmarkStart w:id="46" w:name="running-work-every-step-explained"/>
+    <w:bookmarkEnd w:id="37"/>
+    <w:bookmarkStart w:id="47" w:name="running-work-every-step-explained"/>
     <w:p>
       <w:pPr>
         <w:pStyle w:val="Heading2"/>
@@ -5396,7 +5410,7 @@
         <w:t xml:space="preserve">7. Running work — every step explained</w:t>
       </w:r>
     </w:p>
-    <w:bookmarkStart w:id="37" w:name="a-foreground-run"/>
+    <w:bookmarkStart w:id="38" w:name="a-foreground-run"/>
     <w:p>
       <w:pPr>
         <w:pStyle w:val="Heading3"/>
@@ -5547,8 +5561,8 @@
         <w:t xml:space="preserve">event to the ledger.</w:t>
       </w:r>
     </w:p>
-    <w:bookmarkEnd w:id="37"/>
-    <w:bookmarkStart w:id="38" w:name="background-runs"/>
+    <w:bookmarkEnd w:id="38"/>
+    <w:bookmarkStart w:id="39" w:name="background-runs"/>
     <w:p>
       <w:pPr>
         <w:pStyle w:val="Heading3"/>
@@ -5806,8 +5820,8 @@
         <w:t xml:space="preserve">workers run in parallel freely.</w:t>
       </w:r>
     </w:p>
-    <w:bookmarkEnd w:id="38"/>
-    <w:bookmarkStart w:id="39" w:name="reading-the-report"/>
+    <w:bookmarkEnd w:id="39"/>
+    <w:bookmarkStart w:id="40" w:name="reading-the-report"/>
     <w:p>
       <w:pPr>
         <w:pStyle w:val="Heading3"/>
@@ -6023,8 +6037,8 @@
         <w:t xml:space="preserve">$ frugal-flock report T7-codex 200      # more history</w:t>
       </w:r>
     </w:p>
-    <w:bookmarkEnd w:id="39"/>
-    <w:bookmarkStart w:id="40" w:name="Xc1faa28140f82162bba973faee67ec6fdd06772"/>
+    <w:bookmarkEnd w:id="40"/>
+    <w:bookmarkStart w:id="41" w:name="Xc1faa28140f82162bba973faee67ec6fdd06772"/>
     <w:p>
       <w:pPr>
         <w:pStyle w:val="Heading3"/>
@@ -6415,8 +6429,8 @@
         <w:t xml:space="preserve">automatically — background work comes back pre-judged.</w:t>
       </w:r>
     </w:p>
-    <w:bookmarkEnd w:id="40"/>
-    <w:bookmarkStart w:id="41" w:name="diff-the-receipts"/>
+    <w:bookmarkEnd w:id="41"/>
+    <w:bookmarkStart w:id="42" w:name="diff-the-receipts"/>
     <w:p>
       <w:pPr>
         <w:pStyle w:val="Heading3"/>
@@ -6480,8 +6494,8 @@
         <w:t xml:space="preserve">uncommitted.</w:t>
       </w:r>
     </w:p>
-    <w:bookmarkEnd w:id="41"/>
-    <w:bookmarkStart w:id="42" w:name="review-a-rivals-second-opinion"/>
+    <w:bookmarkEnd w:id="42"/>
+    <w:bookmarkStart w:id="43" w:name="review-a-rivals-second-opinion"/>
     <w:p>
       <w:pPr>
         <w:pStyle w:val="Heading3"/>
@@ -6597,8 +6611,8 @@
         <w:t xml:space="preserve">diffs; your gate still decides.</w:t>
       </w:r>
     </w:p>
-    <w:bookmarkEnd w:id="42"/>
-    <w:bookmarkStart w:id="43" w:name="the-human-gate-merging"/>
+    <w:bookmarkEnd w:id="43"/>
+    <w:bookmarkStart w:id="44" w:name="the-human-gate-merging"/>
     <w:p>
       <w:pPr>
         <w:pStyle w:val="Heading3"/>
@@ -6676,8 +6690,8 @@
         <w:t xml:space="preserve">fragment.</w:t>
       </w:r>
     </w:p>
-    <w:bookmarkEnd w:id="43"/>
-    <w:bookmarkStart w:id="44" w:name="sync-after-your-merges"/>
+    <w:bookmarkEnd w:id="44"/>
+    <w:bookmarkStart w:id="45" w:name="sync-after-your-merges"/>
     <w:p>
       <w:pPr>
         <w:pStyle w:val="Heading3"/>
@@ -6807,8 +6821,8 @@
         <w:t xml:space="preserve">Run it after every merge session; it prevents next week’s conflicts.</w:t>
       </w:r>
     </w:p>
-    <w:bookmarkEnd w:id="44"/>
-    <w:bookmarkStart w:id="45" w:name="rejecting-work"/>
+    <w:bookmarkEnd w:id="45"/>
+    <w:bookmarkStart w:id="46" w:name="rejecting-work"/>
     <w:p>
       <w:pPr>
         <w:pStyle w:val="Heading3"/>
@@ -6896,9 +6910,9 @@
         </w:pict>
       </w:r>
     </w:p>
-    <w:bookmarkEnd w:id="45"/>
     <w:bookmarkEnd w:id="46"/>
-    <w:bookmarkStart w:id="47" w:name="see-one-complete-cycle"/>
+    <w:bookmarkEnd w:id="47"/>
+    <w:bookmarkStart w:id="48" w:name="see-one-complete-cycle"/>
     <w:p>
       <w:pPr>
         <w:pStyle w:val="Heading2"/>
@@ -7043,8 +7057,8 @@
         </w:pict>
       </w:r>
     </w:p>
-    <w:bookmarkEnd w:id="47"/>
-    <w:bookmarkStart w:id="52" w:name="the-daily-rhythm"/>
+    <w:bookmarkEnd w:id="48"/>
+    <w:bookmarkStart w:id="53" w:name="the-daily-rhythm"/>
     <w:p>
       <w:pPr>
         <w:pStyle w:val="Heading2"/>
@@ -7109,7 +7123,7 @@
         <w:t xml:space="preserve">without losing anything that matters.</w:t>
       </w:r>
     </w:p>
-    <w:bookmarkStart w:id="48" w:name="starting-a-session-2-minutes"/>
+    <w:bookmarkStart w:id="49" w:name="starting-a-session-2-minutes"/>
     <w:p>
       <w:pPr>
         <w:pStyle w:val="Heading3"/>
@@ -7229,8 +7243,8 @@
         <w:t xml:space="preserve">then propose the next step. Wait for my go.</w:t>
       </w:r>
     </w:p>
-    <w:bookmarkEnd w:id="48"/>
-    <w:bookmarkStart w:id="49" w:name="working-efficiently"/>
+    <w:bookmarkEnd w:id="49"/>
+    <w:bookmarkStart w:id="50" w:name="working-efficiently"/>
     <w:p>
       <w:pPr>
         <w:pStyle w:val="Heading3"/>
@@ -7395,8 +7409,8 @@
         <w:t xml:space="preserve">One cycle at a time: your review is the bottleneck — protect it.</w:t>
       </w:r>
     </w:p>
-    <w:bookmarkEnd w:id="49"/>
-    <w:bookmarkStart w:id="50" w:name="X41b8a561e88ecc96e42b7fb4adac8fffa325b22"/>
+    <w:bookmarkEnd w:id="50"/>
+    <w:bookmarkStart w:id="51" w:name="X41b8a561e88ecc96e42b7fb4adac8fffa325b22"/>
     <w:p>
       <w:pPr>
         <w:pStyle w:val="Heading3"/>
@@ -7532,8 +7546,8 @@
         <w:t xml:space="preserve">$ exit                   # 3. everything durable is on disk</w:t>
       </w:r>
     </w:p>
-    <w:bookmarkEnd w:id="50"/>
-    <w:bookmarkStart w:id="51" w:name="what-survives-what"/>
+    <w:bookmarkEnd w:id="51"/>
+    <w:bookmarkStart w:id="52" w:name="what-survives-what"/>
     <w:p>
       <w:pPr>
         <w:pStyle w:val="Heading3"/>
@@ -7756,9 +7770,9 @@
         </w:pict>
       </w:r>
     </w:p>
-    <w:bookmarkEnd w:id="51"/>
     <w:bookmarkEnd w:id="52"/>
-    <w:bookmarkStart w:id="53" w:name="quota-management-the-bench"/>
+    <w:bookmarkEnd w:id="53"/>
+    <w:bookmarkStart w:id="54" w:name="quota-management-the-bench"/>
     <w:p>
       <w:pPr>
         <w:pStyle w:val="Heading2"/>
@@ -8062,8 +8076,8 @@
         </w:pict>
       </w:r>
     </w:p>
-    <w:bookmarkEnd w:id="53"/>
-    <w:bookmarkStart w:id="56" w:name="fleet-intelligence-who-earns-their-seat"/>
+    <w:bookmarkEnd w:id="54"/>
+    <w:bookmarkStart w:id="57" w:name="fleet-intelligence-who-earns-their-seat"/>
     <w:p>
       <w:pPr>
         <w:pStyle w:val="Heading2"/>
@@ -8072,7 +8086,7 @@
         <w:t xml:space="preserve">11. Fleet intelligence — who earns their seat</w:t>
       </w:r>
     </w:p>
-    <w:bookmarkStart w:id="54" w:name="frugal-flock-score"/>
+    <w:bookmarkStart w:id="55" w:name="frugal-flock-score"/>
     <w:p>
       <w:pPr>
         <w:pStyle w:val="Heading3"/>
@@ -8326,8 +8340,8 @@
         <w:t xml:space="preserve">including history from before the ledger existed.</w:t>
       </w:r>
     </w:p>
-    <w:bookmarkEnd w:id="54"/>
-    <w:bookmarkStart w:id="55" w:name="the-ledger-for-the-curious"/>
+    <w:bookmarkEnd w:id="55"/>
+    <w:bookmarkStart w:id="56" w:name="the-ledger-for-the-curious"/>
     <w:p>
       <w:pPr>
         <w:pStyle w:val="Heading3"/>
@@ -8445,9 +8459,9 @@
         </w:pict>
       </w:r>
     </w:p>
-    <w:bookmarkEnd w:id="55"/>
     <w:bookmarkEnd w:id="56"/>
-    <w:bookmarkStart w:id="60" w:name="advanced-plays"/>
+    <w:bookmarkEnd w:id="57"/>
+    <w:bookmarkStart w:id="61" w:name="advanced-plays"/>
     <w:p>
       <w:pPr>
         <w:pStyle w:val="Heading2"/>
@@ -8456,7 +8470,7 @@
         <w:t xml:space="preserve">12. Advanced plays</w:t>
       </w:r>
     </w:p>
-    <w:bookmarkStart w:id="57" w:name="race-the-bake-off"/>
+    <w:bookmarkStart w:id="58" w:name="race-the-bake-off"/>
     <w:p>
       <w:pPr>
         <w:pStyle w:val="Heading3"/>
@@ -8641,8 +8655,8 @@
         <w:t xml:space="preserve">disjoint-scope rule, because only one branch survives.</w:t>
       </w:r>
     </w:p>
-    <w:bookmarkEnd w:id="57"/>
-    <w:bookmarkStart w:id="58" w:name="sabotage-the-saboteur-seat"/>
+    <w:bookmarkEnd w:id="58"/>
+    <w:bookmarkStart w:id="59" w:name="sabotage-the-saboteur-seat"/>
     <w:p>
       <w:pPr>
         <w:pStyle w:val="Heading3"/>
@@ -8762,8 +8776,8 @@
         <w:t xml:space="preserve">a normal task on the next cycle — and the failing test joins the suite.</w:t>
       </w:r>
     </w:p>
-    <w:bookmarkEnd w:id="58"/>
-    <w:bookmarkStart w:id="59" w:name="doubling-a-strong-seat"/>
+    <w:bookmarkEnd w:id="59"/>
+    <w:bookmarkStart w:id="60" w:name="doubling-a-strong-seat"/>
     <w:p>
       <w:pPr>
         <w:pStyle w:val="Heading3"/>
@@ -8808,9 +8822,9 @@
         </w:pict>
       </w:r>
     </w:p>
-    <w:bookmarkEnd w:id="59"/>
     <w:bookmarkEnd w:id="60"/>
-    <w:bookmarkStart w:id="64" w:name="maintenance"/>
+    <w:bookmarkEnd w:id="61"/>
+    <w:bookmarkStart w:id="65" w:name="maintenance"/>
     <w:p>
       <w:pPr>
         <w:pStyle w:val="Heading2"/>
@@ -8819,7 +8833,7 @@
         <w:t xml:space="preserve">13. Maintenance</w:t>
       </w:r>
     </w:p>
-    <w:bookmarkStart w:id="61" w:name="updating-the-ai-clis"/>
+    <w:bookmarkStart w:id="62" w:name="updating-the-ai-clis"/>
     <w:p>
       <w:pPr>
         <w:pStyle w:val="Heading3"/>
@@ -8962,8 +8976,8 @@
         <w:t xml:space="preserve">. Two minutes.</w:t>
       </w:r>
     </w:p>
-    <w:bookmarkEnd w:id="61"/>
-    <w:bookmarkStart w:id="62" w:name="updating-frugal-flock-itself"/>
+    <w:bookmarkEnd w:id="62"/>
+    <w:bookmarkStart w:id="63" w:name="updating-frugal-flock-itself"/>
     <w:p>
       <w:pPr>
         <w:pStyle w:val="Heading3"/>
@@ -8974,13 +8988,48 @@
     </w:p>
     <w:p>
       <w:pPr>
+        <w:pStyle w:val="FirstParagraph"/>
+      </w:pPr>
+      <w:r>
+        <w:t xml:space="preserve">Open a terminal inside your existing clone. Its local folder may still be</w:t>
+      </w:r>
+      <w:r>
+        <w:t xml:space="preserve"> </w:t>
+      </w:r>
+      <w:r>
+        <w:t xml:space="preserve">called</w:t>
+      </w:r>
+      <w:r>
+        <w:t xml:space="preserve"> </w:t>
+      </w:r>
+      <w:r>
+        <w:rPr>
+          <w:rStyle w:val="VerbatimChar"/>
+        </w:rPr>
+        <w:t xml:space="preserve">agentteam-docs</w:t>
+      </w:r>
+      <w:r>
+        <w:t xml:space="preserve">; it does not need to be renamed.</w:t>
+      </w:r>
+    </w:p>
+    <w:p>
+      <w:pPr>
         <w:pStyle w:val="SourceCode"/>
       </w:pPr>
       <w:r>
         <w:rPr>
           <w:rStyle w:val="VerbatimChar"/>
         </w:rPr>
-        <w:t xml:space="preserve">$ cd agentteam-docs &amp;&amp; git pull</w:t>
+        <w:t xml:space="preserve">$ git remote set-url origin https://github.com/danielmevit/frugal-flock.git</w:t>
+      </w:r>
+      <w:r>
+        <w:br/>
+      </w:r>
+      <w:r>
+        <w:rPr>
+          <w:rStyle w:val="VerbatimChar"/>
+        </w:rPr>
+        <w:t xml:space="preserve">$ git pull --ff-only</w:t>
       </w:r>
       <w:r>
         <w:br/>
@@ -8998,7 +9047,7 @@
         <w:rPr>
           <w:rStyle w:val="VerbatimChar"/>
         </w:rPr>
-        <w:t xml:space="preserve">$ frugal-flock selftest            # 27 checks, zero quota</w:t>
+        <w:t xml:space="preserve">$ frugal-flock selftest            # mock-agent checks, zero quota</w:t>
       </w:r>
       <w:r>
         <w:br/>
@@ -9015,6 +9064,20 @@
         <w:pStyle w:val="FirstParagraph"/>
       </w:pPr>
       <w:r>
+        <w:t xml:space="preserve">If Git reports a conflict or diverged history, stop and resolve it before</w:t>
+      </w:r>
+      <w:r>
+        <w:t xml:space="preserve"> </w:t>
+      </w:r>
+      <w:r>
+        <w:t xml:space="preserve">reinstalling; do not discard local work to force the update.</w:t>
+      </w:r>
+    </w:p>
+    <w:p>
+      <w:pPr>
+        <w:pStyle w:val="BodyText"/>
+      </w:pPr>
+      <w:r>
         <w:t xml:space="preserve">Existing projects keep their old role cards; re-running</w:t>
       </w:r>
       <w:r>
@@ -9045,8 +9108,8 @@
         <w:t xml:space="preserve">hand if you want them.</w:t>
       </w:r>
     </w:p>
-    <w:bookmarkEnd w:id="62"/>
-    <w:bookmarkStart w:id="63" w:name="backups-standing-policy"/>
+    <w:bookmarkEnd w:id="63"/>
+    <w:bookmarkStart w:id="64" w:name="backups-standing-policy"/>
     <w:p>
       <w:pPr>
         <w:pStyle w:val="Heading3"/>
@@ -9118,9 +9181,9 @@
         </w:pict>
       </w:r>
     </w:p>
-    <w:bookmarkEnd w:id="63"/>
     <w:bookmarkEnd w:id="64"/>
-    <w:bookmarkStart w:id="71" w:name="troubleshooting"/>
+    <w:bookmarkEnd w:id="65"/>
+    <w:bookmarkStart w:id="72" w:name="troubleshooting"/>
     <w:p>
       <w:pPr>
         <w:pStyle w:val="Heading2"/>
@@ -9129,7 +9192,7 @@
         <w:t xml:space="preserve">14. Troubleshooting</w:t>
       </w:r>
     </w:p>
-    <w:bookmarkStart w:id="65" w:name="the-universal-4-step-diagnosis"/>
+    <w:bookmarkStart w:id="66" w:name="the-universal-4-step-diagnosis"/>
     <w:p>
       <w:pPr>
         <w:pStyle w:val="Heading3"/>
@@ -9316,8 +9379,8 @@
         <w:t xml:space="preserve">— the problem is an agent, a login, or a task file.</w:t>
       </w:r>
     </w:p>
-    <w:bookmarkEnd w:id="65"/>
-    <w:bookmarkStart w:id="66" w:name="install-and-setup-problems"/>
+    <w:bookmarkEnd w:id="66"/>
+    <w:bookmarkStart w:id="67" w:name="install-and-setup-problems"/>
     <w:p>
       <w:pPr>
         <w:pStyle w:val="Heading3"/>
@@ -9746,8 +9809,8 @@
         </w:tc>
       </w:tr>
     </w:tbl>
-    <w:bookmarkEnd w:id="66"/>
-    <w:bookmarkStart w:id="67" w:name="agent-problems"/>
+    <w:bookmarkEnd w:id="67"/>
+    <w:bookmarkStart w:id="68" w:name="agent-problems"/>
     <w:p>
       <w:pPr>
         <w:pStyle w:val="Heading3"/>
@@ -10056,8 +10119,8 @@
         </w:tc>
       </w:tr>
     </w:tbl>
-    <w:bookmarkEnd w:id="67"/>
-    <w:bookmarkStart w:id="68" w:name="run-problems"/>
+    <w:bookmarkEnd w:id="68"/>
+    <w:bookmarkStart w:id="69" w:name="run-problems"/>
     <w:p>
       <w:pPr>
         <w:pStyle w:val="Heading3"/>
@@ -10363,8 +10426,8 @@
         </w:tc>
       </w:tr>
     </w:tbl>
-    <w:bookmarkEnd w:id="68"/>
-    <w:bookmarkStart w:id="69" w:name="gate-problems-verify-diff-merge"/>
+    <w:bookmarkEnd w:id="69"/>
+    <w:bookmarkStart w:id="70" w:name="gate-problems-verify-diff-merge"/>
     <w:p>
       <w:pPr>
         <w:pStyle w:val="Heading3"/>
@@ -10712,8 +10775,8 @@
         </w:tc>
       </w:tr>
     </w:tbl>
-    <w:bookmarkEnd w:id="69"/>
-    <w:bookmarkStart w:id="70" w:name="emergency"/>
+    <w:bookmarkEnd w:id="70"/>
+    <w:bookmarkStart w:id="71" w:name="emergency"/>
     <w:p>
       <w:pPr>
         <w:pStyle w:val="Heading3"/>
@@ -10832,9 +10895,9 @@
         </w:pict>
       </w:r>
     </w:p>
-    <w:bookmarkEnd w:id="70"/>
     <w:bookmarkEnd w:id="71"/>
-    <w:bookmarkStart w:id="72" w:name="command-reference-all-commands"/>
+    <w:bookmarkEnd w:id="72"/>
+    <w:bookmarkStart w:id="73" w:name="command-reference-all-commands"/>
     <w:p>
       <w:pPr>
         <w:pStyle w:val="Heading2"/>
@@ -11949,8 +12012,8 @@
         </w:pict>
       </w:r>
     </w:p>
-    <w:bookmarkEnd w:id="72"/>
-    <w:bookmarkStart w:id="73" w:name="settings-reference-environment-variables"/>
+    <w:bookmarkEnd w:id="73"/>
+    <w:bookmarkStart w:id="74" w:name="settings-reference-environment-variables"/>
     <w:p>
       <w:pPr>
         <w:pStyle w:val="Heading2"/>
@@ -12479,8 +12542,8 @@
         </w:pict>
       </w:r>
     </w:p>
-    <w:bookmarkEnd w:id="73"/>
-    <w:bookmarkStart w:id="74" w:name="Xf610a011b9fbf7d21735c699f3813ef93303206"/>
+    <w:bookmarkEnd w:id="74"/>
+    <w:bookmarkStart w:id="75" w:name="Xf610a011b9fbf7d21735c699f3813ef93303206"/>
     <w:p>
       <w:pPr>
         <w:pStyle w:val="Heading2"/>
@@ -12756,8 +12819,8 @@
         </w:pict>
       </w:r>
     </w:p>
-    <w:bookmarkEnd w:id="74"/>
-    <w:bookmarkStart w:id="75" w:name="glossary"/>
+    <w:bookmarkEnd w:id="75"/>
+    <w:bookmarkStart w:id="76" w:name="glossary"/>
     <w:p>
       <w:pPr>
         <w:pStyle w:val="Heading2"/>
@@ -13685,8 +13748,8 @@
         </w:pict>
       </w:r>
     </w:p>
-    <w:bookmarkEnd w:id="75"/>
-    <w:bookmarkStart w:id="76" w:name="cheat-sheet-one-page"/>
+    <w:bookmarkEnd w:id="76"/>
+    <w:bookmarkStart w:id="77" w:name="cheat-sheet-one-page"/>
     <w:p>
       <w:pPr>
         <w:pStyle w:val="Heading2"/>
@@ -13857,8 +13920,8 @@
         </w:pict>
       </w:r>
     </w:p>
-    <w:bookmarkEnd w:id="76"/>
-    <w:bookmarkStart w:id="77" w:name="X86d3f2e3bdb119205e7ebdcca33a798a227f72c"/>
+    <w:bookmarkEnd w:id="77"/>
+    <w:bookmarkStart w:id="78" w:name="X86d3f2e3bdb119205e7ebdcca33a798a227f72c"/>
     <w:p>
       <w:pPr>
         <w:pStyle w:val="Heading2"/>
@@ -14355,8 +14418,8 @@
         </w:pict>
       </w:r>
     </w:p>
-    <w:bookmarkEnd w:id="77"/>
-    <w:bookmarkStart w:id="78" w:name="Xd2ce53bacab742f5947582be0741bf8aab6d7fa"/>
+    <w:bookmarkEnd w:id="78"/>
+    <w:bookmarkStart w:id="79" w:name="Xd2ce53bacab742f5947582be0741bf8aab6d7fa"/>
     <w:p>
       <w:pPr>
         <w:pStyle w:val="Heading2"/>
@@ -14695,8 +14758,8 @@
         </w:tc>
       </w:tr>
     </w:tbl>
-    <w:bookmarkEnd w:id="78"/>
     <w:bookmarkEnd w:id="79"/>
+    <w:bookmarkEnd w:id="80"/>
     <w:sectPr>
       <w:footerReference w:type="default" r:id="rId9"/>
       <w:footnotePr>

</xml_diff>

<commit_message>
FF-QUALITY: checkpoint strict verification and failure propagation
</commit_message>
<xml_diff>
--- a/docs/GUIDEBOOK.docx
+++ b/docs/GUIDEBOOK.docx
@@ -6262,7 +6262,13 @@
         <w:t xml:space="preserve"> </w:t>
       </w:r>
       <w:r>
-        <w:t xml:space="preserve">enforced. Fix the task file next time.</w:t>
+        <w:t xml:space="preserve">enforced. Verification is incomplete; correct the task through the</w:t>
+      </w:r>
+      <w:r>
+        <w:t xml:space="preserve"> </w:t>
+      </w:r>
+      <w:r>
+        <w:t xml:space="preserve">lead’s task process and rerun. Do not treat it as permission to merge.</w:t>
       </w:r>
     </w:p>
     <w:p>
@@ -6385,19 +6391,46 @@
         <w:t xml:space="preserve"> </w:t>
       </w:r>
       <w:r>
-        <w:t xml:space="preserve">only if scope is not violated, no validate</w:t>
-      </w:r>
-      <w:r>
-        <w:t xml:space="preserve"> </w:t>
-      </w:r>
-      <w:r>
-        <w:t xml:space="preserve">command failed, and the run was not empty. The command’s exit code</w:t>
-      </w:r>
-      <w:r>
-        <w:t xml:space="preserve"> </w:t>
-      </w:r>
-      <w:r>
-        <w:t xml:space="preserve">matches, so the foreman can script on it.</w:t>
+        <w:t xml:space="preserve">(exit 0) requires scope, at least one Validate</w:t>
+      </w:r>
+      <w:r>
+        <w:t xml:space="preserve"> </w:t>
+      </w:r>
+      <w:r>
+        <w:t xml:space="preserve">command, every check passing, and the existing scope/tamper/empty/base</w:t>
+      </w:r>
+      <w:r>
+        <w:t xml:space="preserve"> </w:t>
+      </w:r>
+      <w:r>
+        <w:t xml:space="preserve">safeguards satisfied. Missing scope or checks is</w:t>
+      </w:r>
+      <w:r>
+        <w:t xml:space="preserve"> </w:t>
+      </w:r>
+      <w:r>
+        <w:rPr>
+          <w:rStyle w:val="VerbatimChar"/>
+        </w:rPr>
+        <w:t xml:space="preserve">INCOMPLETE</w:t>
+      </w:r>
+      <w:r>
+        <w:t xml:space="preserve"> </w:t>
+      </w:r>
+      <w:r>
+        <w:t xml:space="preserve">(exit 2).</w:t>
+      </w:r>
+      <w:r>
+        <w:t xml:space="preserve"> </w:t>
+      </w:r>
+      <w:r>
+        <w:t xml:space="preserve">Actual failures take precedence and return nonzero, normally exit 1.</w:t>
+      </w:r>
+      <w:r>
+        <w:t xml:space="preserve"> </w:t>
+      </w:r>
+      <w:r>
+        <w:t xml:space="preserve">M1 provides no waiver bypass.</w:t>
       </w:r>
     </w:p>
     <w:p>
@@ -6426,7 +6459,19 @@
         <w:t xml:space="preserve"> </w:t>
       </w:r>
       <w:r>
-        <w:t xml:space="preserve">automatically — background work comes back pre-judged.</w:t>
+        <w:t xml:space="preserve">automatically. A successful worker followed by failed or incomplete</w:t>
+      </w:r>
+      <w:r>
+        <w:t xml:space="preserve"> </w:t>
+      </w:r>
+      <w:r>
+        <w:t xml:space="preserve">verification returns the verification’s nonzero exit. A failed worker</w:t>
+      </w:r>
+      <w:r>
+        <w:t xml:space="preserve"> </w:t>
+      </w:r>
+      <w:r>
+        <w:t xml:space="preserve">keeps its own exit. This is not reviewer approval or human acceptance.</w:t>
       </w:r>
     </w:p>
     <w:bookmarkEnd w:id="41"/>
@@ -10502,16 +10547,7 @@
               <w:pStyle w:val="Compact"/>
             </w:pPr>
             <w:r>
-              <w:t xml:space="preserve">The worker left its lane. Reject the branch (</w:t>
-            </w:r>
-            <w:r>
-              <w:rPr>
-                <w:rStyle w:val="VerbatimChar"/>
-              </w:rPr>
-              <w:t xml:space="preserve">git -C ../wt/&lt;w&gt; reset --hard dev</w:t>
-            </w:r>
-            <w:r>
-              <w:t xml:space="preserve">), have the foreman re-brief with corrected scope. Never merge a violating diff as-is.</w:t>
+              <w:t xml:space="preserve">The worker left its lane. Preserve the branch for inspection and ask the foreman for a scoped repair task. Never merge a violating diff as-is.</w:t>
             </w:r>
           </w:p>
         </w:tc>
@@ -10544,22 +10580,31 @@
               <w:pStyle w:val="Compact"/>
             </w:pPr>
             <w:r>
-              <w:t xml:space="preserve">The task file had no</w:t>
-            </w:r>
-            <w:r>
-              <w:t xml:space="preserve"> </w:t>
-            </w:r>
-            <w:r>
-              <w:rPr>
-                <w:rStyle w:val="VerbatimChar"/>
-              </w:rPr>
-              <w:t xml:space="preserve">- path</w:t>
-            </w:r>
-            <w:r>
-              <w:t xml:space="preserve"> </w:t>
-            </w:r>
-            <w:r>
-              <w:t xml:space="preserve">lines. Nothing broke, but nothing was enforced — fix the task template habit.</w:t>
+              <w:t xml:space="preserve">The task had no scope lines: INCOMPLETE, exit 2 unless another failure takes precedence. Correct the task through the lead and rerun; it is not PASS.</w:t>
+            </w:r>
+          </w:p>
+        </w:tc>
+      </w:tr>
+      <w:tr>
+        <w:tc>
+          <w:tcPr/>
+          <w:p>
+            <w:pPr>
+              <w:pStyle w:val="Compact"/>
+            </w:pPr>
+            <w:r>
+              <w:t xml:space="preserve">verify: no Validate commands</w:t>
+            </w:r>
+          </w:p>
+        </w:tc>
+        <w:tc>
+          <w:tcPr/>
+          <w:p>
+            <w:pPr>
+              <w:pStyle w:val="Compact"/>
+            </w:pPr>
+            <w:r>
+              <w:t xml:space="preserve">INCOMPLETE, exit 2 unless another failure takes precedence. Define the required check explicitly and rerun; no waiver bypass exists.</w:t>
             </w:r>
           </w:p>
         </w:tc>
@@ -12340,7 +12385,7 @@
               <w:t xml:space="preserve"> </w:t>
             </w:r>
             <w:r>
-              <w:t xml:space="preserve">= every run appends its own verify verdict when it finishes.</w:t>
+              <w:t xml:space="preserve">= append verify verdict; a successful worker plus failed/incomplete checks returns nonzero.</w:t>
             </w:r>
           </w:p>
         </w:tc>

</xml_diff>

<commit_message>
Rename Frugal Flock to Unio in current docs, update Word manuals
</commit_message>
<xml_diff>
--- a/docs/GUIDEBOOK.docx
+++ b/docs/GUIDEBOOK.docx
@@ -28,13 +28,13 @@
         </w:p>
       </w:sdtContent>
     </w:sdt>
-    <w:bookmarkStart w:id="81" w:name="frugal-flock-the-complete-guidebook"/>
+    <w:bookmarkStart w:id="81" w:name="unio-the-complete-guidebook"/>
     <w:p>
       <w:pPr>
         <w:pStyle w:val="Heading1"/>
       </w:pPr>
       <w:r>
-        <w:t xml:space="preserve">Frugal Flock — The Complete Guidebook</w:t>
+        <w:t xml:space="preserve">Unio — The Complete Guidebook</w:t>
       </w:r>
     </w:p>
     <w:p>
@@ -127,7 +127,7 @@
           <w:b/>
           <w:bCs/>
         </w:rPr>
-        <w:t xml:space="preserve">Covers Frugal Flock v0.3.1 plus the in-progress M1 quality changes (the runtime prints 0.4.0, which is not an accepted release) · written 2026-07-19, updated 2026-10-04 · for the complete beginner</w:t>
+        <w:t xml:space="preserve">Covers Unio v0.3.1 plus the in-progress M1 quality changes (the runtime prints 0.4.0, which is not an accepted release) · written 2026-07-19, updated 2026-10-04 · for the complete beginner</w:t>
       </w:r>
     </w:p>
     <w:p>
@@ -135,7 +135,7 @@
         <w:pStyle w:val="BodyText"/>
       </w:pPr>
       <w:r>
-        <w:t xml:space="preserve">This is the one book that explains everything: what Frugal Flock is, how to</w:t>
+        <w:t xml:space="preserve">This is the one book that explains everything: what Unio is, how to</w:t>
       </w:r>
       <w:r>
         <w:t xml:space="preserve"> </w:t>
@@ -197,7 +197,7 @@
           <w:b/>
           <w:bCs/>
         </w:rPr>
-        <w:t xml:space="preserve">Never used Frugal Flock before?</w:t>
+        <w:t xml:space="preserve">Never used Unio before?</w:t>
       </w:r>
       <w:r>
         <w:t xml:space="preserve"> </w:t>
@@ -321,7 +321,7 @@
         <w:rPr>
           <w:rStyle w:val="VerbatimChar"/>
         </w:rPr>
-        <w:t xml:space="preserve">$ frugal-flock status</w:t>
+        <w:t xml:space="preserve">$ unio status</w:t>
       </w:r>
     </w:p>
     <w:p>
@@ -364,13 +364,13 @@
       </w:r>
     </w:p>
     <w:bookmarkEnd w:id="9"/>
-    <w:bookmarkStart w:id="15" w:name="what-frugal-flock-is-and-what-it-is-not"/>
+    <w:bookmarkStart w:id="15" w:name="what-unio-is-and-what-it-is-not"/>
     <w:p>
       <w:pPr>
         <w:pStyle w:val="Heading2"/>
       </w:pPr>
       <w:r>
-        <w:t xml:space="preserve">2. What Frugal Flock is — and what it is not</w:t>
+        <w:t xml:space="preserve">2. What Unio is — and what it is not</w:t>
       </w:r>
     </w:p>
     <w:bookmarkStart w:id="10" w:name="the-idea-in-one-paragraph"/>
@@ -387,7 +387,7 @@
         <w:pStyle w:val="FirstParagraph"/>
       </w:pPr>
       <w:r>
-        <w:t xml:space="preserve">Frugal Flock turns five separate AI coding subscriptions — Claude, Codex</w:t>
+        <w:t xml:space="preserve">Unio turns five separate AI coding subscriptions — Claude, Codex</w:t>
       </w:r>
       <w:r>
         <w:t xml:space="preserve"> </w:t>
@@ -465,7 +465,7 @@
         <w:t xml:space="preserve"> </w:t>
       </w:r>
       <w:r>
-        <w:t xml:space="preserve">who can accept work into the real codebase. Frugal Flock itself is the</w:t>
+        <w:t xml:space="preserve">who can accept work into the real codebase. Unio itself is the</w:t>
       </w:r>
       <w:r>
         <w:t xml:space="preserve"> </w:t>
@@ -483,7 +483,7 @@
         <w:t xml:space="preserve"> </w:t>
       </w:r>
       <w:r>
-        <w:t xml:space="preserve">The intelligence is rented from your subscriptions; Frugal Flock only</w:t>
+        <w:t xml:space="preserve">The intelligence is rented from your subscriptions; Unio only</w:t>
       </w:r>
       <w:r>
         <w:t xml:space="preserve"> </w:t>
@@ -649,7 +649,7 @@
         <w:t xml:space="preserve"> </w:t>
       </w:r>
       <w:r>
-        <w:t xml:space="preserve">flat monthly subscription. Frugal Flock is built entirely on logins.</w:t>
+        <w:t xml:space="preserve">flat monthly subscription. Unio is built entirely on logins.</w:t>
       </w:r>
     </w:p>
     <w:p>
@@ -801,7 +801,7 @@
         <w:rPr>
           <w:rStyle w:val="VerbatimChar"/>
         </w:rPr>
-        <w:t xml:space="preserve">frugal-flock verify</w:t>
+        <w:t xml:space="preserve">unio verify</w:t>
       </w:r>
       <w:r>
         <w:t xml:space="preserve">) reads the receipts for you first.</w:t>
@@ -1243,7 +1243,7 @@
         <w:rPr>
           <w:rStyle w:val="VerbatimChar"/>
         </w:rPr>
-        <w:t xml:space="preserve"> FOREMAN: machine-checks first (frugal-flock verify), reads the diffs, recommends</w:t>
+        <w:t xml:space="preserve"> FOREMAN: machine-checks first (unio verify), reads the diffs, recommends</w:t>
       </w:r>
       <w:r>
         <w:br/>
@@ -1313,7 +1313,7 @@
         <w:rPr>
           <w:rStyle w:val="VerbatimChar"/>
         </w:rPr>
-        <w:t xml:space="preserve">frugal-flock init</w:t>
+        <w:t xml:space="preserve">unio init</w:t>
       </w:r>
       <w:r>
         <w:t xml:space="preserve"> </w:t>
@@ -1328,7 +1328,7 @@
         <w:rPr>
           <w:rStyle w:val="VerbatimChar"/>
         </w:rPr>
-        <w:t xml:space="preserve">frugal-flock new</w:t>
+        <w:t xml:space="preserve">unio new</w:t>
       </w:r>
       <w:r>
         <w:t xml:space="preserve">) builds this next to any repository</w:t>
@@ -1846,7 +1846,7 @@
               <w:rPr>
                 <w:rStyle w:val="VerbatimChar"/>
               </w:rPr>
-              <w:t xml:space="preserve">frugal-flock score</w:t>
+              <w:t xml:space="preserve">unio score</w:t>
             </w:r>
             <w:r>
               <w:t xml:space="preserve"> </w:t>
@@ -1967,7 +1967,7 @@
         <w:rPr>
           <w:rStyle w:val="VerbatimChar"/>
         </w:rPr>
-        <w:t xml:space="preserve">frugal-flock result</w:t>
+        <w:t xml:space="preserve">unio result</w:t>
       </w:r>
       <w:r>
         <w:t xml:space="preserve"> </w:t>
@@ -1997,7 +1997,7 @@
         <w:rPr>
           <w:rStyle w:val="VerbatimChar"/>
         </w:rPr>
-        <w:t xml:space="preserve">frugal-flock handoff</w:t>
+        <w:t xml:space="preserve">unio handoff</w:t>
       </w:r>
       <w:r>
         <w:t xml:space="preserve">.</w:t>
@@ -2021,7 +2021,7 @@
         <w:rPr>
           <w:rStyle w:val="VerbatimChar"/>
         </w:rPr>
-        <w:t xml:space="preserve">frugal-flock init</w:t>
+        <w:t xml:space="preserve">unio init</w:t>
       </w:r>
       <w:r>
         <w:t xml:space="preserve"> </w:t>
@@ -2173,7 +2173,7 @@
         <w:pStyle w:val="FirstParagraph"/>
       </w:pPr>
       <w:r>
-        <w:t xml:space="preserve">If your repository already has its own hooks, Frugal Flock leaves them</w:t>
+        <w:t xml:space="preserve">If your repository already has its own hooks, Unio leaves them</w:t>
       </w:r>
       <w:r>
         <w:t xml:space="preserve"> </w:t>
@@ -2339,13 +2339,13 @@
       </w:r>
     </w:p>
     <w:bookmarkEnd w:id="20"/>
-    <w:bookmarkStart w:id="22" w:name="install-frugal-flock-itself"/>
+    <w:bookmarkStart w:id="22" w:name="install-unio-itself"/>
     <w:p>
       <w:pPr>
         <w:pStyle w:val="Heading3"/>
       </w:pPr>
       <w:r>
-        <w:t xml:space="preserve">4.2 Install Frugal Flock itself</w:t>
+        <w:t xml:space="preserve">4.2 Install Unio itself</w:t>
       </w:r>
     </w:p>
     <w:p>
@@ -2363,7 +2363,7 @@
           <w:rPr>
             <w:rStyle w:val="Hyperlink"/>
           </w:rPr>
-          <w:t xml:space="preserve">Frugal Flock</w:t>
+          <w:t xml:space="preserve">Unio</w:t>
         </w:r>
       </w:hyperlink>
       <w:r>
@@ -2379,7 +2379,7 @@
         <w:rPr>
           <w:rStyle w:val="VerbatimChar"/>
         </w:rPr>
-        <w:t xml:space="preserve">agentteam-docs</w:t>
+        <w:t xml:space="preserve">unio-docs</w:t>
       </w:r>
       <w:r>
         <w:t xml:space="preserve">):</w:t>
@@ -2393,25 +2393,25 @@
         <w:rPr>
           <w:rStyle w:val="VerbatimChar"/>
         </w:rPr>
-        <w:t xml:space="preserve">$ bash frugal-flock-install.sh</w:t>
-      </w:r>
-      <w:r>
-        <w:br/>
-      </w:r>
-      <w:r>
-        <w:rPr>
-          <w:rStyle w:val="VerbatimChar"/>
-        </w:rPr>
-        <w:t xml:space="preserve">$ frugal-flock version</w:t>
-      </w:r>
-      <w:r>
-        <w:br/>
-      </w:r>
-      <w:r>
-        <w:rPr>
-          <w:rStyle w:val="VerbatimChar"/>
-        </w:rPr>
-        <w:t xml:space="preserve">Frugal Flock 0.3.1 (/home/you/.local/bin/frugal-flock)</w:t>
+        <w:t xml:space="preserve">$ bash unio-install.sh</w:t>
+      </w:r>
+      <w:r>
+        <w:br/>
+      </w:r>
+      <w:r>
+        <w:rPr>
+          <w:rStyle w:val="VerbatimChar"/>
+        </w:rPr>
+        <w:t xml:space="preserve">$ unio version</w:t>
+      </w:r>
+      <w:r>
+        <w:br/>
+      </w:r>
+      <w:r>
+        <w:rPr>
+          <w:rStyle w:val="VerbatimChar"/>
+        </w:rPr>
+        <w:t xml:space="preserve">Unio 0.3.1 (/home/you/.local/bin/unio)</w:t>
       </w:r>
       <w:r>
         <w:br/>
@@ -2429,7 +2429,7 @@
         <w:rPr>
           <w:rStyle w:val="VerbatimChar"/>
         </w:rPr>
-        <w:t xml:space="preserve">config: /home/you/.config/agentteam/agents.conf</w:t>
+        <w:t xml:space="preserve">config: /home/you/.config/unio/agents.conf</w:t>
       </w:r>
     </w:p>
     <w:p>
@@ -2538,7 +2538,7 @@
               <w:rPr>
                 <w:rStyle w:val="VerbatimChar"/>
               </w:rPr>
-              <w:t xml:space="preserve">~/.local/bin/agentteam</w:t>
+              <w:t xml:space="preserve">~/.local/bin/unio</w:t>
             </w:r>
           </w:p>
         </w:tc>
@@ -2565,7 +2565,7 @@
               <w:rPr>
                 <w:rStyle w:val="VerbatimChar"/>
               </w:rPr>
-              <w:t xml:space="preserve">~/.local/bin/frugal-flock</w:t>
+              <w:t xml:space="preserve">~/.local/bin/unio</w:t>
             </w:r>
             <w:r>
               <w:t xml:space="preserve">,</w:t>
@@ -2577,7 +2577,7 @@
               <w:rPr>
                 <w:rStyle w:val="VerbatimChar"/>
               </w:rPr>
-              <w:t xml:space="preserve">~/.local/bin/frgl-flc</w:t>
+              <w:t xml:space="preserve">~/.local/bin/unio</w:t>
             </w:r>
           </w:p>
         </w:tc>
@@ -2604,7 +2604,7 @@
               <w:rPr>
                 <w:rStyle w:val="VerbatimChar"/>
               </w:rPr>
-              <w:t xml:space="preserve">~/.config/agentteam/agents.conf</w:t>
+              <w:t xml:space="preserve">~/.config/unio/agents.conf</w:t>
             </w:r>
           </w:p>
         </w:tc>
@@ -2647,7 +2647,7 @@
               <w:rPr>
                 <w:rStyle w:val="VerbatimChar"/>
               </w:rPr>
-              <w:t xml:space="preserve">~/.config/agentteam/templates/</w:t>
+              <w:t xml:space="preserve">~/.config/unio/templates/</w:t>
             </w:r>
           </w:p>
         </w:tc>
@@ -2674,7 +2674,7 @@
               <w:rPr>
                 <w:rStyle w:val="VerbatimChar"/>
               </w:rPr>
-              <w:t xml:space="preserve">~/.config/agentteam/playbooks/</w:t>
+              <w:t xml:space="preserve">~/.config/unio/playbooks/</w:t>
             </w:r>
           </w:p>
         </w:tc>
@@ -2709,7 +2709,7 @@
               <w:rPr>
                 <w:rStyle w:val="VerbatimChar"/>
               </w:rPr>
-              <w:t xml:space="preserve">frugal-flock new</w:t>
+              <w:t xml:space="preserve">unio new</w:t>
             </w:r>
             <w:r>
               <w:t xml:space="preserve"> </w:t>
@@ -2731,7 +2731,7 @@
               <w:rPr>
                 <w:rStyle w:val="VerbatimChar"/>
               </w:rPr>
-              <w:t xml:space="preserve">~/.local/share/bash-completion/completions/agentteam</w:t>
+              <w:t xml:space="preserve">~/.local/share/bash-completion/completions/unio</w:t>
             </w:r>
           </w:p>
         </w:tc>
@@ -2751,7 +2751,7 @@
               <w:rPr>
                 <w:rStyle w:val="VerbatimChar"/>
               </w:rPr>
-              <w:t xml:space="preserve">frugal-flock</w:t>
+              <w:t xml:space="preserve">unio</w:t>
             </w:r>
             <w:r>
               <w:t xml:space="preserve"> </w:t>
@@ -2766,7 +2766,7 @@
               <w:rPr>
                 <w:rStyle w:val="VerbatimChar"/>
               </w:rPr>
-              <w:t xml:space="preserve">frgl-flc</w:t>
+              <w:t xml:space="preserve">unio</w:t>
             </w:r>
             <w:r>
               <w:t xml:space="preserve"> </w:t>
@@ -2792,7 +2792,7 @@
         <w:rPr>
           <w:rStyle w:val="VerbatimChar"/>
         </w:rPr>
-        <w:t xml:space="preserve">frugal-flock ru&lt;TAB&gt;</w:t>
+        <w:t xml:space="preserve">unio ru&lt;TAB&gt;</w:t>
       </w:r>
       <w:r>
         <w:t xml:space="preserve"> </w:t>
@@ -2813,7 +2813,7 @@
         <w:rPr>
           <w:rStyle w:val="VerbatimChar"/>
         </w:rPr>
-        <w:t xml:space="preserve">frugal-flock run &lt;TAB&gt;</w:t>
+        <w:t xml:space="preserve">unio run &lt;TAB&gt;</w:t>
       </w:r>
       <w:r>
         <w:t xml:space="preserve"> </w:t>
@@ -3312,7 +3312,7 @@
         <w:rPr>
           <w:rStyle w:val="VerbatimChar"/>
         </w:rPr>
-        <w:t xml:space="preserve">~/.config/agentteam/agents.conf</w:t>
+        <w:t xml:space="preserve">~/.config/unio/agents.conf</w:t>
       </w:r>
       <w:r>
         <w:t xml:space="preserve"> </w:t>
@@ -3417,7 +3417,7 @@
         <w:t xml:space="preserve"> </w:t>
       </w:r>
       <w:r>
-        <w:t xml:space="preserve">is filled in by Frugal Flock at run time.</w:t>
+        <w:t xml:space="preserve">is filled in by Unio at run time.</w:t>
       </w:r>
       <w:r>
         <w:t xml:space="preserve"> </w:t>
@@ -3519,7 +3519,7 @@
         <w:rPr>
           <w:rStyle w:val="VerbatimChar"/>
         </w:rPr>
-        <w:t xml:space="preserve">frugal-flock off</w:t>
+        <w:t xml:space="preserve">unio off</w:t>
       </w:r>
       <w:r>
         <w:t xml:space="preserve"> </w:t>
@@ -3546,16 +3546,16 @@
         <w:rPr>
           <w:rStyle w:val="VerbatimChar"/>
         </w:rPr>
-        <w:t xml:space="preserve">$ frugal-flock selftest</w:t>
-      </w:r>
-      <w:r>
-        <w:br/>
-      </w:r>
-      <w:r>
-        <w:rPr>
-          <w:rStyle w:val="VerbatimChar"/>
-        </w:rPr>
-        <w:t xml:space="preserve">== frugal-flock selftest — sandbox: /tmp/tmp.XXXX ==</w:t>
+        <w:t xml:space="preserve">$ unio selftest</w:t>
+      </w:r>
+      <w:r>
+        <w:br/>
+      </w:r>
+      <w:r>
+        <w:rPr>
+          <w:rStyle w:val="VerbatimChar"/>
+        </w:rPr>
+        <w:t xml:space="preserve">== unio selftest — sandbox: /tmp/tmp.XXXX ==</w:t>
       </w:r>
       <w:r>
         <w:br/>
@@ -3648,13 +3648,13 @@
         <w:t xml:space="preserve"> </w:t>
       </w:r>
       <w:r>
-        <w:t xml:space="preserve">it after every Frugal Flock update. If it is green, the machinery works and</w:t>
-      </w:r>
-      <w:r>
-        <w:t xml:space="preserve"> </w:t>
-      </w:r>
-      <w:r>
-        <w:t xml:space="preserve">any problem you hit later is an agent problem, not a Frugal Flock problem —</w:t>
+        <w:t xml:space="preserve">it after every Unio update. If it is green, the machinery works and</w:t>
+      </w:r>
+      <w:r>
+        <w:t xml:space="preserve"> </w:t>
+      </w:r>
+      <w:r>
+        <w:t xml:space="preserve">any problem you hit later is an agent problem, not a Unio problem —</w:t>
       </w:r>
       <w:r>
         <w:t xml:space="preserve"> </w:t>
@@ -3679,16 +3679,16 @@
         <w:rPr>
           <w:rStyle w:val="VerbatimChar"/>
         </w:rPr>
-        <w:t xml:space="preserve">$ frugal-flock agents      # is each binary installed? benched or on?</w:t>
-      </w:r>
-      <w:r>
-        <w:br/>
-      </w:r>
-      <w:r>
-        <w:rPr>
-          <w:rStyle w:val="VerbatimChar"/>
-        </w:rPr>
-        <w:t xml:space="preserve">$ frugal-flock smoke       # one tiny LIVE call per agent: OK / WARN / FAIL</w:t>
+        <w:t xml:space="preserve">$ unio agents      # is each binary installed? benched or on?</w:t>
+      </w:r>
+      <w:r>
+        <w:br/>
+      </w:r>
+      <w:r>
+        <w:rPr>
+          <w:rStyle w:val="VerbatimChar"/>
+        </w:rPr>
+        <w:t xml:space="preserve">$ unio smoke       # one tiny LIVE call per agent: OK / WARN / FAIL</w:t>
       </w:r>
     </w:p>
     <w:p>
@@ -3705,7 +3705,7 @@
         <w:rPr>
           <w:rStyle w:val="VerbatimChar"/>
         </w:rPr>
-        <w:t xml:space="preserve">frugal-flock doctor</w:t>
+        <w:t xml:space="preserve">unio doctor</w:t>
       </w:r>
       <w:r>
         <w:t xml:space="preserve"> </w:t>
@@ -3826,7 +3826,7 @@
         <w:rPr>
           <w:rStyle w:val="VerbatimChar"/>
         </w:rPr>
-        <w:t xml:space="preserve">$ bash examples/demo.sh /tmp/agentteam-demo</w:t>
+        <w:t xml:space="preserve">$ bash examples/demo.sh /tmp/unio-demo</w:t>
       </w:r>
     </w:p>
     <w:p>
@@ -3921,7 +3921,7 @@
         <w:rPr>
           <w:rStyle w:val="VerbatimChar"/>
         </w:rPr>
-        <w:t xml:space="preserve">$ frugal-flock new https://github.com/you/yourproject.git myproj</w:t>
+        <w:t xml:space="preserve">$ unio new https://github.com/you/yourproject.git myproj</w:t>
       </w:r>
     </w:p>
     <w:p>
@@ -3980,7 +3980,7 @@
         <w:rPr>
           <w:rStyle w:val="VerbatimChar"/>
         </w:rPr>
-        <w:t xml:space="preserve">frugal-flock init</w:t>
+        <w:t xml:space="preserve">unio init</w:t>
       </w:r>
       <w:r>
         <w:t xml:space="preserve"> </w:t>
@@ -4001,7 +4001,7 @@
         <w:rPr>
           <w:rStyle w:val="VerbatimChar"/>
         </w:rPr>
-        <w:t xml:space="preserve">~/.config/agentteam/playbooks/</w:t>
+        <w:t xml:space="preserve">~/.config/unio/playbooks/</w:t>
       </w:r>
       <w:r>
         <w:t xml:space="preserve"> </w:t>
@@ -4045,7 +4045,7 @@
         <w:rPr>
           <w:rStyle w:val="VerbatimChar"/>
         </w:rPr>
-        <w:t xml:space="preserve">start       : cd myproj/repo &amp;&amp; frugal-flock agents</w:t>
+        <w:t xml:space="preserve">start       : cd myproj/repo &amp;&amp; unio agents</w:t>
       </w:r>
     </w:p>
     <w:p>
@@ -4062,7 +4062,7 @@
         <w:rPr>
           <w:rStyle w:val="VerbatimChar"/>
         </w:rPr>
-        <w:t xml:space="preserve">frugal-flock new &lt;url&gt; myproj codex grok</w:t>
+        <w:t xml:space="preserve">unio new &lt;url&gt; myproj codex grok</w:t>
       </w:r>
       <w:r>
         <w:t xml:space="preserve">.</w:t>
@@ -4113,7 +4113,7 @@
         <w:rPr>
           <w:rStyle w:val="VerbatimChar"/>
         </w:rPr>
-        <w:t xml:space="preserve">$ frugal-flock init codex antigravity opencode grok</w:t>
+        <w:t xml:space="preserve">$ unio init codex antigravity opencode grok</w:t>
       </w:r>
     </w:p>
     <w:p>
@@ -4139,7 +4139,7 @@
         <w:rPr>
           <w:rStyle w:val="VerbatimChar"/>
         </w:rPr>
-        <w:t xml:space="preserve">frugal-flock init claude</w:t>
+        <w:t xml:space="preserve">unio init claude</w:t>
       </w:r>
       <w:r>
         <w:t xml:space="preserve"> </w:t>
@@ -4241,16 +4241,16 @@
         <w:rPr>
           <w:rStyle w:val="VerbatimChar"/>
         </w:rPr>
-        <w:t xml:space="preserve">frugal-flock: possible secrets tracked in git (above) — untrack/gitignore</w:t>
-      </w:r>
-      <w:r>
-        <w:br/>
-      </w:r>
-      <w:r>
-        <w:rPr>
-          <w:rStyle w:val="VerbatimChar"/>
-        </w:rPr>
-        <w:t xml:space="preserve">them first, or rerun with AGENTTEAM_ALLOW_SECRETS=1</w:t>
+        <w:t xml:space="preserve">unio: possible secrets tracked in git (above) — untrack/gitignore</w:t>
+      </w:r>
+      <w:r>
+        <w:br/>
+      </w:r>
+      <w:r>
+        <w:rPr>
+          <w:rStyle w:val="VerbatimChar"/>
+        </w:rPr>
+        <w:t xml:space="preserve">them first, or rerun with UNIO_ALLOW_SECRETS=1</w:t>
       </w:r>
     </w:p>
     <w:p>
@@ -4296,7 +4296,7 @@
         <w:rPr>
           <w:rStyle w:val="VerbatimChar"/>
         </w:rPr>
-        <w:t xml:space="preserve">$ frugal-flock init ...</w:t>
+        <w:t xml:space="preserve">$ unio init ...</w:t>
       </w:r>
     </w:p>
     <w:p>
@@ -5006,7 +5006,7 @@
         <w:rPr>
           <w:rStyle w:val="VerbatimChar"/>
         </w:rPr>
-        <w:t xml:space="preserve">frugal-flock verify</w:t>
+        <w:t xml:space="preserve">unio verify</w:t>
       </w:r>
       <w:r>
         <w:t xml:space="preserve"> </w:t>
@@ -5160,7 +5160,7 @@
         <w:rPr>
           <w:rStyle w:val="VerbatimChar"/>
         </w:rPr>
-        <w:t xml:space="preserve">frugal-flock verify</w:t>
+        <w:t xml:space="preserve">unio verify</w:t>
       </w:r>
       <w:r>
         <w:t xml:space="preserve"> </w:t>
@@ -5616,7 +5616,7 @@
         <w:rPr>
           <w:rStyle w:val="VerbatimChar"/>
         </w:rPr>
-        <w:t xml:space="preserve">$ frugal-flock run codex T7-codex</w:t>
+        <w:t xml:space="preserve">$ unio run codex T7-codex</w:t>
       </w:r>
       <w:r>
         <w:br/>
@@ -5643,7 +5643,7 @@
         <w:rPr>
           <w:rStyle w:val="VerbatimChar"/>
         </w:rPr>
-        <w:t xml:space="preserve">next: frugal-flock verify codex T7-codex   then: frugal-flock diff codex</w:t>
+        <w:t xml:space="preserve">next: unio verify codex T7-codex   then: unio diff codex</w:t>
       </w:r>
     </w:p>
     <w:p>
@@ -5651,7 +5651,7 @@
         <w:pStyle w:val="FirstParagraph"/>
       </w:pPr>
       <w:r>
-        <w:t xml:space="preserve">What happened: Frugal Flock checked the STOP switch, the agent’s bench</w:t>
+        <w:t xml:space="preserve">What happened: Unio checked the STOP switch, the agent’s bench</w:t>
       </w:r>
       <w:r>
         <w:t xml:space="preserve"> </w:t>
@@ -5672,7 +5672,7 @@
         <w:rPr>
           <w:rStyle w:val="VerbatimChar"/>
         </w:rPr>
-        <w:t xml:space="preserve">AGENTTEAM_AUTO_SYNC=1</w:t>
+        <w:t xml:space="preserve">UNIO_AUTO_SYNC=1</w:t>
       </w:r>
       <w:r>
         <w:t xml:space="preserve"> </w:t>
@@ -5720,7 +5720,7 @@
         <w:rPr>
           <w:rStyle w:val="VerbatimChar"/>
         </w:rPr>
-        <w:t xml:space="preserve">AGENTTEAM_TIMEOUT</w:t>
+        <w:t xml:space="preserve">UNIO_TIMEOUT</w:t>
       </w:r>
       <w:r>
         <w:t xml:space="preserve"> </w:t>
@@ -5836,16 +5836,16 @@
         <w:rPr>
           <w:rStyle w:val="VerbatimChar"/>
         </w:rPr>
-        <w:t xml:space="preserve">$ frugal-flock run -b antigravity T8-antigravity</w:t>
-      </w:r>
-      <w:r>
-        <w:br/>
-      </w:r>
-      <w:r>
-        <w:rPr>
-          <w:rStyle w:val="VerbatimChar"/>
-        </w:rPr>
-        <w:t xml:space="preserve">started in background — poll: frugal-flock status   live: frugal-flock tail T8-antigravity   abort: frugal-flock kill T8-antigravity</w:t>
+        <w:t xml:space="preserve">$ unio run -b antigravity T8-antigravity</w:t>
+      </w:r>
+      <w:r>
+        <w:br/>
+      </w:r>
+      <w:r>
+        <w:rPr>
+          <w:rStyle w:val="VerbatimChar"/>
+        </w:rPr>
+        <w:t xml:space="preserve">started in background — poll: unio status   live: unio tail T8-antigravity   abort: unio kill T8-antigravity</w:t>
       </w:r>
     </w:p>
     <w:p>
@@ -5860,7 +5860,7 @@
         <w:rPr>
           <w:rStyle w:val="VerbatimChar"/>
         </w:rPr>
-        <w:t xml:space="preserve">frugal-flock status</w:t>
+        <w:t xml:space="preserve">unio status</w:t>
       </w:r>
       <w:r>
         <w:t xml:space="preserve"> </w:t>
@@ -5924,7 +5924,7 @@
         <w:rPr>
           <w:rStyle w:val="VerbatimChar"/>
         </w:rPr>
-        <w:t xml:space="preserve">frugal-flock tail T8-antigravity</w:t>
+        <w:t xml:space="preserve">unio tail T8-antigravity</w:t>
       </w:r>
       <w:r>
         <w:t xml:space="preserve"> </w:t>
@@ -5960,7 +5960,7 @@
         <w:rPr>
           <w:rStyle w:val="VerbatimChar"/>
         </w:rPr>
-        <w:t xml:space="preserve">frugal-flock tail</w:t>
+        <w:t xml:space="preserve">unio tail</w:t>
       </w:r>
       <w:r>
         <w:t xml:space="preserve"> </w:t>
@@ -5987,7 +5987,7 @@
         <w:rPr>
           <w:rStyle w:val="VerbatimChar"/>
         </w:rPr>
-        <w:t xml:space="preserve">frugal-flock kill T8-antigravity</w:t>
+        <w:t xml:space="preserve">unio kill T8-antigravity</w:t>
       </w:r>
       <w:r>
         <w:t xml:space="preserve"> </w:t>
@@ -6259,16 +6259,16 @@
         <w:rPr>
           <w:rStyle w:val="VerbatimChar"/>
         </w:rPr>
-        <w:t xml:space="preserve">$ frugal-flock report T7-codex          # last 60 lines</w:t>
-      </w:r>
-      <w:r>
-        <w:br/>
-      </w:r>
-      <w:r>
-        <w:rPr>
-          <w:rStyle w:val="VerbatimChar"/>
-        </w:rPr>
-        <w:t xml:space="preserve">$ frugal-flock report T7-codex 200      # more history</w:t>
+        <w:t xml:space="preserve">$ unio report T7-codex          # last 60 lines</w:t>
+      </w:r>
+      <w:r>
+        <w:br/>
+      </w:r>
+      <w:r>
+        <w:rPr>
+          <w:rStyle w:val="VerbatimChar"/>
+        </w:rPr>
+        <w:t xml:space="preserve">$ unio report T7-codex 200      # more history</w:t>
       </w:r>
     </w:p>
     <w:bookmarkEnd w:id="40"/>
@@ -6304,7 +6304,7 @@
         <w:rPr>
           <w:rStyle w:val="VerbatimChar"/>
         </w:rPr>
-        <w:t xml:space="preserve">$ frugal-flock verify codex T7-codex</w:t>
+        <w:t xml:space="preserve">$ unio verify codex T7-codex</w:t>
       </w:r>
       <w:r>
         <w:br/>
@@ -6728,7 +6728,7 @@
         <w:rPr>
           <w:rStyle w:val="VerbatimChar"/>
         </w:rPr>
-        <w:t xml:space="preserve">AGENTTEAM_AUTO_VERIFY=1</w:t>
+        <w:t xml:space="preserve">UNIO_AUTO_VERIFY=1</w:t>
       </w:r>
       <w:r>
         <w:t xml:space="preserve"> </w:t>
@@ -6788,16 +6788,16 @@
         <w:rPr>
           <w:rStyle w:val="VerbatimChar"/>
         </w:rPr>
-        <w:t xml:space="preserve">$ frugal-flock diff codex --stat     # just the file list: your scope check</w:t>
-      </w:r>
-      <w:r>
-        <w:br/>
-      </w:r>
-      <w:r>
-        <w:rPr>
-          <w:rStyle w:val="VerbatimChar"/>
-        </w:rPr>
-        <w:t xml:space="preserve">$ frugal-flock diff codex            # every changed line: your real review</w:t>
+        <w:t xml:space="preserve">$ unio diff codex --stat     # just the file list: your scope check</w:t>
+      </w:r>
+      <w:r>
+        <w:br/>
+      </w:r>
+      <w:r>
+        <w:rPr>
+          <w:rStyle w:val="VerbatimChar"/>
+        </w:rPr>
+        <w:t xml:space="preserve">$ unio diff codex            # every changed line: your real review</w:t>
       </w:r>
     </w:p>
     <w:p>
@@ -6853,7 +6853,7 @@
         <w:rPr>
           <w:rStyle w:val="VerbatimChar"/>
         </w:rPr>
-        <w:t xml:space="preserve">$ frugal-flock review codex T7-codex</w:t>
+        <w:t xml:space="preserve">$ unio review codex T7-codex</w:t>
       </w:r>
     </w:p>
     <w:p>
@@ -6910,7 +6910,7 @@
         <w:t xml:space="preserve">VERDICT: REQUEST-CHANGES</w:t>
       </w:r>
       <w:r>
-        <w:t xml:space="preserve">. Frugal Flock picks the</w:t>
+        <w:t xml:space="preserve">. Unio picks the</w:t>
       </w:r>
       <w:r>
         <w:t xml:space="preserve"> </w:t>
@@ -7288,7 +7288,7 @@
         <w:rPr>
           <w:rStyle w:val="VerbatimChar"/>
         </w:rPr>
-        <w:t xml:space="preserve">$ frugal-flock sync</w:t>
+        <w:t xml:space="preserve">$ unio sync</w:t>
       </w:r>
       <w:r>
         <w:br/>
@@ -7516,16 +7516,16 @@
         <w:rPr>
           <w:rStyle w:val="VerbatimChar"/>
         </w:rPr>
-        <w:t xml:space="preserve">$ frugal-flock result codex T7-codex       # JSON on screen; changes nothing</w:t>
-      </w:r>
-      <w:r>
-        <w:br/>
-      </w:r>
-      <w:r>
-        <w:rPr>
-          <w:rStyle w:val="VerbatimChar"/>
-        </w:rPr>
-        <w:t xml:space="preserve">$ frugal-flock handoff codex T7-codex      # writes a packet, prints its folder</w:t>
+        <w:t xml:space="preserve">$ unio result codex T7-codex       # JSON on screen; changes nothing</w:t>
+      </w:r>
+      <w:r>
+        <w:br/>
+      </w:r>
+      <w:r>
+        <w:rPr>
+          <w:rStyle w:val="VerbatimChar"/>
+        </w:rPr>
+        <w:t xml:space="preserve">$ unio handoff codex T7-codex      # writes a packet, prints its folder</w:t>
       </w:r>
     </w:p>
     <w:p>
@@ -7832,7 +7832,7 @@
         <w:rPr>
           <w:rStyle w:val="VerbatimChar"/>
         </w:rPr>
-        <w:t xml:space="preserve">$ bash examples/demo.sh /tmp/agentteam-demo</w:t>
+        <w:t xml:space="preserve">$ bash examples/demo.sh /tmp/unio-demo</w:t>
       </w:r>
     </w:p>
     <w:p>
@@ -8005,25 +8005,25 @@
         <w:rPr>
           <w:rStyle w:val="VerbatimChar"/>
         </w:rPr>
-        <w:t xml:space="preserve">$ frugal-flock status          # where did I leave off? benched agents? queue?</w:t>
-      </w:r>
-      <w:r>
-        <w:br/>
-      </w:r>
-      <w:r>
-        <w:rPr>
-          <w:rStyle w:val="VerbatimChar"/>
-        </w:rPr>
-        <w:t xml:space="preserve">$ frugal-flock doctor          # anything that would waste a run? (base, agents, stale)</w:t>
-      </w:r>
-      <w:r>
-        <w:br/>
-      </w:r>
-      <w:r>
-        <w:rPr>
-          <w:rStyle w:val="VerbatimChar"/>
-        </w:rPr>
-        <w:t xml:space="preserve">$ frugal-flock smoke           # after CLI updates or days away</w:t>
+        <w:t xml:space="preserve">$ unio status          # where did I leave off? benched agents? queue?</w:t>
+      </w:r>
+      <w:r>
+        <w:br/>
+      </w:r>
+      <w:r>
+        <w:rPr>
+          <w:rStyle w:val="VerbatimChar"/>
+        </w:rPr>
+        <w:t xml:space="preserve">$ unio doctor          # anything that would waste a run? (base, agents, stale)</w:t>
+      </w:r>
+      <w:r>
+        <w:br/>
+      </w:r>
+      <w:r>
+        <w:rPr>
+          <w:rStyle w:val="VerbatimChar"/>
+        </w:rPr>
+        <w:t xml:space="preserve">$ unio smoke           # after CLI updates or days away</w:t>
       </w:r>
       <w:r>
         <w:br/>
@@ -8298,16 +8298,16 @@
         <w:rPr>
           <w:rStyle w:val="VerbatimChar"/>
         </w:rPr>
-        <w:t xml:space="preserve">$ frugal-flock status      # 1. "running: (none)" — never leave -b runs going</w:t>
-      </w:r>
-      <w:r>
-        <w:br/>
-      </w:r>
-      <w:r>
-        <w:rPr>
-          <w:rStyle w:val="VerbatimChar"/>
-        </w:rPr>
-        <w:t xml:space="preserve">                        #    (stragglers: frugal-flock kill &lt;task&gt;)</w:t>
+        <w:t xml:space="preserve">$ unio status      # 1. "running: (none)" — never leave -b runs going</w:t>
+      </w:r>
+      <w:r>
+        <w:br/>
+      </w:r>
+      <w:r>
+        <w:rPr>
+          <w:rStyle w:val="VerbatimChar"/>
+        </w:rPr>
+        <w:t xml:space="preserve">                        #    (stragglers: unio kill &lt;task&gt;)</w:t>
       </w:r>
     </w:p>
     <w:p>
@@ -8345,7 +8345,7 @@
         <w:rPr>
           <w:rStyle w:val="VerbatimChar"/>
         </w:rPr>
-        <w:t xml:space="preserve">frugal-flock score</w:t>
+        <w:t xml:space="preserve">unio score</w:t>
       </w:r>
       <w:r>
         <w:t xml:space="preserve"> </w:t>
@@ -8625,7 +8625,7 @@
               <w:rPr>
                 <w:rStyle w:val="VerbatimChar"/>
               </w:rPr>
-              <w:t xml:space="preserve">~/.config/agentteam/off/</w:t>
+              <w:t xml:space="preserve">~/.config/unio/off/</w:t>
             </w:r>
             <w:r>
               <w:t xml:space="preserve">)</w:t>
@@ -8657,7 +8657,7 @@
         <w:pStyle w:val="FirstParagraph"/>
       </w:pPr>
       <w:r>
-        <w:t xml:space="preserve">Subscriptions have 5-hour windows and weekly caps. Frugal Flock treats that</w:t>
+        <w:t xml:space="preserve">Subscriptions have 5-hour windows and weekly caps. Unio treats that</w:t>
       </w:r>
       <w:r>
         <w:t xml:space="preserve"> </w:t>
@@ -8674,52 +8674,52 @@
         <w:rPr>
           <w:rStyle w:val="VerbatimChar"/>
         </w:rPr>
-        <w:t xml:space="preserve">$ frugal-flock off codex 5h     # window burned: benched, auto-returns in 5h</w:t>
-      </w:r>
-      <w:r>
-        <w:br/>
-      </w:r>
-      <w:r>
-        <w:rPr>
-          <w:rStyle w:val="VerbatimChar"/>
-        </w:rPr>
-        <w:t xml:space="preserve">$ frugal-flock off grok 7d      # weekly cap: benched for a week</w:t>
-      </w:r>
-      <w:r>
-        <w:br/>
-      </w:r>
-      <w:r>
-        <w:rPr>
-          <w:rStyle w:val="VerbatimChar"/>
-        </w:rPr>
-        <w:t xml:space="preserve">$ frugal-flock off opencode     # benched until you say otherwise</w:t>
-      </w:r>
-      <w:r>
-        <w:br/>
-      </w:r>
-      <w:r>
-        <w:rPr>
-          <w:rStyle w:val="VerbatimChar"/>
-        </w:rPr>
-        <w:t xml:space="preserve">$ frugal-flock on codex         # manual return anytime</w:t>
-      </w:r>
-      <w:r>
-        <w:br/>
-      </w:r>
-      <w:r>
-        <w:rPr>
-          <w:rStyle w:val="VerbatimChar"/>
-        </w:rPr>
-        <w:t xml:space="preserve">$ frugal-flock agents           # installed? on/OFF, with your chosen retry time</w:t>
-      </w:r>
-      <w:r>
-        <w:br/>
-      </w:r>
-      <w:r>
-        <w:rPr>
-          <w:rStyle w:val="VerbatimChar"/>
-        </w:rPr>
-        <w:t xml:space="preserve">$ frugal-flock agents --json    # the same, machine-readable</w:t>
+        <w:t xml:space="preserve">$ unio off codex 5h     # window burned: benched, auto-returns in 5h</w:t>
+      </w:r>
+      <w:r>
+        <w:br/>
+      </w:r>
+      <w:r>
+        <w:rPr>
+          <w:rStyle w:val="VerbatimChar"/>
+        </w:rPr>
+        <w:t xml:space="preserve">$ unio off grok 7d      # weekly cap: benched for a week</w:t>
+      </w:r>
+      <w:r>
+        <w:br/>
+      </w:r>
+      <w:r>
+        <w:rPr>
+          <w:rStyle w:val="VerbatimChar"/>
+        </w:rPr>
+        <w:t xml:space="preserve">$ unio off opencode     # benched until you say otherwise</w:t>
+      </w:r>
+      <w:r>
+        <w:br/>
+      </w:r>
+      <w:r>
+        <w:rPr>
+          <w:rStyle w:val="VerbatimChar"/>
+        </w:rPr>
+        <w:t xml:space="preserve">$ unio on codex         # manual return anytime</w:t>
+      </w:r>
+      <w:r>
+        <w:br/>
+      </w:r>
+      <w:r>
+        <w:rPr>
+          <w:rStyle w:val="VerbatimChar"/>
+        </w:rPr>
+        <w:t xml:space="preserve">$ unio agents           # installed? on/OFF, with your chosen retry time</w:t>
+      </w:r>
+      <w:r>
+        <w:br/>
+      </w:r>
+      <w:r>
+        <w:rPr>
+          <w:rStyle w:val="VerbatimChar"/>
+        </w:rPr>
+        <w:t xml:space="preserve">$ unio agents --json    # the same, machine-readable</w:t>
       </w:r>
     </w:p>
     <w:p>
@@ -8873,7 +8873,7 @@
         <w:t xml:space="preserve">“resets at”</w:t>
       </w:r>
       <w:r>
-        <w:t xml:space="preserve">…), Frugal Flock prints</w:t>
+        <w:t xml:space="preserve">…), Unio prints</w:t>
       </w:r>
       <w:r>
         <w:t xml:space="preserve"> </w:t>
@@ -8888,7 +8888,7 @@
         <w:rPr>
           <w:rStyle w:val="VerbatimChar"/>
         </w:rPr>
-        <w:t xml:space="preserve">AGENTTEAM_AUTO_OFF=1</w:t>
+        <w:t xml:space="preserve">UNIO_AUTO_OFF=1</w:t>
       </w:r>
       <w:r>
         <w:t xml:space="preserve"> </w:t>
@@ -9024,7 +9024,7 @@
         <w:rPr>
           <w:rStyle w:val="VerbatimChar"/>
         </w:rPr>
-        <w:t xml:space="preserve">frugal-flock doctor</w:t>
+        <w:t xml:space="preserve">unio doctor</w:t>
       </w:r>
       <w:r>
         <w:t xml:space="preserve"> </w:t>
@@ -9050,7 +9050,7 @@
         <w:t xml:space="preserve">11. Fleet intelligence — who earns their seat</w:t>
       </w:r>
     </w:p>
-    <w:bookmarkStart w:id="56" w:name="frugal-flock-score"/>
+    <w:bookmarkStart w:id="56" w:name="unio-score"/>
     <w:p>
       <w:pPr>
         <w:pStyle w:val="Heading3"/>
@@ -9065,7 +9065,7 @@
         <w:rPr>
           <w:rStyle w:val="VerbatimChar"/>
         </w:rPr>
-        <w:t xml:space="preserve">frugal-flock score</w:t>
+        <w:t xml:space="preserve">unio score</w:t>
       </w:r>
     </w:p>
     <w:p>
@@ -9076,7 +9076,7 @@
         <w:rPr>
           <w:rStyle w:val="VerbatimChar"/>
         </w:rPr>
-        <w:t xml:space="preserve">$ frugal-flock score</w:t>
+        <w:t xml:space="preserve">$ unio score</w:t>
       </w:r>
       <w:r>
         <w:br/>
@@ -9531,7 +9531,7 @@
         <w:rPr>
           <w:rStyle w:val="VerbatimChar"/>
         </w:rPr>
-        <w:t xml:space="preserve">$ frugal-flock race T9 codex grok</w:t>
+        <w:t xml:space="preserve">$ unio race T9 codex grok</w:t>
       </w:r>
     </w:p>
     <w:p>
@@ -9539,7 +9539,7 @@
         <w:pStyle w:val="FirstParagraph"/>
       </w:pPr>
       <w:r>
-        <w:t xml:space="preserve">Frugal Flock copies</w:t>
+        <w:t xml:space="preserve">Unio copies</w:t>
       </w:r>
       <w:r>
         <w:t xml:space="preserve"> </w:t>
@@ -9595,16 +9595,16 @@
         <w:rPr>
           <w:rStyle w:val="VerbatimChar"/>
         </w:rPr>
-        <w:t xml:space="preserve">$ frugal-flock verify codex T9-codex     $ frugal-flock verify grok T9-grok</w:t>
-      </w:r>
-      <w:r>
-        <w:br/>
-      </w:r>
-      <w:r>
-        <w:rPr>
-          <w:rStyle w:val="VerbatimChar"/>
-        </w:rPr>
-        <w:t xml:space="preserve">$ frugal-flock diff codex                $ frugal-flock diff grok</w:t>
+        <w:t xml:space="preserve">$ unio verify codex T9-codex     $ unio verify grok T9-grok</w:t>
+      </w:r>
+      <w:r>
+        <w:br/>
+      </w:r>
+      <w:r>
+        <w:rPr>
+          <w:rStyle w:val="VerbatimChar"/>
+        </w:rPr>
+        <w:t xml:space="preserve">$ unio diff codex                $ unio diff grok</w:t>
       </w:r>
     </w:p>
     <w:p>
@@ -9711,7 +9711,7 @@
         <w:rPr>
           <w:rStyle w:val="VerbatimChar"/>
         </w:rPr>
-        <w:t xml:space="preserve">$ frugal-flock sabotage opencode</w:t>
+        <w:t xml:space="preserve">$ unio sabotage opencode</w:t>
       </w:r>
     </w:p>
     <w:p>
@@ -9815,7 +9815,7 @@
         <w:rPr>
           <w:rStyle w:val="VerbatimChar"/>
         </w:rPr>
-        <w:t xml:space="preserve">frugal-flock init codex-2</w:t>
+        <w:t xml:space="preserve">unio init codex-2</w:t>
       </w:r>
       <w:r>
         <w:t xml:space="preserve"> </w:t>
@@ -9862,7 +9862,7 @@
         <w:pStyle w:val="FirstParagraph"/>
       </w:pPr>
       <w:r>
-        <w:t xml:space="preserve">Frugal Flock bundles no AI — it calls whatever binaries are on your PATH, so</w:t>
+        <w:t xml:space="preserve">Unio bundles no AI — it calls whatever binaries are on your PATH, so</w:t>
       </w:r>
       <w:r>
         <w:t xml:space="preserve"> </w:t>
@@ -9950,7 +9950,7 @@
         <w:rPr>
           <w:rStyle w:val="VerbatimChar"/>
         </w:rPr>
-        <w:t xml:space="preserve">$ frugal-flock smoke</w:t>
+        <w:t xml:space="preserve">$ unio smoke</w:t>
       </w:r>
     </w:p>
     <w:p>
@@ -9992,13 +9992,13 @@
       </w:r>
     </w:p>
     <w:bookmarkEnd w:id="63"/>
-    <w:bookmarkStart w:id="64" w:name="updating-frugal-flock-itself"/>
+    <w:bookmarkStart w:id="64" w:name="updating-unio-itself"/>
     <w:p>
       <w:pPr>
         <w:pStyle w:val="Heading3"/>
       </w:pPr>
       <w:r>
-        <w:t xml:space="preserve">13.2 Updating Frugal Flock itself</w:t>
+        <w:t xml:space="preserve">13.2 Updating Unio itself</w:t>
       </w:r>
     </w:p>
     <w:p>
@@ -10021,7 +10021,7 @@
         <w:rPr>
           <w:rStyle w:val="VerbatimChar"/>
         </w:rPr>
-        <w:t xml:space="preserve">agentteam-docs</w:t>
+        <w:t xml:space="preserve">unio-docs</w:t>
       </w:r>
       <w:r>
         <w:t xml:space="preserve">; it does not need to be renamed.</w:t>
@@ -10035,7 +10035,7 @@
         <w:rPr>
           <w:rStyle w:val="VerbatimChar"/>
         </w:rPr>
-        <w:t xml:space="preserve">$ git remote set-url origin https://github.com/danielmevit/frugal-flock.git</w:t>
+        <w:t xml:space="preserve">$ git remote set-url origin https://github.com/danielmevit/unio.git</w:t>
       </w:r>
       <w:r>
         <w:br/>
@@ -10053,25 +10053,25 @@
         <w:rPr>
           <w:rStyle w:val="VerbatimChar"/>
         </w:rPr>
-        <w:t xml:space="preserve">$ bash frugal-flock-install.sh     # never touches your agents.conf</w:t>
-      </w:r>
-      <w:r>
-        <w:br/>
-      </w:r>
-      <w:r>
-        <w:rPr>
-          <w:rStyle w:val="VerbatimChar"/>
-        </w:rPr>
-        <w:t xml:space="preserve">$ frugal-flock selftest            # mock-agent checks, zero quota</w:t>
-      </w:r>
-      <w:r>
-        <w:br/>
-      </w:r>
-      <w:r>
-        <w:rPr>
-          <w:rStyle w:val="VerbatimChar"/>
-        </w:rPr>
-        <w:t xml:space="preserve">$ frugal-flock version             # confirm what you now run</w:t>
+        <w:t xml:space="preserve">$ bash unio-install.sh     # never touches your agents.conf</w:t>
+      </w:r>
+      <w:r>
+        <w:br/>
+      </w:r>
+      <w:r>
+        <w:rPr>
+          <w:rStyle w:val="VerbatimChar"/>
+        </w:rPr>
+        <w:t xml:space="preserve">$ unio selftest            # mock-agent checks, zero quota</w:t>
+      </w:r>
+      <w:r>
+        <w:br/>
+      </w:r>
+      <w:r>
+        <w:rPr>
+          <w:rStyle w:val="VerbatimChar"/>
+        </w:rPr>
+        <w:t xml:space="preserve">$ unio version             # confirm what you now run</w:t>
       </w:r>
     </w:p>
     <w:p>
@@ -10102,7 +10102,7 @@
         <w:rPr>
           <w:rStyle w:val="VerbatimChar"/>
         </w:rPr>
-        <w:t xml:space="preserve">frugal-flock init &lt;worker&gt;</w:t>
+        <w:t xml:space="preserve">unio init &lt;worker&gt;</w:t>
       </w:r>
       <w:r>
         <w:t xml:space="preserve"> </w:t>
@@ -10168,7 +10168,7 @@
         <w:rPr>
           <w:rStyle w:val="VerbatimChar"/>
         </w:rPr>
-        <w:t xml:space="preserve">tar czf agentteam-conf.tgz -C ~ .config/agentteam</w:t>
+        <w:t xml:space="preserve">tar czf unio-conf.tgz -C ~ .config/unio</w:t>
       </w:r>
       <w:r>
         <w:t xml:space="preserve"> </w:t>
@@ -10236,7 +10236,7 @@
         <w:rPr>
           <w:rStyle w:val="VerbatimChar"/>
         </w:rPr>
-        <w:t xml:space="preserve">frugal-flock status</w:t>
+        <w:t xml:space="preserve">unio status</w:t>
       </w:r>
       <w:r>
         <w:t xml:space="preserve"> </w:t>
@@ -10257,7 +10257,7 @@
         <w:rPr>
           <w:rStyle w:val="VerbatimChar"/>
         </w:rPr>
-        <w:t xml:space="preserve">frugal-flock agents</w:t>
+        <w:t xml:space="preserve">unio agents</w:t>
       </w:r>
       <w:r>
         <w:t xml:space="preserve"> </w:t>
@@ -10284,7 +10284,7 @@
         <w:rPr>
           <w:rStyle w:val="VerbatimChar"/>
         </w:rPr>
-        <w:t xml:space="preserve">frugal-flock tail &lt;task&gt;</w:t>
+        <w:t xml:space="preserve">unio tail &lt;task&gt;</w:t>
       </w:r>
       <w:r>
         <w:t xml:space="preserve"> </w:t>
@@ -10329,7 +10329,7 @@
         <w:rPr>
           <w:rStyle w:val="VerbatimChar"/>
         </w:rPr>
-        <w:t xml:space="preserve">frugal-flock report &lt;task&gt;</w:t>
+        <w:t xml:space="preserve">unio report &lt;task&gt;</w:t>
       </w:r>
       <w:r>
         <w:t xml:space="preserve">. Empty diff?</w:t>
@@ -10357,7 +10357,7 @@
           <w:b/>
           <w:bCs/>
         </w:rPr>
-        <w:t xml:space="preserve">frugal-flock selftest</w:t>
+        <w:t xml:space="preserve">unio selftest</w:t>
       </w:r>
       <w:r>
         <w:rPr>
@@ -10453,7 +10453,7 @@
               <w:rPr>
                 <w:rStyle w:val="VerbatimChar"/>
               </w:rPr>
-              <w:t xml:space="preserve">frugal-flock: command not found</w:t>
+              <w:t xml:space="preserve">unio: command not found</w:t>
             </w:r>
           </w:p>
         </w:tc>
@@ -10498,7 +10498,7 @@
               <w:rPr>
                 <w:rStyle w:val="VerbatimChar"/>
               </w:rPr>
-              <w:t xml:space="preserve">not inside a Frugal Flock project</w:t>
+              <w:t xml:space="preserve">not inside a Unio project</w:t>
             </w:r>
           </w:p>
         </w:tc>
@@ -10960,7 +10960,7 @@
               <w:rPr>
                 <w:rStyle w:val="VerbatimChar"/>
               </w:rPr>
-              <w:t xml:space="preserve">frugal-flock smoke</w:t>
+              <w:t xml:space="preserve">unio smoke</w:t>
             </w:r>
             <w:r>
               <w:t xml:space="preserve"> </w:t>
@@ -11044,7 +11044,7 @@
               <w:rPr>
                 <w:rStyle w:val="VerbatimChar"/>
               </w:rPr>
-              <w:t xml:space="preserve">frugal-flock kill &lt;task&gt;</w:t>
+              <w:t xml:space="preserve">unio kill &lt;task&gt;</w:t>
             </w:r>
             <w:r>
               <w:t xml:space="preserve">.</w:t>
@@ -11080,7 +11080,7 @@
               <w:rPr>
                 <w:rStyle w:val="VerbatimChar"/>
               </w:rPr>
-              <w:t xml:space="preserve">frugal-flock off &lt;agent&gt; 5h</w:t>
+              <w:t xml:space="preserve">unio off &lt;agent&gt; 5h</w:t>
             </w:r>
             <w:r>
               <w:t xml:space="preserve"> </w:t>
@@ -11249,7 +11249,7 @@
               <w:rPr>
                 <w:rStyle w:val="VerbatimChar"/>
               </w:rPr>
-              <w:t xml:space="preserve">frugal-flock status</w:t>
+              <w:t xml:space="preserve">unio status</w:t>
             </w:r>
             <w:r>
               <w:t xml:space="preserve"> </w:t>
@@ -11264,7 +11264,7 @@
               <w:rPr>
                 <w:rStyle w:val="VerbatimChar"/>
               </w:rPr>
-              <w:t xml:space="preserve">frugal-flock kill &lt;task&gt;</w:t>
+              <w:t xml:space="preserve">unio kill &lt;task&gt;</w:t>
             </w:r>
             <w:r>
               <w:t xml:space="preserve">.</w:t>
@@ -11303,7 +11303,7 @@
               <w:rPr>
                 <w:rStyle w:val="VerbatimChar"/>
               </w:rPr>
-              <w:t xml:space="preserve">frugal-flock resume</w:t>
+              <w:t xml:space="preserve">unio resume</w:t>
             </w:r>
             <w:r>
               <w:t xml:space="preserve"> </w:t>
@@ -11345,7 +11345,7 @@
               <w:rPr>
                 <w:rStyle w:val="VerbatimChar"/>
               </w:rPr>
-              <w:t xml:space="preserve">frugal-flock on x</w:t>
+              <w:t xml:space="preserve">unio on x</w:t>
             </w:r>
             <w:r>
               <w:t xml:space="preserve">.</w:t>
@@ -11465,7 +11465,7 @@
               <w:rPr>
                 <w:rStyle w:val="VerbatimChar"/>
               </w:rPr>
-              <w:t xml:space="preserve">frugal-flock run</w:t>
+              <w:t xml:space="preserve">unio run</w:t>
             </w:r>
             <w:r>
               <w:t xml:space="preserve"> </w:t>
@@ -12090,7 +12090,7 @@
         <w:rPr>
           <w:rStyle w:val="VerbatimChar"/>
         </w:rPr>
-        <w:t xml:space="preserve">frugal-flock stop</w:t>
+        <w:t xml:space="preserve">unio stop</w:t>
       </w:r>
       <w:r>
         <w:t xml:space="preserve"> </w:t>
@@ -12111,7 +12111,7 @@
         <w:rPr>
           <w:rStyle w:val="VerbatimChar"/>
         </w:rPr>
-        <w:t xml:space="preserve">frugal-flock status</w:t>
+        <w:t xml:space="preserve">unio status</w:t>
       </w:r>
       <w:r>
         <w:t xml:space="preserve"> </w:t>
@@ -12126,7 +12126,7 @@
         <w:rPr>
           <w:rStyle w:val="VerbatimChar"/>
         </w:rPr>
-        <w:t xml:space="preserve">frugal-flock resume</w:t>
+        <w:t xml:space="preserve">unio resume</w:t>
       </w:r>
       <w:r>
         <w:t xml:space="preserve"> </w:t>
@@ -12254,7 +12254,7 @@
               <w:rPr>
                 <w:rStyle w:val="VerbatimChar"/>
               </w:rPr>
-              <w:t xml:space="preserve">frugal-flock new &lt;repo-url&gt; [name] [workers...]</w:t>
+              <w:t xml:space="preserve">unio new &lt;repo-url&gt; [name] [workers...]</w:t>
             </w:r>
           </w:p>
         </w:tc>
@@ -12274,7 +12274,7 @@
               <w:rPr>
                 <w:rStyle w:val="VerbatimChar"/>
               </w:rPr>
-              <w:t xml:space="preserve">~/.config/agentteam/playbooks/</w:t>
+              <w:t xml:space="preserve">~/.config/unio/playbooks/</w:t>
             </w:r>
             <w:r>
               <w:t xml:space="preserve">.</w:t>
@@ -12293,7 +12293,7 @@
               <w:rPr>
                 <w:rStyle w:val="VerbatimChar"/>
               </w:rPr>
-              <w:t xml:space="preserve">frugal-flock init [w1 w2 ...]</w:t>
+              <w:t xml:space="preserve">unio init [w1 w2 ...]</w:t>
             </w:r>
           </w:p>
         </w:tc>
@@ -12320,7 +12320,7 @@
               <w:rPr>
                 <w:rStyle w:val="VerbatimChar"/>
               </w:rPr>
-              <w:t xml:space="preserve">frugal-flock agents [--json]</w:t>
+              <w:t xml:space="preserve">unio agents [--json]</w:t>
             </w:r>
           </w:p>
         </w:tc>
@@ -12362,7 +12362,7 @@
               <w:rPr>
                 <w:rStyle w:val="VerbatimChar"/>
               </w:rPr>
-              <w:t xml:space="preserve">frugal-flock smoke</w:t>
+              <w:t xml:space="preserve">unio smoke</w:t>
             </w:r>
           </w:p>
         </w:tc>
@@ -12389,7 +12389,7 @@
               <w:rPr>
                 <w:rStyle w:val="VerbatimChar"/>
               </w:rPr>
-              <w:t xml:space="preserve">frugal-flock selftest</w:t>
+              <w:t xml:space="preserve">unio selftest</w:t>
             </w:r>
           </w:p>
         </w:tc>
@@ -12416,7 +12416,7 @@
               <w:rPr>
                 <w:rStyle w:val="VerbatimChar"/>
               </w:rPr>
-              <w:t xml:space="preserve">frugal-flock doctor</w:t>
+              <w:t xml:space="preserve">unio doctor</w:t>
             </w:r>
           </w:p>
         </w:tc>
@@ -12443,7 +12443,7 @@
               <w:rPr>
                 <w:rStyle w:val="VerbatimChar"/>
               </w:rPr>
-              <w:t xml:space="preserve">frugal-flock version</w:t>
+              <w:t xml:space="preserve">unio version</w:t>
             </w:r>
           </w:p>
         </w:tc>
@@ -12517,7 +12517,7 @@
               <w:rPr>
                 <w:rStyle w:val="VerbatimChar"/>
               </w:rPr>
-              <w:t xml:space="preserve">frugal-flock run &lt;w&gt; &lt;task&gt;</w:t>
+              <w:t xml:space="preserve">unio run &lt;w&gt; &lt;task&gt;</w:t>
             </w:r>
           </w:p>
         </w:tc>
@@ -12574,7 +12574,7 @@
               <w:rPr>
                 <w:rStyle w:val="VerbatimChar"/>
               </w:rPr>
-              <w:t xml:space="preserve">frugal-flock run -b &lt;w&gt; &lt;task&gt;</w:t>
+              <w:t xml:space="preserve">unio run -b &lt;w&gt; &lt;task&gt;</w:t>
             </w:r>
           </w:p>
         </w:tc>
@@ -12601,7 +12601,7 @@
               <w:rPr>
                 <w:rStyle w:val="VerbatimChar"/>
               </w:rPr>
-              <w:t xml:space="preserve">frugal-flock tail [task]</w:t>
+              <w:t xml:space="preserve">unio tail [task]</w:t>
             </w:r>
           </w:p>
         </w:tc>
@@ -12628,7 +12628,7 @@
               <w:rPr>
                 <w:rStyle w:val="VerbatimChar"/>
               </w:rPr>
-              <w:t xml:space="preserve">frugal-flock kill &lt;task&gt;</w:t>
+              <w:t xml:space="preserve">unio kill &lt;task&gt;</w:t>
             </w:r>
           </w:p>
         </w:tc>
@@ -12655,7 +12655,7 @@
               <w:rPr>
                 <w:rStyle w:val="VerbatimChar"/>
               </w:rPr>
-              <w:t xml:space="preserve">frugal-flock report &lt;task&gt; [lines]</w:t>
+              <w:t xml:space="preserve">unio report &lt;task&gt; [lines]</w:t>
             </w:r>
           </w:p>
         </w:tc>
@@ -12682,7 +12682,7 @@
               <w:rPr>
                 <w:rStyle w:val="VerbatimChar"/>
               </w:rPr>
-              <w:t xml:space="preserve">frugal-flock verify &lt;w&gt; &lt;task&gt;</w:t>
+              <w:t xml:space="preserve">unio verify &lt;w&gt; &lt;task&gt;</w:t>
             </w:r>
           </w:p>
         </w:tc>
@@ -12709,7 +12709,7 @@
               <w:rPr>
                 <w:rStyle w:val="VerbatimChar"/>
               </w:rPr>
-              <w:t xml:space="preserve">frugal-flock diff &lt;w&gt; [--stat]</w:t>
+              <w:t xml:space="preserve">unio diff &lt;w&gt; [--stat]</w:t>
             </w:r>
           </w:p>
         </w:tc>
@@ -12736,7 +12736,7 @@
               <w:rPr>
                 <w:rStyle w:val="VerbatimChar"/>
               </w:rPr>
-              <w:t xml:space="preserve">frugal-flock review &lt;w&gt; &lt;task&gt; [agent]</w:t>
+              <w:t xml:space="preserve">unio review &lt;w&gt; &lt;task&gt; [agent]</w:t>
             </w:r>
           </w:p>
         </w:tc>
@@ -12790,7 +12790,7 @@
               <w:rPr>
                 <w:rStyle w:val="VerbatimChar"/>
               </w:rPr>
-              <w:t xml:space="preserve">frugal-flock result &lt;w&gt; &lt;task&gt;</w:t>
+              <w:t xml:space="preserve">unio result &lt;w&gt; &lt;task&gt;</w:t>
             </w:r>
           </w:p>
         </w:tc>
@@ -12817,7 +12817,7 @@
               <w:rPr>
                 <w:rStyle w:val="VerbatimChar"/>
               </w:rPr>
-              <w:t xml:space="preserve">frugal-flock handoff &lt;w&gt; &lt;task&gt;</w:t>
+              <w:t xml:space="preserve">unio handoff &lt;w&gt; &lt;task&gt;</w:t>
             </w:r>
           </w:p>
         </w:tc>
@@ -12856,7 +12856,7 @@
               <w:rPr>
                 <w:rStyle w:val="VerbatimChar"/>
               </w:rPr>
-              <w:t xml:space="preserve">frugal-flock sync [w]</w:t>
+              <w:t xml:space="preserve">unio sync [w]</w:t>
             </w:r>
           </w:p>
         </w:tc>
@@ -12930,7 +12930,7 @@
               <w:rPr>
                 <w:rStyle w:val="VerbatimChar"/>
               </w:rPr>
-              <w:t xml:space="preserve">frugal-flock race &lt;task&gt; &lt;w1&gt; &lt;w2&gt; [...]</w:t>
+              <w:t xml:space="preserve">unio race &lt;task&gt; &lt;w1&gt; &lt;w2&gt; [...]</w:t>
             </w:r>
           </w:p>
         </w:tc>
@@ -12957,7 +12957,7 @@
               <w:rPr>
                 <w:rStyle w:val="VerbatimChar"/>
               </w:rPr>
-              <w:t xml:space="preserve">frugal-flock sabotage [worker]</w:t>
+              <w:t xml:space="preserve">unio sabotage [worker]</w:t>
             </w:r>
           </w:p>
         </w:tc>
@@ -12984,7 +12984,7 @@
               <w:rPr>
                 <w:rStyle w:val="VerbatimChar"/>
               </w:rPr>
-              <w:t xml:space="preserve">frugal-flock sabotage --all</w:t>
+              <w:t xml:space="preserve">unio sabotage --all</w:t>
             </w:r>
           </w:p>
         </w:tc>
@@ -13011,7 +13011,7 @@
               <w:rPr>
                 <w:rStyle w:val="VerbatimChar"/>
               </w:rPr>
-              <w:t xml:space="preserve">frugal-flock score [project-root]</w:t>
+              <w:t xml:space="preserve">unio score [project-root]</w:t>
             </w:r>
           </w:p>
         </w:tc>
@@ -13085,7 +13085,7 @@
               <w:rPr>
                 <w:rStyle w:val="VerbatimChar"/>
               </w:rPr>
-              <w:t xml:space="preserve">frugal-flock status</w:t>
+              <w:t xml:space="preserve">unio status</w:t>
             </w:r>
           </w:p>
         </w:tc>
@@ -13112,7 +13112,7 @@
               <w:rPr>
                 <w:rStyle w:val="VerbatimChar"/>
               </w:rPr>
-              <w:t xml:space="preserve">frugal-flock off &lt;agent&gt; [30m\|5h\|7d]</w:t>
+              <w:t xml:space="preserve">unio off &lt;agent&gt; [30m\|5h\|7d]</w:t>
             </w:r>
           </w:p>
         </w:tc>
@@ -13151,7 +13151,7 @@
               <w:rPr>
                 <w:rStyle w:val="VerbatimChar"/>
               </w:rPr>
-              <w:t xml:space="preserve">frugal-flock on &lt;agent&gt;</w:t>
+              <w:t xml:space="preserve">unio on &lt;agent&gt;</w:t>
             </w:r>
           </w:p>
         </w:tc>
@@ -13178,7 +13178,7 @@
               <w:rPr>
                 <w:rStyle w:val="VerbatimChar"/>
               </w:rPr>
-              <w:t xml:space="preserve">frugal-flock stop</w:t>
+              <w:t xml:space="preserve">unio stop</w:t>
             </w:r>
             <w:r>
               <w:t xml:space="preserve"> </w:t>
@@ -13193,7 +13193,7 @@
               <w:rPr>
                 <w:rStyle w:val="VerbatimChar"/>
               </w:rPr>
-              <w:t xml:space="preserve">frugal-flock resume</w:t>
+              <w:t xml:space="preserve">unio resume</w:t>
             </w:r>
           </w:p>
         </w:tc>
@@ -13220,7 +13220,7 @@
               <w:rPr>
                 <w:rStyle w:val="VerbatimChar"/>
               </w:rPr>
-              <w:t xml:space="preserve">frugal-flock help</w:t>
+              <w:t xml:space="preserve">unio help</w:t>
             </w:r>
           </w:p>
         </w:tc>
@@ -13405,7 +13405,7 @@
         <w:rPr>
           <w:rStyle w:val="VerbatimChar"/>
         </w:rPr>
-        <w:t xml:space="preserve">AGENTTEAM_TIMEOUT=7200 frugal-flock run …</w:t>
+        <w:t xml:space="preserve">UNIO_TIMEOUT=7200 unio run …</w:t>
       </w:r>
       <w:r>
         <w:t xml:space="preserve">)</w:t>
@@ -13493,7 +13493,7 @@
               <w:rPr>
                 <w:rStyle w:val="VerbatimChar"/>
               </w:rPr>
-              <w:t xml:space="preserve">AGENTTEAM_TIMEOUT</w:t>
+              <w:t xml:space="preserve">UNIO_TIMEOUT</w:t>
             </w:r>
           </w:p>
         </w:tc>
@@ -13531,7 +13531,7 @@
               <w:rPr>
                 <w:rStyle w:val="VerbatimChar"/>
               </w:rPr>
-              <w:t xml:space="preserve">AGENTTEAM_VERIFY_TIMEOUT</w:t>
+              <w:t xml:space="preserve">UNIO_VERIFY_TIMEOUT</w:t>
             </w:r>
           </w:p>
         </w:tc>
@@ -13581,7 +13581,7 @@
               <w:rPr>
                 <w:rStyle w:val="VerbatimChar"/>
               </w:rPr>
-              <w:t xml:space="preserve">AGENTTEAM_REVIEW_TIMEOUT</w:t>
+              <w:t xml:space="preserve">UNIO_REVIEW_TIMEOUT</w:t>
             </w:r>
           </w:p>
         </w:tc>
@@ -13634,7 +13634,7 @@
               <w:rPr>
                 <w:rStyle w:val="VerbatimChar"/>
               </w:rPr>
-              <w:t xml:space="preserve">AGENTTEAM_AUTO_OFF</w:t>
+              <w:t xml:space="preserve">UNIO_AUTO_OFF</w:t>
             </w:r>
           </w:p>
         </w:tc>
@@ -13681,7 +13681,7 @@
               <w:rPr>
                 <w:rStyle w:val="VerbatimChar"/>
               </w:rPr>
-              <w:t xml:space="preserve">AGENTTEAM_AUTO_VERIFY</w:t>
+              <w:t xml:space="preserve">UNIO_AUTO_VERIFY</w:t>
             </w:r>
           </w:p>
         </w:tc>
@@ -13728,7 +13728,7 @@
               <w:rPr>
                 <w:rStyle w:val="VerbatimChar"/>
               </w:rPr>
-              <w:t xml:space="preserve">AGENTTEAM_AUTO_SYNC</w:t>
+              <w:t xml:space="preserve">UNIO_AUTO_SYNC</w:t>
             </w:r>
           </w:p>
         </w:tc>
@@ -13790,7 +13790,7 @@
               <w:rPr>
                 <w:rStyle w:val="VerbatimChar"/>
               </w:rPr>
-              <w:t xml:space="preserve">AGENTTEAM_ALLOW_SECRETS</w:t>
+              <w:t xml:space="preserve">UNIO_ALLOW_SECRETS</w:t>
             </w:r>
           </w:p>
         </w:tc>
@@ -14629,7 +14629,7 @@
               <w:rPr>
                 <w:rStyle w:val="VerbatimChar"/>
               </w:rPr>
-              <w:t xml:space="preserve">frugal-flock handoff</w:t>
+              <w:t xml:space="preserve">unio handoff</w:t>
             </w:r>
             <w:r>
               <w:t xml:space="preserve"> </w:t>
@@ -14691,7 +14691,7 @@
               <w:pStyle w:val="Compact"/>
             </w:pPr>
             <w:r>
-              <w:t xml:space="preserve">A small script git runs automatically around actions (commit, push, merge). Frugal Flock installs three guards.</w:t>
+              <w:t xml:space="preserve">A small script git runs automatically around actions (commit, push, merge). Unio installs three guards.</w:t>
             </w:r>
           </w:p>
         </w:tc>
@@ -14980,7 +14980,7 @@
               <w:rPr>
                 <w:rStyle w:val="VerbatimChar"/>
               </w:rPr>
-              <w:t xml:space="preserve">frugal-flock result</w:t>
+              <w:t xml:space="preserve">unio result</w:t>
             </w:r>
             <w:r>
               <w:t xml:space="preserve">.</w:t>
@@ -15230,106 +15230,106 @@
         <w:rPr>
           <w:rStyle w:val="VerbatimChar"/>
         </w:rPr>
-        <w:t xml:space="preserve">SETUP (once)          bash frugal-flock-install.sh ; frugal-flock selftest</w:t>
-      </w:r>
-      <w:r>
-        <w:br/>
-      </w:r>
-      <w:r>
-        <w:rPr>
-          <w:rStyle w:val="VerbatimChar"/>
-        </w:rPr>
-        <w:t xml:space="preserve">                      log in each CLI once ; frugal-flock agents ; frugal-flock smoke</w:t>
-      </w:r>
-      <w:r>
-        <w:br/>
-      </w:r>
-      <w:r>
-        <w:rPr>
-          <w:rStyle w:val="VerbatimChar"/>
-        </w:rPr>
-        <w:t xml:space="preserve">NEW PROJECT           cd ~/code &amp;&amp; frugal-flock new &lt;repo-url&gt; myproj</w:t>
-      </w:r>
-      <w:r>
-        <w:br/>
-      </w:r>
-      <w:r>
-        <w:rPr>
-          <w:rStyle w:val="VerbatimChar"/>
-        </w:rPr>
-        <w:t xml:space="preserve">SESSION START         frugal-flock status ; frugal-flock doctor ; claude</w:t>
-      </w:r>
-      <w:r>
-        <w:br/>
-      </w:r>
-      <w:r>
-        <w:rPr>
-          <w:rStyle w:val="VerbatimChar"/>
-        </w:rPr>
-        <w:t xml:space="preserve">HEALTH CHECK          frugal-flock doctor    (before dispatching: catches waste)</w:t>
-      </w:r>
-      <w:r>
-        <w:br/>
-      </w:r>
-      <w:r>
-        <w:rPr>
-          <w:rStyle w:val="VerbatimChar"/>
-        </w:rPr>
-        <w:t xml:space="preserve">DISPATCH              frugal-flock run -b &lt;worker&gt; &lt;task&gt;</w:t>
-      </w:r>
-      <w:r>
-        <w:br/>
-      </w:r>
-      <w:r>
-        <w:rPr>
-          <w:rStyle w:val="VerbatimChar"/>
-        </w:rPr>
-        <w:t xml:space="preserve">WATCH                 frugal-flock status | tail &lt;task&gt; | kill &lt;task&gt;</w:t>
-      </w:r>
-      <w:r>
-        <w:br/>
-      </w:r>
-      <w:r>
-        <w:rPr>
-          <w:rStyle w:val="VerbatimChar"/>
-        </w:rPr>
-        <w:t xml:space="preserve">JUDGE                 frugal-flock verify &lt;w&gt; &lt;task&gt; ; frugal-flock diff &lt;w&gt;</w:t>
-      </w:r>
-      <w:r>
-        <w:br/>
-      </w:r>
-      <w:r>
-        <w:rPr>
-          <w:rStyle w:val="VerbatimChar"/>
-        </w:rPr>
-        <w:t xml:space="preserve">                      second opinion: frugal-flock review &lt;w&gt; &lt;task&gt;</w:t>
-      </w:r>
-      <w:r>
-        <w:br/>
-      </w:r>
-      <w:r>
-        <w:rPr>
-          <w:rStyle w:val="VerbatimChar"/>
-        </w:rPr>
-        <w:t xml:space="preserve">                      evidence: frugal-flock result &lt;w&gt; &lt;task&gt;</w:t>
-      </w:r>
-      <w:r>
-        <w:br/>
-      </w:r>
-      <w:r>
-        <w:rPr>
-          <w:rStyle w:val="VerbatimChar"/>
-        </w:rPr>
-        <w:t xml:space="preserve">HANDOFF               frugal-flock handoff &lt;w&gt; &lt;task&gt;   (context for the next AI)</w:t>
-      </w:r>
-      <w:r>
-        <w:br/>
-      </w:r>
-      <w:r>
-        <w:rPr>
-          <w:rStyle w:val="VerbatimChar"/>
-        </w:rPr>
-        <w:t xml:space="preserve">ACCEPT                git merge --no-ff agent/&lt;w&gt; -m "merge T7: ..." ; frugal-flock sync</w:t>
+        <w:t xml:space="preserve">SETUP (once)          bash unio-install.sh ; unio selftest</w:t>
+      </w:r>
+      <w:r>
+        <w:br/>
+      </w:r>
+      <w:r>
+        <w:rPr>
+          <w:rStyle w:val="VerbatimChar"/>
+        </w:rPr>
+        <w:t xml:space="preserve">                      log in each CLI once ; unio agents ; unio smoke</w:t>
+      </w:r>
+      <w:r>
+        <w:br/>
+      </w:r>
+      <w:r>
+        <w:rPr>
+          <w:rStyle w:val="VerbatimChar"/>
+        </w:rPr>
+        <w:t xml:space="preserve">NEW PROJECT           cd ~/code &amp;&amp; unio new &lt;repo-url&gt; myproj</w:t>
+      </w:r>
+      <w:r>
+        <w:br/>
+      </w:r>
+      <w:r>
+        <w:rPr>
+          <w:rStyle w:val="VerbatimChar"/>
+        </w:rPr>
+        <w:t xml:space="preserve">SESSION START         unio status ; unio doctor ; claude</w:t>
+      </w:r>
+      <w:r>
+        <w:br/>
+      </w:r>
+      <w:r>
+        <w:rPr>
+          <w:rStyle w:val="VerbatimChar"/>
+        </w:rPr>
+        <w:t xml:space="preserve">HEALTH CHECK          unio doctor    (before dispatching: catches waste)</w:t>
+      </w:r>
+      <w:r>
+        <w:br/>
+      </w:r>
+      <w:r>
+        <w:rPr>
+          <w:rStyle w:val="VerbatimChar"/>
+        </w:rPr>
+        <w:t xml:space="preserve">DISPATCH              unio run -b &lt;worker&gt; &lt;task&gt;</w:t>
+      </w:r>
+      <w:r>
+        <w:br/>
+      </w:r>
+      <w:r>
+        <w:rPr>
+          <w:rStyle w:val="VerbatimChar"/>
+        </w:rPr>
+        <w:t xml:space="preserve">WATCH                 unio status | tail &lt;task&gt; | kill &lt;task&gt;</w:t>
+      </w:r>
+      <w:r>
+        <w:br/>
+      </w:r>
+      <w:r>
+        <w:rPr>
+          <w:rStyle w:val="VerbatimChar"/>
+        </w:rPr>
+        <w:t xml:space="preserve">JUDGE                 unio verify &lt;w&gt; &lt;task&gt; ; unio diff &lt;w&gt;</w:t>
+      </w:r>
+      <w:r>
+        <w:br/>
+      </w:r>
+      <w:r>
+        <w:rPr>
+          <w:rStyle w:val="VerbatimChar"/>
+        </w:rPr>
+        <w:t xml:space="preserve">                      second opinion: unio review &lt;w&gt; &lt;task&gt;</w:t>
+      </w:r>
+      <w:r>
+        <w:br/>
+      </w:r>
+      <w:r>
+        <w:rPr>
+          <w:rStyle w:val="VerbatimChar"/>
+        </w:rPr>
+        <w:t xml:space="preserve">                      evidence: unio result &lt;w&gt; &lt;task&gt;</w:t>
+      </w:r>
+      <w:r>
+        <w:br/>
+      </w:r>
+      <w:r>
+        <w:rPr>
+          <w:rStyle w:val="VerbatimChar"/>
+        </w:rPr>
+        <w:t xml:space="preserve">HANDOFF               unio handoff &lt;w&gt; &lt;task&gt;   (context for the next AI)</w:t>
+      </w:r>
+      <w:r>
+        <w:br/>
+      </w:r>
+      <w:r>
+        <w:rPr>
+          <w:rStyle w:val="VerbatimChar"/>
+        </w:rPr>
+        <w:t xml:space="preserve">ACCEPT                git merge --no-ff agent/&lt;w&gt; -m "merge T7: ..." ; unio sync</w:t>
       </w:r>
       <w:r>
         <w:br/>
@@ -15347,34 +15347,34 @@
         <w:rPr>
           <w:rStyle w:val="VerbatimChar"/>
         </w:rPr>
-        <w:t xml:space="preserve">QUOTA                 frugal-flock off &lt;agent&gt; 5h|7d ; frugal-flock on &lt;agent&gt;</w:t>
-      </w:r>
-      <w:r>
-        <w:br/>
-      </w:r>
-      <w:r>
-        <w:rPr>
-          <w:rStyle w:val="VerbatimChar"/>
-        </w:rPr>
-        <w:t xml:space="preserve">PANIC                 frugal-flock stop  ...  frugal-flock resume</w:t>
-      </w:r>
-      <w:r>
-        <w:br/>
-      </w:r>
-      <w:r>
-        <w:rPr>
-          <w:rStyle w:val="VerbatimChar"/>
-        </w:rPr>
-        <w:t xml:space="preserve">SCOREBOARD            frugal-flock score</w:t>
-      </w:r>
-      <w:r>
-        <w:br/>
-      </w:r>
-      <w:r>
-        <w:rPr>
-          <w:rStyle w:val="VerbatimChar"/>
-        </w:rPr>
-        <w:t xml:space="preserve">EXTRA PLAYS           frugal-flock race &lt;task&gt; w1 w2 ; frugal-flock sabotage &lt;w&gt;</w:t>
+        <w:t xml:space="preserve">QUOTA                 unio off &lt;agent&gt; 5h|7d ; unio on &lt;agent&gt;</w:t>
+      </w:r>
+      <w:r>
+        <w:br/>
+      </w:r>
+      <w:r>
+        <w:rPr>
+          <w:rStyle w:val="VerbatimChar"/>
+        </w:rPr>
+        <w:t xml:space="preserve">PANIC                 unio stop  ...  unio resume</w:t>
+      </w:r>
+      <w:r>
+        <w:br/>
+      </w:r>
+      <w:r>
+        <w:rPr>
+          <w:rStyle w:val="VerbatimChar"/>
+        </w:rPr>
+        <w:t xml:space="preserve">SCOREBOARD            unio score</w:t>
+      </w:r>
+      <w:r>
+        <w:br/>
+      </w:r>
+      <w:r>
+        <w:rPr>
+          <w:rStyle w:val="VerbatimChar"/>
+        </w:rPr>
+        <w:t xml:space="preserve">EXTRA PLAYS           unio race &lt;task&gt; w1 w2 ; unio sabotage &lt;w&gt;</w:t>
       </w:r>
       <w:r>
         <w:br/>
@@ -15392,7 +15392,7 @@
         <w:rPr>
           <w:rStyle w:val="VerbatimChar"/>
         </w:rPr>
-        <w:t xml:space="preserve">AFTER ANY UPDATE      frugal-flock smoke ; after frugal-flock updates: selftest + version</w:t>
+        <w:t xml:space="preserve">AFTER ANY UPDATE      unio smoke ; after unio updates: selftest + version</w:t>
       </w:r>
     </w:p>
     <w:p>
@@ -15621,7 +15621,7 @@
         <w:rPr>
           <w:rStyle w:val="VerbatimChar"/>
         </w:rPr>
-        <w:t xml:space="preserve">pandoc docs/GUIDEBOOK.md -o agentteam-guidebook.docx --toc --toc-depth=2</w:t>
+        <w:t xml:space="preserve">pandoc docs/GUIDEBOOK.md -o unio-guidebook.docx --toc --toc-depth=2</w:t>
       </w:r>
     </w:p>
     <w:p>
@@ -16196,7 +16196,7 @@
               <w:rPr>
                 <w:rStyle w:val="VerbatimChar"/>
               </w:rPr>
-              <w:t xml:space="preserve">frugal-flock-install.sh</w:t>
+              <w:t xml:space="preserve">unio-install.sh</w:t>
             </w:r>
           </w:p>
         </w:tc>

</xml_diff>

<commit_message>
Correct Unio migration guidance and preserve historical source links
</commit_message>
<xml_diff>
--- a/docs/GUIDEBOOK.docx
+++ b/docs/GUIDEBOOK.docx
@@ -127,7 +127,27 @@
           <w:b/>
           <w:bCs/>
         </w:rPr>
-        <w:t xml:space="preserve">Covers Unio v0.3.1 plus the in-progress M1 quality changes (the runtime prints 0.4.0, which is not an accepted release) · written 2026-07-19, updated 2026-10-04 · for the complete beginner</w:t>
+        <w:t xml:space="preserve">Covers Unio 0.5.0 source, including the owner-accepted M1 quality changes · written 2026-07-19, updated 2026-10-05 · for the complete beginner</w:t>
+      </w:r>
+    </w:p>
+    <w:p>
+      <w:pPr>
+        <w:pStyle w:val="BodyText"/>
+      </w:pPr>
+      <w:r>
+        <w:t xml:space="preserve">The rename is not yet a published release or global installation. This</w:t>
+      </w:r>
+      <w:r>
+        <w:t xml:space="preserve"> </w:t>
+      </w:r>
+      <w:r>
+        <w:t xml:space="preserve">workspace builds it using the legacy installed Frugal Flock 0.4.0; the</w:t>
+      </w:r>
+      <w:r>
+        <w:t xml:space="preserve"> </w:t>
+      </w:r>
+      <w:r>
+        <w:t xml:space="preserve">owner must approve switching that global installation separately.</w:t>
       </w:r>
     </w:p>
     <w:p>
@@ -2370,16 +2390,16 @@
         <w:t xml:space="preserve"> </w:t>
       </w:r>
       <w:r>
-        <w:t xml:space="preserve">(formerly</w:t>
-      </w:r>
-      <w:r>
-        <w:t xml:space="preserve"> </w:t>
-      </w:r>
-      <w:r>
-        <w:rPr>
-          <w:rStyle w:val="VerbatimChar"/>
-        </w:rPr>
-        <w:t xml:space="preserve">unio-docs</w:t>
+        <w:t xml:space="preserve">(historically named Frugal Flock and</w:t>
+      </w:r>
+      <w:r>
+        <w:t xml:space="preserve"> </w:t>
+      </w:r>
+      <w:r>
+        <w:rPr>
+          <w:rStyle w:val="VerbatimChar"/>
+        </w:rPr>
+        <w:t xml:space="preserve">agentteam-docs</w:t>
       </w:r>
       <w:r>
         <w:t xml:space="preserve">):</w:t>
@@ -2411,7 +2431,7 @@
         <w:rPr>
           <w:rStyle w:val="VerbatimChar"/>
         </w:rPr>
-        <w:t xml:space="preserve">Unio 0.3.1 (/home/you/.local/bin/unio)</w:t>
+        <w:t xml:space="preserve">Unio 0.5.0 (/home/you/.local/bin/unio)</w:t>
       </w:r>
       <w:r>
         <w:br/>
@@ -2549,7 +2569,7 @@
               <w:pStyle w:val="Compact"/>
             </w:pPr>
             <w:r>
-              <w:t xml:space="preserve">Shared implementation and legacy command</w:t>
+              <w:t xml:space="preserve">The only installed command</w:t>
             </w:r>
           </w:p>
         </w:tc>
@@ -2565,30 +2585,34 @@
               <w:rPr>
                 <w:rStyle w:val="VerbatimChar"/>
               </w:rPr>
-              <w:t xml:space="preserve">~/.local/bin/unio</w:t>
-            </w:r>
-            <w:r>
-              <w:t xml:space="preserve">,</w:t>
+              <w:t xml:space="preserve">~/.config/unio/agents.conf</w:t>
+            </w:r>
+          </w:p>
+        </w:tc>
+        <w:tc>
+          <w:tcPr/>
+          <w:p>
+            <w:pPr>
+              <w:pStyle w:val="Compact"/>
+            </w:pPr>
+            <w:r>
+              <w:t xml:space="preserve">The agent config —</w:t>
             </w:r>
             <w:r>
               <w:t xml:space="preserve"> </w:t>
             </w:r>
             <w:r>
               <w:rPr>
-                <w:rStyle w:val="VerbatimChar"/>
-              </w:rPr>
-              <w:t xml:space="preserve">~/.local/bin/unio</w:t>
-            </w:r>
-          </w:p>
-        </w:tc>
-        <w:tc>
-          <w:tcPr/>
-          <w:p>
-            <w:pPr>
-              <w:pStyle w:val="Compact"/>
-            </w:pPr>
-            <w:r>
-              <w:t xml:space="preserve">Canonical and short commands; links to the shared implementation</w:t>
+                <w:b/>
+                <w:bCs/>
+              </w:rPr>
+              <w:t xml:space="preserve">the file you edit</w:t>
+            </w:r>
+            <w:r>
+              <w:t xml:space="preserve"> </w:t>
+            </w:r>
+            <w:r>
+              <w:t xml:space="preserve">(never overwritten by updates)</w:t>
             </w:r>
           </w:p>
         </w:tc>
@@ -2604,34 +2628,18 @@
               <w:rPr>
                 <w:rStyle w:val="VerbatimChar"/>
               </w:rPr>
-              <w:t xml:space="preserve">~/.config/unio/agents.conf</w:t>
-            </w:r>
-          </w:p>
-        </w:tc>
-        <w:tc>
-          <w:tcPr/>
-          <w:p>
-            <w:pPr>
-              <w:pStyle w:val="Compact"/>
-            </w:pPr>
-            <w:r>
-              <w:t xml:space="preserve">The agent config —</w:t>
-            </w:r>
-            <w:r>
-              <w:t xml:space="preserve"> </w:t>
-            </w:r>
-            <w:r>
-              <w:rPr>
-                <w:b/>
-                <w:bCs/>
-              </w:rPr>
-              <w:t xml:space="preserve">the file you edit</w:t>
-            </w:r>
-            <w:r>
-              <w:t xml:space="preserve"> </w:t>
-            </w:r>
-            <w:r>
-              <w:t xml:space="preserve">(never overwritten by updates)</w:t>
+              <w:t xml:space="preserve">~/.config/unio/templates/</w:t>
+            </w:r>
+          </w:p>
+        </w:tc>
+        <w:tc>
+          <w:tcPr/>
+          <w:p>
+            <w:pPr>
+              <w:pStyle w:val="Compact"/>
+            </w:pPr>
+            <w:r>
+              <w:t xml:space="preserve">Role cards and task templates stamped into every new project</w:t>
             </w:r>
           </w:p>
         </w:tc>
@@ -2647,18 +2655,48 @@
               <w:rPr>
                 <w:rStyle w:val="VerbatimChar"/>
               </w:rPr>
-              <w:t xml:space="preserve">~/.config/unio/templates/</w:t>
-            </w:r>
-          </w:p>
-        </w:tc>
-        <w:tc>
-          <w:tcPr/>
-          <w:p>
-            <w:pPr>
-              <w:pStyle w:val="Compact"/>
-            </w:pPr>
-            <w:r>
-              <w:t xml:space="preserve">Role cards and task templates stamped into every new project</w:t>
+              <w:t xml:space="preserve">~/.config/unio/playbooks/</w:t>
+            </w:r>
+          </w:p>
+        </w:tc>
+        <w:tc>
+          <w:tcPr/>
+          <w:p>
+            <w:pPr>
+              <w:pStyle w:val="Compact"/>
+            </w:pPr>
+            <w:r>
+              <w:t xml:space="preserve">Drop your standard</w:t>
+            </w:r>
+            <w:r>
+              <w:t xml:space="preserve"> </w:t>
+            </w:r>
+            <w:r>
+              <w:rPr>
+                <w:rStyle w:val="VerbatimChar"/>
+              </w:rPr>
+              <w:t xml:space="preserve">ai-*.md</w:t>
+            </w:r>
+            <w:r>
+              <w:t xml:space="preserve"> </w:t>
+            </w:r>
+            <w:r>
+              <w:t xml:space="preserve">playbooks here once;</w:t>
+            </w:r>
+            <w:r>
+              <w:t xml:space="preserve"> </w:t>
+            </w:r>
+            <w:r>
+              <w:rPr>
+                <w:rStyle w:val="VerbatimChar"/>
+              </w:rPr>
+              <w:t xml:space="preserve">unio new</w:t>
+            </w:r>
+            <w:r>
+              <w:t xml:space="preserve"> </w:t>
+            </w:r>
+            <w:r>
+              <w:t xml:space="preserve">copies them into every project</w:t>
             </w:r>
           </w:p>
         </w:tc>
@@ -2674,63 +2712,6 @@
               <w:rPr>
                 <w:rStyle w:val="VerbatimChar"/>
               </w:rPr>
-              <w:t xml:space="preserve">~/.config/unio/playbooks/</w:t>
-            </w:r>
-          </w:p>
-        </w:tc>
-        <w:tc>
-          <w:tcPr/>
-          <w:p>
-            <w:pPr>
-              <w:pStyle w:val="Compact"/>
-            </w:pPr>
-            <w:r>
-              <w:t xml:space="preserve">Drop your standard</w:t>
-            </w:r>
-            <w:r>
-              <w:t xml:space="preserve"> </w:t>
-            </w:r>
-            <w:r>
-              <w:rPr>
-                <w:rStyle w:val="VerbatimChar"/>
-              </w:rPr>
-              <w:t xml:space="preserve">ai-*.md</w:t>
-            </w:r>
-            <w:r>
-              <w:t xml:space="preserve"> </w:t>
-            </w:r>
-            <w:r>
-              <w:t xml:space="preserve">playbooks here once;</w:t>
-            </w:r>
-            <w:r>
-              <w:t xml:space="preserve"> </w:t>
-            </w:r>
-            <w:r>
-              <w:rPr>
-                <w:rStyle w:val="VerbatimChar"/>
-              </w:rPr>
-              <w:t xml:space="preserve">unio new</w:t>
-            </w:r>
-            <w:r>
-              <w:t xml:space="preserve"> </w:t>
-            </w:r>
-            <w:r>
-              <w:t xml:space="preserve">copies them into every project</w:t>
-            </w:r>
-          </w:p>
-        </w:tc>
-      </w:tr>
-      <w:tr>
-        <w:tc>
-          <w:tcPr/>
-          <w:p>
-            <w:pPr>
-              <w:pStyle w:val="Compact"/>
-            </w:pPr>
-            <w:r>
-              <w:rPr>
-                <w:rStyle w:val="VerbatimChar"/>
-              </w:rPr>
               <w:t xml:space="preserve">~/.local/share/bash-completion/completions/unio</w:t>
             </w:r>
           </w:p>
@@ -2742,22 +2723,7 @@
               <w:pStyle w:val="Compact"/>
             </w:pPr>
             <w:r>
-              <w:t xml:space="preserve">Shared tab-completion, with links for</w:t>
-            </w:r>
-            <w:r>
-              <w:t xml:space="preserve"> </w:t>
-            </w:r>
-            <w:r>
-              <w:rPr>
-                <w:rStyle w:val="VerbatimChar"/>
-              </w:rPr>
-              <w:t xml:space="preserve">unio</w:t>
-            </w:r>
-            <w:r>
-              <w:t xml:space="preserve"> </w:t>
-            </w:r>
-            <w:r>
-              <w:t xml:space="preserve">and</w:t>
+              <w:t xml:space="preserve">Tab-completion for</w:t>
             </w:r>
             <w:r>
               <w:t xml:space="preserve"> </w:t>
@@ -10021,10 +9987,46 @@
         <w:rPr>
           <w:rStyle w:val="VerbatimChar"/>
         </w:rPr>
-        <w:t xml:space="preserve">unio-docs</w:t>
-      </w:r>
-      <w:r>
-        <w:t xml:space="preserve">; it does not need to be renamed.</w:t>
+        <w:t xml:space="preserve">frugal-flock</w:t>
+      </w:r>
+      <w:r>
+        <w:t xml:space="preserve"> </w:t>
+      </w:r>
+      <w:r>
+        <w:t xml:space="preserve">or the historical</w:t>
+      </w:r>
+      <w:r>
+        <w:t xml:space="preserve"> </w:t>
+      </w:r>
+      <w:r>
+        <w:rPr>
+          <w:rStyle w:val="VerbatimChar"/>
+        </w:rPr>
+        <w:t xml:space="preserve">agentteam-docs</w:t>
+      </w:r>
+      <w:r>
+        <w:t xml:space="preserve">; it does not need</w:t>
+      </w:r>
+      <w:r>
+        <w:t xml:space="preserve"> </w:t>
+      </w:r>
+      <w:r>
+        <w:t xml:space="preserve">to be renamed. The legacy local workspace path</w:t>
+      </w:r>
+      <w:r>
+        <w:t xml:space="preserve"> </w:t>
+      </w:r>
+      <w:r>
+        <w:rPr>
+          <w:rStyle w:val="VerbatimChar"/>
+        </w:rPr>
+        <w:t xml:space="preserve">/mnt/d/Vibe Coding/_vm/frugal-flock</w:t>
+      </w:r>
+      <w:r>
+        <w:t xml:space="preserve"> </w:t>
+      </w:r>
+      <w:r>
+        <w:t xml:space="preserve">stays intact to preserve worktree links.</w:t>
       </w:r>
     </w:p>
     <w:p>

</xml_diff>

<commit_message>
Correct six documentation findings from independent rename review
</commit_message>
<xml_diff>
--- a/docs/GUIDEBOOK.docx
+++ b/docs/GUIDEBOOK.docx
@@ -759,7 +759,25 @@
         <w:t xml:space="preserve"> </w:t>
       </w:r>
       <w:r>
-        <w:t xml:space="preserve">workers physically cannot overwrite each other’s files.</w:t>
+        <w:t xml:space="preserve">workers normally edit separate files. These workshops are coordination</w:t>
+      </w:r>
+      <w:r>
+        <w:t xml:space="preserve"> </w:t>
+      </w:r>
+      <w:r>
+        <w:t xml:space="preserve">boundaries, not OS sandboxes: configured commands retain host access</w:t>
+      </w:r>
+      <w:r>
+        <w:t xml:space="preserve"> </w:t>
+      </w:r>
+      <w:r>
+        <w:t xml:space="preserve">and can reach other worktrees or files. Review and scope checks judge</w:t>
+      </w:r>
+      <w:r>
+        <w:t xml:space="preserve"> </w:t>
+      </w:r>
+      <w:r>
+        <w:t xml:space="preserve">changes; they do not restrict filesystem access.</w:t>
       </w:r>
     </w:p>
     <w:p>
@@ -3389,29 +3407,25 @@
         <w:t xml:space="preserve"> </w:t>
       </w:r>
       <w:r>
-        <w:t xml:space="preserve">The auto-approve flags are safe</w:t>
-      </w:r>
-      <w:r>
-        <w:t xml:space="preserve"> </w:t>
-      </w:r>
-      <w:r>
-        <w:rPr>
-          <w:b/>
-          <w:bCs/>
-        </w:rPr>
-        <w:t xml:space="preserve">because</w:t>
-      </w:r>
-      <w:r>
-        <w:t xml:space="preserve"> </w:t>
-      </w:r>
-      <w:r>
-        <w:t xml:space="preserve">of the workshops and your</w:t>
-      </w:r>
-      <w:r>
-        <w:t xml:space="preserve"> </w:t>
-      </w:r>
-      <w:r>
-        <w:t xml:space="preserve">merge gate — a worker can only damage its own disposable copy.</w:t>
+        <w:t xml:space="preserve">Auto-approve gives the configured command host-level permissions. Separate</w:t>
+      </w:r>
+      <w:r>
+        <w:t xml:space="preserve"> </w:t>
+      </w:r>
+      <w:r>
+        <w:t xml:space="preserve">worktrees and the merge gate help coordinate and review changes, but they</w:t>
+      </w:r>
+      <w:r>
+        <w:t xml:space="preserve"> </w:t>
+      </w:r>
+      <w:r>
+        <w:t xml:space="preserve">do not contain filesystem damage. Use these defaults only on a trusted</w:t>
+      </w:r>
+      <w:r>
+        <w:t xml:space="preserve"> </w:t>
+      </w:r>
+      <w:r>
+        <w:t xml:space="preserve">host with workloads and permissions the owner has explicitly accepted.</w:t>
       </w:r>
     </w:p>
     <w:p>

</xml_diff>

<commit_message>
Clarify adapted transcript and historical API header evidence
</commit_message>
<xml_diff>
--- a/docs/GUIDEBOOK.docx
+++ b/docs/GUIDEBOOK.docx
@@ -7777,13 +7777,25 @@
         <w:t xml:space="preserve"> </w:t>
       </w:r>
       <w:r>
-        <w:t xml:space="preserve">is a real transcript of everything chapter 7</w:t>
-      </w:r>
-      <w:r>
-        <w:t xml:space="preserve"> </w:t>
-      </w:r>
-      <w:r>
-        <w:t xml:space="preserve">described — a feature built, verified, reviewed, merged, and synced; a</w:t>
+        <w:t xml:space="preserve">adapts a historical Frugal Flock transcript to</w:t>
+      </w:r>
+      <w:r>
+        <w:t xml:space="preserve"> </w:t>
+      </w:r>
+      <w:r>
+        <w:t xml:space="preserve">current Unio commands. Its retained run IDs and output describe the older</w:t>
+      </w:r>
+      <w:r>
+        <w:t xml:space="preserve"> </w:t>
+      </w:r>
+      <w:r>
+        <w:t xml:space="preserve">run, not newly measured Unio output. It illustrates chapter 7: a feature</w:t>
+      </w:r>
+      <w:r>
+        <w:t xml:space="preserve"> </w:t>
+      </w:r>
+      <w:r>
+        <w:t xml:space="preserve">built, verified, reviewed, merged, and synced; a</w:t>
       </w:r>
       <w:r>
         <w:t xml:space="preserve"> </w:t>

</xml_diff>

<commit_message>
docs: align manuals with explicit limit benching
</commit_message>
<xml_diff>
--- a/docs/GUIDEBOOK.docx
+++ b/docs/GUIDEBOOK.docx
@@ -8820,91 +8820,121 @@
           <w:b/>
           <w:bCs/>
         </w:rPr>
-        <w:t xml:space="preserve">Automatic detection:</w:t>
-      </w:r>
-      <w:r>
-        <w:t xml:space="preserve"> </w:t>
-      </w:r>
-      <w:r>
-        <w:t xml:space="preserve">when a run’s output mentions limit language</w:t>
-      </w:r>
-      <w:r>
-        <w:t xml:space="preserve"> </w:t>
-      </w:r>
-      <w:r>
-        <w:t xml:space="preserve">(</w:t>
-      </w:r>
-      <w:r>
-        <w:t xml:space="preserve">“usage limit”</w:t>
-      </w:r>
-      <w:r>
-        <w:t xml:space="preserve">,</w:t>
-      </w:r>
-      <w:r>
-        <w:t xml:space="preserve"> </w:t>
-      </w:r>
-      <w:r>
-        <w:t xml:space="preserve">“rate limit”</w:t>
-      </w:r>
-      <w:r>
-        <w:t xml:space="preserve">,</w:t>
-      </w:r>
-      <w:r>
-        <w:t xml:space="preserve"> </w:t>
-      </w:r>
-      <w:r>
-        <w:t xml:space="preserve">“quota”</w:t>
-      </w:r>
-      <w:r>
-        <w:t xml:space="preserve">,</w:t>
-      </w:r>
-      <w:r>
-        <w:t xml:space="preserve"> </w:t>
-      </w:r>
-      <w:r>
-        <w:t xml:space="preserve">“resets at”</w:t>
-      </w:r>
-      <w:r>
-        <w:t xml:space="preserve">…), Unio prints</w:t>
-      </w:r>
-      <w:r>
-        <w:t xml:space="preserve"> </w:t>
-      </w:r>
-      <w:r>
-        <w:t xml:space="preserve">the bench suggestion. With</w:t>
-      </w:r>
-      <w:r>
-        <w:t xml:space="preserve"> </w:t>
-      </w:r>
-      <w:r>
-        <w:rPr>
-          <w:rStyle w:val="VerbatimChar"/>
-        </w:rPr>
-        <w:t xml:space="preserve">UNIO_AUTO_OFF=1</w:t>
-      </w:r>
-      <w:r>
-        <w:t xml:space="preserve"> </w:t>
-      </w:r>
-      <w:r>
-        <w:t xml:space="preserve">it benches the agent</w:t>
-      </w:r>
-      <w:r>
-        <w:t xml:space="preserve"> </w:t>
-      </w:r>
-      <w:r>
-        <w:t xml:space="preserve">for 5h by itself — but only when the run actually FAILED, and never</w:t>
-      </w:r>
-      <w:r>
-        <w:t xml:space="preserve"> </w:t>
-      </w:r>
-      <w:r>
-        <w:t xml:space="preserve">when the task text itself is about rate limits (so building a rate</w:t>
-      </w:r>
-      <w:r>
-        <w:t xml:space="preserve"> </w:t>
-      </w:r>
-      <w:r>
-        <w:t xml:space="preserve">limiter cannot bench a healthy agent).</w:t>
+        <w:t xml:space="preserve">Limit observations:</w:t>
+      </w:r>
+      <w:r>
+        <w:t xml:space="preserve"> </w:t>
+      </w:r>
+      <w:r>
+        <w:t xml:space="preserve">a failed run’s normalized final 60 log lines</w:t>
+      </w:r>
+      <w:r>
+        <w:t xml:space="preserve"> </w:t>
+      </w:r>
+      <w:r>
+        <w:t xml:space="preserve">can trigger a warning and a suggested bench command. Failure for this</w:t>
+      </w:r>
+      <w:r>
+        <w:t xml:space="preserve"> </w:t>
+      </w:r>
+      <w:r>
+        <w:t xml:space="preserve">helper means a nonzero actual exit or no commits and no uncommitted</w:t>
+      </w:r>
+      <w:r>
+        <w:t xml:space="preserve"> </w:t>
+      </w:r>
+      <w:r>
+        <w:t xml:space="preserve">files. The warning and ledger</w:t>
+      </w:r>
+      <w:r>
+        <w:t xml:space="preserve"> </w:t>
+      </w:r>
+      <w:r>
+        <w:rPr>
+          <w:rStyle w:val="VerbatimChar"/>
+        </w:rPr>
+        <w:t xml:space="preserve">wall=1</w:t>
+      </w:r>
+      <w:r>
+        <w:t xml:space="preserve"> </w:t>
+      </w:r>
+      <w:r>
+        <w:t xml:space="preserve">mean suspected limit language;</w:t>
+      </w:r>
+      <w:r>
+        <w:t xml:space="preserve"> </w:t>
+      </w:r>
+      <w:r>
+        <w:t xml:space="preserve">printed file text can also match. The raw log keeps the evidence.</w:t>
+      </w:r>
+      <w:r>
+        <w:t xml:space="preserve"> </w:t>
+      </w:r>
+      <w:r>
+        <w:t xml:space="preserve">Worker output never benches an agent.</w:t>
+      </w:r>
+      <w:r>
+        <w:t xml:space="preserve"> </w:t>
+      </w:r>
+      <w:r>
+        <w:rPr>
+          <w:rStyle w:val="VerbatimChar"/>
+        </w:rPr>
+        <w:t xml:space="preserve">UNIO_AUTO_OFF</w:t>
+      </w:r>
+      <w:r>
+        <w:t xml:space="preserve"> </w:t>
+      </w:r>
+      <w:r>
+        <w:t xml:space="preserve">is retained for</w:t>
+      </w:r>
+      <w:r>
+        <w:t xml:space="preserve"> </w:t>
+      </w:r>
+      <w:r>
+        <w:t xml:space="preserve">compatibility with no effect; use</w:t>
+      </w:r>
+      <w:r>
+        <w:t xml:space="preserve"> </w:t>
+      </w:r>
+      <w:r>
+        <w:rPr>
+          <w:rStyle w:val="VerbatimChar"/>
+        </w:rPr>
+        <w:t xml:space="preserve">unio off</w:t>
+      </w:r>
+      <w:r>
+        <w:t xml:space="preserve"> </w:t>
+      </w:r>
+      <w:r>
+        <w:t xml:space="preserve">explicitly after checking</w:t>
+      </w:r>
+      <w:r>
+        <w:t xml:space="preserve"> </w:t>
+      </w:r>
+      <w:r>
+        <w:t xml:space="preserve">the provider’s actual state. Successful work stays</w:t>
+      </w:r>
+      <w:r>
+        <w:t xml:space="preserve"> </w:t>
+      </w:r>
+      <w:r>
+        <w:rPr>
+          <w:rStyle w:val="VerbatimChar"/>
+        </w:rPr>
+        <w:t xml:space="preserve">wall=0</w:t>
+      </w:r>
+      <w:r>
+        <w:t xml:space="preserve"> </w:t>
+      </w:r>
+      <w:r>
+        <w:t xml:space="preserve">regardless</w:t>
+      </w:r>
+      <w:r>
+        <w:t xml:space="preserve"> </w:t>
+      </w:r>
+      <w:r>
+        <w:t xml:space="preserve">of printed limit phrases, and receipts retain the real exit.</w:t>
       </w:r>
     </w:p>
     <w:p>
@@ -13673,27 +13703,45 @@
               <w:pStyle w:val="Compact"/>
             </w:pPr>
             <w:r>
-              <w:t xml:space="preserve">off</w:t>
-            </w:r>
-          </w:p>
-        </w:tc>
-        <w:tc>
-          <w:tcPr/>
-          <w:p>
-            <w:pPr>
-              <w:pStyle w:val="Compact"/>
-            </w:pPr>
+              <w:t xml:space="preserve">ignored</w:t>
+            </w:r>
+          </w:p>
+        </w:tc>
+        <w:tc>
+          <w:tcPr/>
+          <w:p>
+            <w:pPr>
+              <w:pStyle w:val="Compact"/>
+            </w:pPr>
+            <w:r>
+              <w:t xml:space="preserve">Accepted for compatibility; worker output never changes availability. Use explicit</w:t>
+            </w:r>
+            <w:r>
+              <w:t xml:space="preserve"> </w:t>
+            </w:r>
             <w:r>
               <w:rPr>
                 <w:rStyle w:val="VerbatimChar"/>
               </w:rPr>
-              <w:t xml:space="preserve">1</w:t>
+              <w:t xml:space="preserve">unio off</w:t>
             </w:r>
             <w:r>
               <w:t xml:space="preserve"> </w:t>
             </w:r>
             <w:r>
-              <w:t xml:space="preserve">= auto-bench an agent 5h when a FAILED run mentions usage limits (suppressed when the task itself is about limits).</w:t>
+              <w:t xml:space="preserve">/</w:t>
+            </w:r>
+            <w:r>
+              <w:t xml:space="preserve"> </w:t>
+            </w:r>
+            <w:r>
+              <w:rPr>
+                <w:rStyle w:val="VerbatimChar"/>
+              </w:rPr>
+              <w:t xml:space="preserve">unio on</w:t>
+            </w:r>
+            <w:r>
+              <w:t xml:space="preserve">.</w:t>
             </w:r>
           </w:p>
         </w:tc>

</xml_diff>